<commit_message>
Comentarios del código terminados. Cuestionario terminado añadido por primera vez. Falta importar tests.
</commit_message>
<xml_diff>
--- a/cuestionario_conecta4.docx
+++ b/cuestionario_conecta4.docx
@@ -5140,6 +5140,10 @@
       <w:pPr>
         <w:spacing w:after="200" w:line="300" w:lineRule="auto"/>
         <w:ind w:left="420" w:hanging="420"/>
+        <w:rPr>
+          <w:sz w:val="21"/>
+          <w:szCs w:val="21"/>
+        </w:rPr>
       </w:pPr>
       <w:r>
         <w:rPr>
@@ -5235,6 +5239,146 @@
       <w:pPr>
         <w:spacing w:after="200" w:line="300" w:lineRule="auto"/>
         <w:ind w:left="420" w:hanging="420"/>
+      </w:pPr>
+      <w:r>
+        <w:rPr>
+          <w:sz w:val="21"/>
+          <w:szCs w:val="21"/>
+        </w:rPr>
+        <w:t xml:space="preserve">Porque en </w:t>
+      </w:r>
+      <w:proofErr w:type="spellStart"/>
+      <w:proofErr w:type="gramStart"/>
+      <w:r>
+        <w:rPr>
+          <w:sz w:val="21"/>
+          <w:szCs w:val="21"/>
+        </w:rPr>
+        <w:t>s</w:t>
+      </w:r>
+      <w:r>
+        <w:rPr>
+          <w:sz w:val="21"/>
+          <w:szCs w:val="21"/>
+        </w:rPr>
+        <w:t>elf.opponent</w:t>
+      </w:r>
+      <w:proofErr w:type="spellEnd"/>
+      <w:proofErr w:type="gramEnd"/>
+      <w:r>
+        <w:rPr>
+          <w:sz w:val="21"/>
+          <w:szCs w:val="21"/>
+        </w:rPr>
+        <w:t xml:space="preserve"> hay un bucle que se llama a sí mismo continuamente. En </w:t>
+      </w:r>
+      <w:proofErr w:type="gramStart"/>
+      <w:r>
+        <w:rPr>
+          <w:sz w:val="21"/>
+          <w:szCs w:val="21"/>
+        </w:rPr>
+        <w:t>realidad</w:t>
+      </w:r>
+      <w:proofErr w:type="gramEnd"/>
+      <w:r>
+        <w:rPr>
+          <w:sz w:val="21"/>
+          <w:szCs w:val="21"/>
+        </w:rPr>
+        <w:t xml:space="preserve"> no llama a </w:t>
+      </w:r>
+      <w:proofErr w:type="spellStart"/>
+      <w:proofErr w:type="gramStart"/>
+      <w:r>
+        <w:rPr>
+          <w:sz w:val="21"/>
+          <w:szCs w:val="21"/>
+        </w:rPr>
+        <w:t>self</w:t>
+      </w:r>
+      <w:proofErr w:type="spellEnd"/>
+      <w:r>
+        <w:rPr>
+          <w:sz w:val="21"/>
+          <w:szCs w:val="21"/>
+        </w:rPr>
+        <w:t>._</w:t>
+      </w:r>
+      <w:proofErr w:type="spellStart"/>
+      <w:proofErr w:type="gramEnd"/>
+      <w:r>
+        <w:rPr>
+          <w:sz w:val="21"/>
+          <w:szCs w:val="21"/>
+        </w:rPr>
+        <w:t>opponent</w:t>
+      </w:r>
+      <w:proofErr w:type="spellEnd"/>
+      <w:r>
+        <w:rPr>
+          <w:sz w:val="21"/>
+          <w:szCs w:val="21"/>
+        </w:rPr>
+        <w:t xml:space="preserve">, así que para poder escribir en el atributo real hay que escribir directamente. La utilidad de </w:t>
+      </w:r>
+      <w:proofErr w:type="spellStart"/>
+      <w:proofErr w:type="gramStart"/>
+      <w:r>
+        <w:rPr>
+          <w:sz w:val="21"/>
+          <w:szCs w:val="21"/>
+        </w:rPr>
+        <w:t>self.opponent</w:t>
+      </w:r>
+      <w:proofErr w:type="spellEnd"/>
+      <w:proofErr w:type="gramEnd"/>
+      <w:r>
+        <w:rPr>
+          <w:sz w:val="21"/>
+          <w:szCs w:val="21"/>
+        </w:rPr>
+        <w:t xml:space="preserve"> no es escribir manualmente en </w:t>
+      </w:r>
+      <w:proofErr w:type="spellStart"/>
+      <w:proofErr w:type="gramStart"/>
+      <w:r>
+        <w:rPr>
+          <w:sz w:val="21"/>
+          <w:szCs w:val="21"/>
+        </w:rPr>
+        <w:t>self</w:t>
+      </w:r>
+      <w:proofErr w:type="spellEnd"/>
+      <w:r>
+        <w:rPr>
+          <w:sz w:val="21"/>
+          <w:szCs w:val="21"/>
+        </w:rPr>
+        <w:t>._</w:t>
+      </w:r>
+      <w:proofErr w:type="spellStart"/>
+      <w:proofErr w:type="gramEnd"/>
+      <w:r>
+        <w:rPr>
+          <w:sz w:val="21"/>
+          <w:szCs w:val="21"/>
+        </w:rPr>
+        <w:t>opponent</w:t>
+      </w:r>
+      <w:proofErr w:type="spellEnd"/>
+      <w:r>
+        <w:rPr>
+          <w:sz w:val="21"/>
+          <w:szCs w:val="21"/>
+        </w:rPr>
+        <w:t>.</w:t>
+      </w:r>
+    </w:p>
+    <w:p>
+      <w:pPr>
+        <w:spacing w:after="200" w:line="300" w:lineRule="auto"/>
+        <w:ind w:left="420" w:hanging="420"/>
         <w:rPr>
           <w:sz w:val="21"/>
           <w:szCs w:val="21"/>
@@ -5271,14 +5415,425 @@
           <w:sz w:val="21"/>
           <w:szCs w:val="21"/>
         </w:rPr>
-        <w:t>N</w:t>
-      </w:r>
-      <w:r>
-        <w:rPr>
-          <w:sz w:val="21"/>
-          <w:szCs w:val="21"/>
-        </w:rPr>
-        <w:t xml:space="preserve">o estoy de acuerdo con el manejo que se hace de las comprobaciones del </w:t>
+        <w:t xml:space="preserve">Un error de diseño que SÍ he arreglado en el código es que en </w:t>
+      </w:r>
+      <w:proofErr w:type="gramStart"/>
+      <w:r>
+        <w:rPr>
+          <w:sz w:val="21"/>
+          <w:szCs w:val="21"/>
+        </w:rPr>
+        <w:t>Player._</w:t>
+      </w:r>
+      <w:proofErr w:type="spellStart"/>
+      <w:proofErr w:type="gramEnd"/>
+      <w:r>
+        <w:rPr>
+          <w:sz w:val="21"/>
+          <w:szCs w:val="21"/>
+        </w:rPr>
+        <w:t>play_on</w:t>
+      </w:r>
+      <w:proofErr w:type="spellEnd"/>
+      <w:r>
+        <w:rPr>
+          <w:sz w:val="21"/>
+          <w:szCs w:val="21"/>
+        </w:rPr>
+        <w:t xml:space="preserve">, el código de tablero que se usa en </w:t>
+      </w:r>
+      <w:proofErr w:type="spellStart"/>
+      <w:r>
+        <w:rPr>
+          <w:sz w:val="21"/>
+          <w:szCs w:val="21"/>
+        </w:rPr>
+        <w:t>back_track</w:t>
+      </w:r>
+      <w:proofErr w:type="spellEnd"/>
+      <w:r>
+        <w:rPr>
+          <w:sz w:val="21"/>
+          <w:szCs w:val="21"/>
+        </w:rPr>
+        <w:t xml:space="preserve"> se guarda después de mover, y no al momento de decidir, así que el oráculo que aprende literalmente no funcionaba. Simplemente he cambiado el orden de dos líneas de código y ya está bien.</w:t>
+      </w:r>
+    </w:p>
+    <w:p>
+      <w:pPr>
+        <w:spacing w:after="200" w:line="300" w:lineRule="auto"/>
+        <w:ind w:left="420" w:hanging="420"/>
+        <w:rPr>
+          <w:sz w:val="21"/>
+          <w:szCs w:val="21"/>
+          <w:lang w:val="en-US"/>
+        </w:rPr>
+      </w:pPr>
+      <w:proofErr w:type="spellStart"/>
+      <w:proofErr w:type="gramStart"/>
+      <w:r>
+        <w:rPr>
+          <w:sz w:val="21"/>
+          <w:szCs w:val="21"/>
+          <w:lang w:val="en-US"/>
+        </w:rPr>
+        <w:t>board.add</w:t>
+      </w:r>
+      <w:proofErr w:type="spellEnd"/>
+      <w:r>
+        <w:rPr>
+          <w:sz w:val="21"/>
+          <w:szCs w:val="21"/>
+          <w:lang w:val="en-US"/>
+        </w:rPr>
+        <w:t>(</w:t>
+      </w:r>
+      <w:proofErr w:type="spellStart"/>
+      <w:r>
+        <w:rPr>
+          <w:sz w:val="21"/>
+          <w:szCs w:val="21"/>
+          <w:lang w:val="en-US"/>
+        </w:rPr>
+        <w:t>self.char</w:t>
+      </w:r>
+      <w:proofErr w:type="spellEnd"/>
+      <w:proofErr w:type="gramEnd"/>
+      <w:r>
+        <w:rPr>
+          <w:sz w:val="21"/>
+          <w:szCs w:val="21"/>
+          <w:lang w:val="en-US"/>
+        </w:rPr>
+        <w:t>, position)</w:t>
+      </w:r>
+    </w:p>
+    <w:p>
+      <w:pPr>
+        <w:spacing w:after="200" w:line="300" w:lineRule="auto"/>
+        <w:ind w:left="420" w:hanging="420"/>
+        <w:rPr>
+          <w:sz w:val="21"/>
+          <w:szCs w:val="21"/>
+          <w:lang w:val="en-US"/>
+        </w:rPr>
+      </w:pPr>
+      <w:proofErr w:type="spellStart"/>
+      <w:proofErr w:type="gramStart"/>
+      <w:r>
+        <w:rPr>
+          <w:sz w:val="21"/>
+          <w:szCs w:val="21"/>
+          <w:lang w:val="en-US"/>
+        </w:rPr>
+        <w:t>self.last</w:t>
+      </w:r>
+      <w:proofErr w:type="gramEnd"/>
+      <w:r>
+        <w:rPr>
+          <w:sz w:val="21"/>
+          <w:szCs w:val="21"/>
+          <w:lang w:val="en-US"/>
+        </w:rPr>
+        <w:t>_</w:t>
+      </w:r>
+      <w:proofErr w:type="gramStart"/>
+      <w:r>
+        <w:rPr>
+          <w:sz w:val="21"/>
+          <w:szCs w:val="21"/>
+          <w:lang w:val="en-US"/>
+        </w:rPr>
+        <w:t>moves.insert</w:t>
+      </w:r>
+      <w:proofErr w:type="spellEnd"/>
+      <w:proofErr w:type="gramEnd"/>
+      <w:r>
+        <w:rPr>
+          <w:sz w:val="21"/>
+          <w:szCs w:val="21"/>
+          <w:lang w:val="en-US"/>
+        </w:rPr>
+        <w:t xml:space="preserve">(0, </w:t>
+      </w:r>
+      <w:proofErr w:type="gramStart"/>
+      <w:r>
+        <w:rPr>
+          <w:sz w:val="21"/>
+          <w:szCs w:val="21"/>
+          <w:lang w:val="en-US"/>
+        </w:rPr>
+        <w:t>Move(</w:t>
+      </w:r>
+      <w:proofErr w:type="gramEnd"/>
+      <w:r>
+        <w:rPr>
+          <w:sz w:val="21"/>
+          <w:szCs w:val="21"/>
+          <w:lang w:val="en-US"/>
+        </w:rPr>
+        <w:t xml:space="preserve">position, </w:t>
+      </w:r>
+      <w:proofErr w:type="spellStart"/>
+      <w:r>
+        <w:rPr>
+          <w:sz w:val="21"/>
+          <w:szCs w:val="21"/>
+          <w:lang w:val="en-US"/>
+        </w:rPr>
+        <w:t>board.as_</w:t>
+      </w:r>
+      <w:proofErr w:type="gramStart"/>
+      <w:r>
+        <w:rPr>
+          <w:sz w:val="21"/>
+          <w:szCs w:val="21"/>
+          <w:lang w:val="en-US"/>
+        </w:rPr>
+        <w:t>code</w:t>
+      </w:r>
+      <w:proofErr w:type="spellEnd"/>
+      <w:r>
+        <w:rPr>
+          <w:sz w:val="21"/>
+          <w:szCs w:val="21"/>
+          <w:lang w:val="en-US"/>
+        </w:rPr>
+        <w:t>(),recommendations</w:t>
+      </w:r>
+      <w:proofErr w:type="gramEnd"/>
+      <w:r>
+        <w:rPr>
+          <w:sz w:val="21"/>
+          <w:szCs w:val="21"/>
+          <w:lang w:val="en-US"/>
+        </w:rPr>
+        <w:t>, self))</w:t>
+      </w:r>
+    </w:p>
+    <w:p>
+      <w:pPr>
+        <w:spacing w:after="200" w:line="300" w:lineRule="auto"/>
+        <w:ind w:left="420" w:hanging="420"/>
+        <w:rPr>
+          <w:sz w:val="21"/>
+          <w:szCs w:val="21"/>
+          <w:lang w:val="en-US"/>
+        </w:rPr>
+      </w:pPr>
+      <w:r>
+        <w:rPr>
+          <w:sz w:val="21"/>
+          <w:szCs w:val="21"/>
+          <w:lang w:val="en-US"/>
+        </w:rPr>
+        <w:t xml:space="preserve">He </w:t>
+      </w:r>
+      <w:proofErr w:type="spellStart"/>
+      <w:r>
+        <w:rPr>
+          <w:sz w:val="21"/>
+          <w:szCs w:val="21"/>
+          <w:lang w:val="en-US"/>
+        </w:rPr>
+        <w:t>cambiado</w:t>
+      </w:r>
+      <w:proofErr w:type="spellEnd"/>
+      <w:r>
+        <w:rPr>
+          <w:sz w:val="21"/>
+          <w:szCs w:val="21"/>
+          <w:lang w:val="en-US"/>
+        </w:rPr>
+        <w:t xml:space="preserve"> a:</w:t>
+      </w:r>
+    </w:p>
+    <w:p>
+      <w:pPr>
+        <w:spacing w:after="200" w:line="300" w:lineRule="auto"/>
+        <w:ind w:left="420" w:hanging="420"/>
+        <w:rPr>
+          <w:sz w:val="21"/>
+          <w:szCs w:val="21"/>
+          <w:lang w:val="en-US"/>
+        </w:rPr>
+      </w:pPr>
+      <w:proofErr w:type="spellStart"/>
+      <w:proofErr w:type="gramStart"/>
+      <w:r>
+        <w:rPr>
+          <w:sz w:val="21"/>
+          <w:szCs w:val="21"/>
+          <w:lang w:val="en-US"/>
+        </w:rPr>
+        <w:t>self.last</w:t>
+      </w:r>
+      <w:proofErr w:type="gramEnd"/>
+      <w:r>
+        <w:rPr>
+          <w:sz w:val="21"/>
+          <w:szCs w:val="21"/>
+          <w:lang w:val="en-US"/>
+        </w:rPr>
+        <w:t>_</w:t>
+      </w:r>
+      <w:proofErr w:type="gramStart"/>
+      <w:r>
+        <w:rPr>
+          <w:sz w:val="21"/>
+          <w:szCs w:val="21"/>
+          <w:lang w:val="en-US"/>
+        </w:rPr>
+        <w:t>moves.insert</w:t>
+      </w:r>
+      <w:proofErr w:type="spellEnd"/>
+      <w:proofErr w:type="gramEnd"/>
+      <w:r>
+        <w:rPr>
+          <w:sz w:val="21"/>
+          <w:szCs w:val="21"/>
+          <w:lang w:val="en-US"/>
+        </w:rPr>
+        <w:t xml:space="preserve">(0, </w:t>
+      </w:r>
+      <w:proofErr w:type="gramStart"/>
+      <w:r>
+        <w:rPr>
+          <w:sz w:val="21"/>
+          <w:szCs w:val="21"/>
+          <w:lang w:val="en-US"/>
+        </w:rPr>
+        <w:t>Move(</w:t>
+      </w:r>
+      <w:proofErr w:type="gramEnd"/>
+      <w:r>
+        <w:rPr>
+          <w:sz w:val="21"/>
+          <w:szCs w:val="21"/>
+          <w:lang w:val="en-US"/>
+        </w:rPr>
+        <w:t xml:space="preserve">position, </w:t>
+      </w:r>
+      <w:proofErr w:type="spellStart"/>
+      <w:r>
+        <w:rPr>
+          <w:sz w:val="21"/>
+          <w:szCs w:val="21"/>
+          <w:lang w:val="en-US"/>
+        </w:rPr>
+        <w:t>board.as_</w:t>
+      </w:r>
+      <w:proofErr w:type="gramStart"/>
+      <w:r>
+        <w:rPr>
+          <w:sz w:val="21"/>
+          <w:szCs w:val="21"/>
+          <w:lang w:val="en-US"/>
+        </w:rPr>
+        <w:t>code</w:t>
+      </w:r>
+      <w:proofErr w:type="spellEnd"/>
+      <w:r>
+        <w:rPr>
+          <w:sz w:val="21"/>
+          <w:szCs w:val="21"/>
+          <w:lang w:val="en-US"/>
+        </w:rPr>
+        <w:t>(</w:t>
+      </w:r>
+      <w:proofErr w:type="gramEnd"/>
+      <w:r>
+        <w:rPr>
+          <w:sz w:val="21"/>
+          <w:szCs w:val="21"/>
+          <w:lang w:val="en-US"/>
+        </w:rPr>
+        <w:t>), recommendations, self))</w:t>
+      </w:r>
+    </w:p>
+    <w:p>
+      <w:pPr>
+        <w:spacing w:after="200" w:line="300" w:lineRule="auto"/>
+        <w:ind w:left="420" w:hanging="420"/>
+        <w:rPr>
+          <w:sz w:val="21"/>
+          <w:szCs w:val="21"/>
+          <w:lang w:val="en-US"/>
+        </w:rPr>
+      </w:pPr>
+      <w:proofErr w:type="spellStart"/>
+      <w:proofErr w:type="gramStart"/>
+      <w:r>
+        <w:rPr>
+          <w:sz w:val="21"/>
+          <w:szCs w:val="21"/>
+          <w:lang w:val="en-US"/>
+        </w:rPr>
+        <w:t>board.add</w:t>
+      </w:r>
+      <w:proofErr w:type="spellEnd"/>
+      <w:r>
+        <w:rPr>
+          <w:sz w:val="21"/>
+          <w:szCs w:val="21"/>
+          <w:lang w:val="en-US"/>
+        </w:rPr>
+        <w:t>(</w:t>
+      </w:r>
+      <w:proofErr w:type="spellStart"/>
+      <w:r>
+        <w:rPr>
+          <w:sz w:val="21"/>
+          <w:szCs w:val="21"/>
+          <w:lang w:val="en-US"/>
+        </w:rPr>
+        <w:t>self.char</w:t>
+      </w:r>
+      <w:proofErr w:type="spellEnd"/>
+      <w:proofErr w:type="gramEnd"/>
+      <w:r>
+        <w:rPr>
+          <w:sz w:val="21"/>
+          <w:szCs w:val="21"/>
+          <w:lang w:val="en-US"/>
+        </w:rPr>
+        <w:t>, position)</w:t>
+      </w:r>
+    </w:p>
+    <w:p>
+      <w:pPr>
+        <w:spacing w:after="200" w:line="300" w:lineRule="auto"/>
+        <w:ind w:left="420" w:hanging="420"/>
+        <w:rPr>
+          <w:sz w:val="21"/>
+          <w:szCs w:val="21"/>
+          <w:lang w:val="en-US"/>
+        </w:rPr>
+      </w:pPr>
+    </w:p>
+    <w:p>
+      <w:pPr>
+        <w:spacing w:after="200" w:line="300" w:lineRule="auto"/>
+        <w:ind w:left="420" w:hanging="420"/>
+        <w:rPr>
+          <w:sz w:val="21"/>
+          <w:szCs w:val="21"/>
+        </w:rPr>
+      </w:pPr>
+      <w:r>
+        <w:rPr>
+          <w:sz w:val="21"/>
+          <w:szCs w:val="21"/>
+        </w:rPr>
+        <w:lastRenderedPageBreak/>
+        <w:t>Tampoco</w:t>
+      </w:r>
+      <w:r>
+        <w:rPr>
+          <w:sz w:val="21"/>
+          <w:szCs w:val="21"/>
+        </w:rPr>
+        <w:t xml:space="preserve"> estoy de acuerdo con el manejo que se hace de las comprobaciones del </w:t>
       </w:r>
       <w:proofErr w:type="spellStart"/>
       <w:r>
@@ -5310,7 +5865,35 @@
           <w:sz w:val="21"/>
           <w:szCs w:val="21"/>
         </w:rPr>
-        <w:t xml:space="preserve">N^2 + 2N) en un caso que puede no ser muy raro, sobre todo teniendo en cuenta jugadas que pongan en situaciones incómodas al oráculo, que encima sólo mira una jugada por delante. Esto hace que tableros más grandes puedan ser altamente ineficientes, por lo que dependiendo del consumo de recursos que suponga </w:t>
+        <w:t>N^2 + 2N) en un caso que puede no ser muy raro, sobre todo teniendo en cuenta jugadas que pongan en situaciones incómodas al oráculo</w:t>
+      </w:r>
+      <w:r>
+        <w:rPr>
+          <w:sz w:val="21"/>
+          <w:szCs w:val="21"/>
+        </w:rPr>
+        <w:t xml:space="preserve">. </w:t>
+      </w:r>
+      <w:r>
+        <w:rPr>
+          <w:sz w:val="21"/>
+          <w:szCs w:val="21"/>
+        </w:rPr>
+        <w:t>Esto</w:t>
+      </w:r>
+      <w:r>
+        <w:rPr>
+          <w:sz w:val="21"/>
+          <w:szCs w:val="21"/>
+        </w:rPr>
+        <w:t xml:space="preserve"> afecta sobre todo a la dificultad media que no memoriza y</w:t>
+      </w:r>
+      <w:r>
+        <w:rPr>
+          <w:sz w:val="21"/>
+          <w:szCs w:val="21"/>
+        </w:rPr>
+        <w:t xml:space="preserve"> hace que tableros más grandes puedan ser altamente ineficientes, por lo que dependiendo del consumo de recursos que suponga </w:t>
       </w:r>
       <w:proofErr w:type="spellStart"/>
       <w:r>
@@ -5430,6 +6013,10 @@
       <w:pPr>
         <w:spacing w:after="200" w:line="300" w:lineRule="auto"/>
         <w:ind w:left="420" w:hanging="420"/>
+        <w:rPr>
+          <w:sz w:val="21"/>
+          <w:szCs w:val="21"/>
+        </w:rPr>
       </w:pPr>
       <w:r>
         <w:rPr>
@@ -6238,7 +6825,6 @@
   <w:style w:type="character" w:default="1" w:styleId="Fuentedeprrafopredeter">
     <w:name w:val="Default Paragraph Font"/>
     <w:uiPriority w:val="1"/>
-    <w:semiHidden/>
     <w:unhideWhenUsed/>
   </w:style>
   <w:style w:type="table" w:default="1" w:styleId="Tablanormal">

</xml_diff>

<commit_message>
Completadas algunas preguntas del cuestionario
</commit_message>
<xml_diff>
--- a/cuestionario_conecta4.docx
+++ b/cuestionario_conecta4.docx
@@ -91,7 +91,6 @@
           <w:szCs w:val="21"/>
         </w:rPr>
       </w:pPr>
-      <w:proofErr w:type="spellStart"/>
       <w:r>
         <w:rPr>
           <w:rFonts w:ascii="Consolas" w:eastAsia="Consolas" w:hAnsi="Consolas" w:cs="Consolas"/>
@@ -100,7 +99,6 @@
         </w:rPr>
         <w:t>find_n</w:t>
       </w:r>
-      <w:proofErr w:type="spellEnd"/>
       <w:r>
         <w:rPr>
           <w:sz w:val="21"/>
@@ -108,7 +106,6 @@
         </w:rPr>
         <w:t xml:space="preserve"> y </w:t>
       </w:r>
-      <w:proofErr w:type="spellStart"/>
       <w:r>
         <w:rPr>
           <w:rFonts w:ascii="Consolas" w:eastAsia="Consolas" w:hAnsi="Consolas" w:cs="Consolas"/>
@@ -117,7 +114,6 @@
         </w:rPr>
         <w:t>find_strike</w:t>
       </w:r>
-      <w:proofErr w:type="spellEnd"/>
       <w:r>
         <w:rPr>
           <w:sz w:val="21"/>
@@ -153,35 +149,19 @@
         <w:ind w:left="720"/>
       </w:pPr>
       <w:r>
-        <w:t xml:space="preserve">Suponiendo que tenemos </w:t>
-      </w:r>
-      <w:proofErr w:type="spellStart"/>
-      <w:r>
-        <w:t>find_</w:t>
-      </w:r>
-      <w:proofErr w:type="gramStart"/>
-      <w:r>
-        <w:t>n</w:t>
-      </w:r>
-      <w:proofErr w:type="spellEnd"/>
-      <w:r>
-        <w:t>(</w:t>
-      </w:r>
-      <w:proofErr w:type="gramEnd"/>
-      <w:r>
-        <w:t xml:space="preserve">lista, 2, 3) y </w:t>
-      </w:r>
-      <w:proofErr w:type="spellStart"/>
-      <w:r>
-        <w:t>find_</w:t>
-      </w:r>
-      <w:proofErr w:type="gramStart"/>
-      <w:r>
-        <w:t>strike</w:t>
-      </w:r>
-      <w:proofErr w:type="spellEnd"/>
-      <w:r>
-        <w:t>(</w:t>
+        <w:t>Suponiendo que tenemos find_</w:t>
+      </w:r>
+      <w:proofErr w:type="gramStart"/>
+      <w:r>
+        <w:t>n(</w:t>
+      </w:r>
+      <w:proofErr w:type="gramEnd"/>
+      <w:r>
+        <w:t>lista, 2, 3) y find_</w:t>
+      </w:r>
+      <w:proofErr w:type="gramStart"/>
+      <w:r>
+        <w:t>strike(</w:t>
       </w:r>
       <w:proofErr w:type="gramEnd"/>
       <w:r>
@@ -218,7 +198,6 @@
         </w:rPr>
         <w:t xml:space="preserve">En </w:t>
       </w:r>
-      <w:proofErr w:type="spellStart"/>
       <w:r>
         <w:rPr>
           <w:rFonts w:ascii="Consolas" w:eastAsia="Consolas" w:hAnsi="Consolas" w:cs="Consolas"/>
@@ -227,7 +206,6 @@
         </w:rPr>
         <w:t>find_strike</w:t>
       </w:r>
-      <w:proofErr w:type="spellEnd"/>
       <w:r>
         <w:rPr>
           <w:sz w:val="21"/>
@@ -266,7 +244,6 @@
         </w:rPr>
         <w:t xml:space="preserve">¿Qué devuelve </w:t>
       </w:r>
-      <w:proofErr w:type="spellStart"/>
       <w:r>
         <w:rPr>
           <w:rFonts w:ascii="Consolas" w:eastAsia="Consolas" w:hAnsi="Consolas" w:cs="Consolas"/>
@@ -275,7 +252,6 @@
         </w:rPr>
         <w:t>find_strike</w:t>
       </w:r>
-      <w:proofErr w:type="spellEnd"/>
       <w:r>
         <w:rPr>
           <w:sz w:val="21"/>
@@ -294,23 +270,7 @@
         <w:t>Devuelve True. Me parece un comportamiento</w:t>
       </w:r>
       <w:r>
-        <w:t xml:space="preserve"> que no tiene mucho efecto sobre la experiencia de usuario porque controlamos los </w:t>
-      </w:r>
-      <w:proofErr w:type="spellStart"/>
-      <w:r>
-        <w:t>settings</w:t>
-      </w:r>
-      <w:proofErr w:type="spellEnd"/>
-      <w:r>
-        <w:t xml:space="preserve"> y no tiene sentido hacer un juego que requiera una racha de 0. Lo que cambia en el caso de que esto ocurra es obtener una victoria instantánea o un tablero completo y empate asegurado. Como el código está escrito de manera simple, sólo hay que quitar o poner el = del “</w:t>
-      </w:r>
-      <w:proofErr w:type="spellStart"/>
-      <w:r>
-        <w:t>if</w:t>
-      </w:r>
-      <w:proofErr w:type="spellEnd"/>
-      <w:r>
-        <w:t xml:space="preserve"> n&gt;= 0” para testear diferentes cuestiones como las victorias o los empates. Por supuesto que con ambas alternativas el oráculo no funcionaría correctamente.</w:t>
+        <w:t xml:space="preserve"> que no tiene mucho efecto sobre la experiencia de usuario porque controlamos los settings y no tiene sentido hacer un juego que requiera una racha de 0. Lo que cambia en el caso de que esto ocurra es obtener una victoria instantánea o un tablero completo y empate asegurado. Como el código está escrito de manera simple, sólo hay que quitar o poner el = del “if n&gt;= 0” para testear diferentes cuestiones como las victorias o los empates. Por supuesto que con ambas alternativas el oráculo no funcionaría correctamente.</w:t>
       </w:r>
     </w:p>
     <w:p>
@@ -346,7 +306,6 @@
       <w:r>
         <w:t>‘</w:t>
       </w:r>
-      <w:proofErr w:type="spellStart"/>
       <w:r>
         <w:t>o</w:t>
       </w:r>
@@ -386,7 +345,6 @@
       <w:r>
         <w:t>x</w:t>
       </w:r>
-      <w:proofErr w:type="spellEnd"/>
       <w:r>
         <w:t>’</w:t>
       </w:r>
@@ -456,7 +414,6 @@
       <w:r>
         <w:t>‘</w:t>
       </w:r>
-      <w:proofErr w:type="spellStart"/>
       <w:r>
         <w:t>x</w:t>
       </w:r>
@@ -496,7 +453,6 @@
       <w:r>
         <w:t>o</w:t>
       </w:r>
-      <w:proofErr w:type="spellEnd"/>
       <w:r>
         <w:t>’</w:t>
       </w:r>
@@ -507,13 +463,17 @@
         <w:t xml:space="preserve"> </w:t>
       </w:r>
       <w:r>
-        <w:t>[</w:t>
-      </w:r>
-      <w:proofErr w:type="spellStart"/>
-      <w:r>
-        <w:t>None</w:t>
-      </w:r>
-      <w:proofErr w:type="spellEnd"/>
+        <w:t xml:space="preserve">[None, </w:t>
+      </w:r>
+      <w:r>
+        <w:t>‘</w:t>
+      </w:r>
+      <w:r>
+        <w:t>o</w:t>
+      </w:r>
+      <w:r>
+        <w:t>’</w:t>
+      </w:r>
       <w:r>
         <w:t xml:space="preserve">, </w:t>
       </w:r>
@@ -521,33 +481,13 @@
         <w:t>‘</w:t>
       </w:r>
       <w:r>
-        <w:t>o</w:t>
+        <w:t>x</w:t>
       </w:r>
       <w:r>
         <w:t>’</w:t>
       </w:r>
       <w:r>
-        <w:t xml:space="preserve">, </w:t>
-      </w:r>
-      <w:r>
-        <w:t>‘</w:t>
-      </w:r>
-      <w:r>
-        <w:t>x</w:t>
-      </w:r>
-      <w:r>
-        <w:t>’</w:t>
-      </w:r>
-      <w:r>
-        <w:t xml:space="preserve">, </w:t>
-      </w:r>
-      <w:proofErr w:type="spellStart"/>
-      <w:r>
-        <w:t>None</w:t>
-      </w:r>
-      <w:proofErr w:type="spellEnd"/>
-      <w:r>
-        <w:t>]]</w:t>
+        <w:t>, None]]</w:t>
       </w:r>
       <w:r>
         <w:t>.</w:t>
@@ -563,47 +503,7 @@
         <w:t xml:space="preserve">El resultado después de desplazarla sería la matriz </w:t>
       </w:r>
       <w:r>
-        <w:t xml:space="preserve">[['x', 'o', 'x', </w:t>
-      </w:r>
-      <w:proofErr w:type="spellStart"/>
-      <w:r>
-        <w:t>None</w:t>
-      </w:r>
-      <w:proofErr w:type="spellEnd"/>
-      <w:r>
-        <w:t>], ['x', 'x', 'o', 'o'], [</w:t>
-      </w:r>
-      <w:proofErr w:type="spellStart"/>
-      <w:r>
-        <w:t>None</w:t>
-      </w:r>
-      <w:proofErr w:type="spellEnd"/>
-      <w:r>
-        <w:t>, 'x', 'x', 'o'], [</w:t>
-      </w:r>
-      <w:proofErr w:type="spellStart"/>
-      <w:r>
-        <w:t>None</w:t>
-      </w:r>
-      <w:proofErr w:type="spellEnd"/>
-      <w:r>
-        <w:t xml:space="preserve">, </w:t>
-      </w:r>
-      <w:proofErr w:type="spellStart"/>
-      <w:r>
-        <w:t>None</w:t>
-      </w:r>
-      <w:proofErr w:type="spellEnd"/>
-      <w:r>
-        <w:t xml:space="preserve">, </w:t>
-      </w:r>
-      <w:proofErr w:type="spellStart"/>
-      <w:r>
-        <w:t>None</w:t>
-      </w:r>
-      <w:proofErr w:type="spellEnd"/>
-      <w:r>
-        <w:t>, 'o']]</w:t>
+        <w:t>[['x', 'o', 'x', None], ['x', 'x', 'o', 'o'], [None, 'x', 'x', 'o'], [None, None, None, 'o']]</w:t>
       </w:r>
       <w:r>
         <w:br w:type="textWrapping" w:clear="all"/>
@@ -1159,23 +1059,7 @@
           <w:sz w:val="21"/>
           <w:szCs w:val="21"/>
         </w:rPr>
-        <w:t xml:space="preserve">¿Por qué la función que aplana el tablero a texto sustituye los </w:t>
-      </w:r>
-      <w:proofErr w:type="spellStart"/>
-      <w:r>
-        <w:rPr>
-          <w:sz w:val="21"/>
-          <w:szCs w:val="21"/>
-        </w:rPr>
-        <w:t>None</w:t>
-      </w:r>
-      <w:proofErr w:type="spellEnd"/>
-      <w:r>
-        <w:rPr>
-          <w:sz w:val="21"/>
-          <w:szCs w:val="21"/>
-        </w:rPr>
-        <w:t xml:space="preserve"> por un punto en lugar de omitirlos?</w:t>
+        <w:t>¿Por qué la función que aplana el tablero a texto sustituye los None por un punto en lugar de omitirlos?</w:t>
       </w:r>
     </w:p>
     <w:p>
@@ -1185,23 +1069,7 @@
         <w:ind w:left="720"/>
       </w:pPr>
       <w:r>
-        <w:t>Porque en algunos casos no se sabría dónde exactamente están las fichas y dónde hay celdas vacías. [“ox”] podría ser tanto [“.</w:t>
-      </w:r>
-      <w:proofErr w:type="spellStart"/>
-      <w:r>
-        <w:t>o.x</w:t>
-      </w:r>
-      <w:proofErr w:type="spellEnd"/>
-      <w:r>
-        <w:t>”] como [“</w:t>
-      </w:r>
-      <w:proofErr w:type="spellStart"/>
-      <w:r>
-        <w:t>o..x</w:t>
-      </w:r>
-      <w:proofErr w:type="spellEnd"/>
-      <w:r>
-        <w:t>”] como [“</w:t>
+        <w:t>Porque en algunos casos no se sabría dónde exactamente están las fichas y dónde hay celdas vacías. [“ox”] podría ser tanto [“.o.x”] como [“o..x”] como [“</w:t>
       </w:r>
       <w:proofErr w:type="gramStart"/>
       <w:r>
@@ -1209,31 +1077,7 @@
       </w:r>
       <w:proofErr w:type="gramEnd"/>
       <w:r>
-        <w:t>”], entre otras tantas posibilidades. Dado este requisito de un carácter “</w:t>
-      </w:r>
-      <w:proofErr w:type="spellStart"/>
-      <w:r>
-        <w:t>filler</w:t>
-      </w:r>
-      <w:proofErr w:type="spellEnd"/>
-      <w:r>
-        <w:t xml:space="preserve">”, para poder procesar la lista de caracteres con </w:t>
-      </w:r>
-      <w:proofErr w:type="spellStart"/>
-      <w:r>
-        <w:t>explode_list</w:t>
-      </w:r>
-      <w:proofErr w:type="spellEnd"/>
-      <w:r>
-        <w:t xml:space="preserve">, cada casilla del tablero debe ser exactamente de un carácter, dado que itera sobre la cadena y crea una </w:t>
-      </w:r>
-      <w:proofErr w:type="spellStart"/>
-      <w:r>
-        <w:t>LoL</w:t>
-      </w:r>
-      <w:proofErr w:type="spellEnd"/>
-      <w:r>
-        <w:t xml:space="preserve"> donde cada carácter es un elemento.</w:t>
+        <w:t>”], entre otras tantas posibilidades. Dado este requisito de un carácter “filler”, para poder procesar la lista de caracteres con explode_list, cada casilla del tablero debe ser exactamente de un carácter, dado que itera sobre la cadena y crea una LoL donde cada carácter es un elemento.</w:t>
       </w:r>
     </w:p>
     <w:p>
@@ -1289,15 +1133,7 @@
       </w:r>
       <w:proofErr w:type="gramEnd"/>
       <w:r>
-        <w:t xml:space="preserve"> ya tenemos verificaciones del lado del </w:t>
-      </w:r>
-      <w:proofErr w:type="spellStart"/>
-      <w:r>
-        <w:t>player</w:t>
-      </w:r>
-      <w:proofErr w:type="spellEnd"/>
-      <w:r>
-        <w:t xml:space="preserve"> para asegurar que no está introduciendo un valor en una columna completa. Ahorra trabajo e introducir más partes podría considerarse innecesario. Por otro lado, dado que es poco probable que esto ocurra, también es poco probable que el error inutilice el juego, sobre todo si funciona bien, por lo que en el caso de que se explote el juego y se produzca un error inesperado podría llegar a capturarse y en última instancia evitar mayores catástrofes, lo que sería un punto positivo también.</w:t>
+        <w:t xml:space="preserve"> ya tenemos verificaciones del lado del player para asegurar que no está introduciendo un valor en una columna completa. Ahorra trabajo e introducir más partes podría considerarse innecesario. Por otro lado, dado que es poco probable que esto ocurra, también es poco probable que el error inutilice el juego, sobre todo si funciona bien, por lo que en el caso de que se explote el juego y se produzca un error inesperado podría llegar a capturarse y en última instancia evitar mayores catástrofes, lo que sería un punto positivo también.</w:t>
       </w:r>
     </w:p>
     <w:p>
@@ -1363,24 +1199,15 @@
         <w:ind w:left="720"/>
       </w:pPr>
       <w:r>
-        <w:t xml:space="preserve">La victoria vertical resuelve en preguntarle a la lista elemental o “columna”. La victoria horizontal transpone la matriz y comprueba victoria vertical con </w:t>
-      </w:r>
-      <w:proofErr w:type="spellStart"/>
-      <w:r>
-        <w:t>list_</w:t>
+        <w:t>La victoria vertical resuelve en preguntarle a la lista elemental o “columna”. La victoria horizontal transpone la matriz y comprueba victoria vertical con list_</w:t>
       </w:r>
       <w:proofErr w:type="gramStart"/>
       <w:r>
         <w:t>utils.transpose</w:t>
       </w:r>
-      <w:proofErr w:type="spellEnd"/>
-      <w:proofErr w:type="gramEnd"/>
-      <w:r>
-        <w:t xml:space="preserve">(). En el caso de las diagonales, como mencioné antes, la diagonal descendente se puede solucionar con </w:t>
-      </w:r>
-      <w:proofErr w:type="spellStart"/>
-      <w:r>
-        <w:t>list_</w:t>
+      <w:proofErr w:type="gramEnd"/>
+      <w:r>
+        <w:t>(). En el caso de las diagonales, como mencioné antes, la diagonal descendente se puede solucionar con list_</w:t>
       </w:r>
       <w:proofErr w:type="gramStart"/>
       <w:r>
@@ -1392,11 +1219,7 @@
       </w:r>
       <w:proofErr w:type="gramStart"/>
       <w:r>
-        <w:t>matrix</w:t>
-      </w:r>
-      <w:proofErr w:type="spellEnd"/>
-      <w:r>
-        <w:t>(</w:t>
+        <w:t>matrix(</w:t>
       </w:r>
       <w:proofErr w:type="gramEnd"/>
       <w:r>
@@ -1412,11 +1235,7 @@
         <w:t>s</w:t>
       </w:r>
       <w:r>
-        <w:t xml:space="preserve"> con </w:t>
-      </w:r>
-      <w:proofErr w:type="spellStart"/>
-      <w:r>
-        <w:t>list_</w:t>
+        <w:t xml:space="preserve"> con list_</w:t>
       </w:r>
       <w:proofErr w:type="gramStart"/>
       <w:r>
@@ -1428,11 +1247,7 @@
       </w:r>
       <w:proofErr w:type="gramStart"/>
       <w:r>
-        <w:t>matrix</w:t>
-      </w:r>
-      <w:proofErr w:type="spellEnd"/>
-      <w:r>
-        <w:t>(</w:t>
+        <w:t>matrix(</w:t>
       </w:r>
       <w:proofErr w:type="gramEnd"/>
       <w:r>
@@ -1467,7 +1282,37 @@
         <w:ind w:left="720"/>
       </w:pPr>
       <w:r>
-        <w:t>Claro que es posible. Sigue siendo posible comprobar la victoria diagonal, y los jugadores pueden jugar para provocar una victoria diagonal, aunque sería difícil desde la perspectiva de una partida real competitiva.</w:t>
+        <w:t>Claro que es posible. Sigue siendo posible comprobar la victoria diagonal, y los jugadores pueden jugar para provocar una victoria diagonal, aunque sería difícil desde la perspectiva de una partida real competitiva</w:t>
+      </w:r>
+      <w:r>
+        <w:t xml:space="preserve">, porque </w:t>
+      </w:r>
+      <w:r>
+        <w:t>al ser el tablero bastante pequeño, para lograrlo quizás habría que</w:t>
+      </w:r>
+      <w:r>
+        <w:t xml:space="preserve"> ir deliberadamente a dejar al oponente ganar así</w:t>
+      </w:r>
+      <w:r>
+        <w:t>. C</w:t>
+      </w:r>
+      <w:r>
+        <w:t>on una IA</w:t>
+      </w:r>
+      <w:r>
+        <w:t>, aunque sea la del modo fácil</w:t>
+      </w:r>
+      <w:r>
+        <w:t xml:space="preserve"> que no evita las derrotas</w:t>
+      </w:r>
+      <w:r>
+        <w:t>,</w:t>
+      </w:r>
+      <w:r>
+        <w:t xml:space="preserve"> es difícil gestionarlo</w:t>
+      </w:r>
+      <w:r>
+        <w:t>.</w:t>
       </w:r>
     </w:p>
     <w:p>
@@ -1501,13 +1346,8 @@
         <w:t>Podría darse un error</w:t>
       </w:r>
       <w:r>
-        <w:t xml:space="preserve"> como los que vimos de </w:t>
-      </w:r>
-      <w:proofErr w:type="spellStart"/>
-      <w:r>
-        <w:t>aliasing</w:t>
-      </w:r>
-      <w:proofErr w:type="spellEnd"/>
+        <w:t xml:space="preserve"> como los que vimos de aliasing</w:t>
+      </w:r>
       <w:r>
         <w:t xml:space="preserve"> en el que modificar una lista “copiada” modifique a la lista original, </w:t>
       </w:r>
@@ -1515,23 +1355,7 @@
         <w:t xml:space="preserve">aunque en este código no hay de momento y </w:t>
       </w:r>
       <w:r>
-        <w:t xml:space="preserve">en todas las copias que generamos en el programa que no son esas no cometemos el error (como con </w:t>
-      </w:r>
-      <w:proofErr w:type="spellStart"/>
-      <w:r>
-        <w:t>transpose</w:t>
-      </w:r>
-      <w:proofErr w:type="spellEnd"/>
-      <w:r>
-        <w:t xml:space="preserve"> o con </w:t>
-      </w:r>
-      <w:proofErr w:type="spellStart"/>
-      <w:r>
-        <w:t>deepcopy</w:t>
-      </w:r>
-      <w:proofErr w:type="spellEnd"/>
-      <w:r>
-        <w:t>)</w:t>
+        <w:t>en todas las copias que generamos en el programa que no son esas no cometemos el error (como con transpose o con deepcopy)</w:t>
       </w:r>
       <w:r>
         <w:t>.</w:t>
@@ -1667,11 +1491,9 @@
       <w:r>
         <w:t>.</w:t>
       </w:r>
-      <w:proofErr w:type="spellStart"/>
       <w:r>
         <w:t>add</w:t>
       </w:r>
-      <w:proofErr w:type="spellEnd"/>
       <w:proofErr w:type="gramEnd"/>
       <w:r>
         <w:t xml:space="preserve">, </w:t>
@@ -1714,7 +1536,6 @@
         </w:rPr>
         <w:t>'</w:t>
       </w:r>
-      <w:proofErr w:type="spellStart"/>
       <w:proofErr w:type="gramStart"/>
       <w:r>
         <w:rPr>
@@ -1722,42 +1543,33 @@
           <w:sz w:val="21"/>
           <w:szCs w:val="21"/>
         </w:rPr>
-        <w:t>xo</w:t>
-      </w:r>
-      <w:proofErr w:type="spellEnd"/>
+        <w:t>xo..</w:t>
+      </w:r>
+      <w:proofErr w:type="gramEnd"/>
       <w:r>
         <w:rPr>
           <w:rFonts w:ascii="Consolas" w:eastAsia="Consolas" w:hAnsi="Consolas" w:cs="Consolas"/>
           <w:sz w:val="21"/>
           <w:szCs w:val="21"/>
         </w:rPr>
-        <w:t>..</w:t>
-      </w:r>
-      <w:proofErr w:type="gramEnd"/>
+        <w:t>|</w:t>
+      </w:r>
+      <w:proofErr w:type="gramStart"/>
       <w:r>
         <w:rPr>
           <w:rFonts w:ascii="Consolas" w:eastAsia="Consolas" w:hAnsi="Consolas" w:cs="Consolas"/>
           <w:sz w:val="21"/>
           <w:szCs w:val="21"/>
         </w:rPr>
-        <w:t>|</w:t>
-      </w:r>
-      <w:proofErr w:type="gramStart"/>
+        <w:t>o...|....|....</w:t>
+      </w:r>
+      <w:proofErr w:type="gramEnd"/>
       <w:r>
         <w:rPr>
           <w:rFonts w:ascii="Consolas" w:eastAsia="Consolas" w:hAnsi="Consolas" w:cs="Consolas"/>
           <w:sz w:val="21"/>
           <w:szCs w:val="21"/>
         </w:rPr>
-        <w:t>o...|....|....</w:t>
-      </w:r>
-      <w:proofErr w:type="gramEnd"/>
-      <w:r>
-        <w:rPr>
-          <w:rFonts w:ascii="Consolas" w:eastAsia="Consolas" w:hAnsi="Consolas" w:cs="Consolas"/>
-          <w:sz w:val="21"/>
-          <w:szCs w:val="21"/>
-        </w:rPr>
         <w:t>'</w:t>
       </w:r>
       <w:r>
@@ -1775,28 +1587,15 @@
         <w:ind w:left="720"/>
       </w:pPr>
       <w:r>
-        <w:t xml:space="preserve">Primero se </w:t>
-      </w:r>
-      <w:proofErr w:type="spellStart"/>
-      <w:r>
-        <w:t>tokeniza</w:t>
-      </w:r>
-      <w:proofErr w:type="spellEnd"/>
-      <w:r>
-        <w:t xml:space="preserve"> con el separador “|”</w:t>
+        <w:t>Primero se tokeniza con el separador “|”</w:t>
       </w:r>
       <w:r>
         <w:t xml:space="preserve"> con el método de </w:t>
       </w:r>
       <w:proofErr w:type="gramStart"/>
       <w:r>
-        <w:t>cadenas .</w:t>
-      </w:r>
-      <w:proofErr w:type="spellStart"/>
-      <w:r>
-        <w:t>split</w:t>
-      </w:r>
-      <w:proofErr w:type="spellEnd"/>
+        <w:t>cadenas .split</w:t>
+      </w:r>
       <w:proofErr w:type="gramEnd"/>
       <w:r>
         <w:t>(‘|’)</w:t>
@@ -1804,14 +1603,9 @@
       <w:r>
         <w:t>: [“</w:t>
       </w:r>
-      <w:proofErr w:type="spellStart"/>
-      <w:proofErr w:type="gramStart"/>
-      <w:r>
-        <w:t>xo</w:t>
-      </w:r>
-      <w:proofErr w:type="spellEnd"/>
-      <w:r>
-        <w:t>..”,“</w:t>
+      <w:proofErr w:type="gramStart"/>
+      <w:r>
+        <w:t>xo..”,“</w:t>
       </w:r>
       <w:proofErr w:type="gramEnd"/>
       <w:r>
@@ -1833,11 +1627,7 @@
         <w:ind w:left="720"/>
       </w:pPr>
       <w:r>
-        <w:t xml:space="preserve">Luego se crea una lista de listas con </w:t>
-      </w:r>
-      <w:proofErr w:type="spellStart"/>
-      <w:r>
-        <w:t>list_</w:t>
+        <w:t>Luego se crea una lista de listas con list_</w:t>
       </w:r>
       <w:proofErr w:type="gramStart"/>
       <w:r>
@@ -1849,11 +1639,7 @@
       </w:r>
       <w:proofErr w:type="gramStart"/>
       <w:r>
-        <w:t>list</w:t>
-      </w:r>
-      <w:proofErr w:type="spellEnd"/>
-      <w:r>
-        <w:t>(</w:t>
+        <w:t>list(</w:t>
       </w:r>
       <w:proofErr w:type="gramEnd"/>
       <w:r>
@@ -2063,34 +1849,196 @@
         <w:ind w:left="720"/>
       </w:pPr>
       <w:r>
-        <w:t xml:space="preserve">Después se cambian los “.” por </w:t>
-      </w:r>
-      <w:proofErr w:type="spellStart"/>
-      <w:r>
+        <w:lastRenderedPageBreak/>
+        <w:t>Después se cambian los “.” por None</w:t>
+      </w:r>
+      <w:r>
+        <w:t xml:space="preserve"> con replace_</w:t>
+      </w:r>
+      <w:proofErr w:type="gramStart"/>
+      <w:r>
+        <w:t>all(</w:t>
+      </w:r>
+      <w:proofErr w:type="gramEnd"/>
+      <w:r>
+        <w:t>)</w:t>
+      </w:r>
+      <w:r>
+        <w:t>:</w:t>
+      </w:r>
+    </w:p>
+    <w:p>
+      <w:pPr>
+        <w:pStyle w:val="Prrafodelista"/>
+        <w:spacing w:after="200" w:line="300" w:lineRule="auto"/>
+        <w:ind w:left="720"/>
+        <w:rPr>
+          <w:lang w:val="en-US"/>
+        </w:rPr>
+      </w:pPr>
+      <w:r>
+        <w:rPr>
+          <w:lang w:val="en-US"/>
+        </w:rPr>
+        <w:t>[[“x”</w:t>
+      </w:r>
+      <w:proofErr w:type="gramStart"/>
+      <w:r>
+        <w:rPr>
+          <w:lang w:val="en-US"/>
+        </w:rPr>
+        <w:t>, ”o</w:t>
+      </w:r>
+      <w:proofErr w:type="gramEnd"/>
+      <w:r>
+        <w:rPr>
+          <w:lang w:val="en-US"/>
+        </w:rPr>
+        <w:t>”, None, None],</w:t>
+      </w:r>
+      <w:r>
+        <w:rPr>
+          <w:lang w:val="en-US"/>
+        </w:rPr>
+        <w:t xml:space="preserve"> </w:t>
+      </w:r>
+      <w:r>
+        <w:rPr>
+          <w:lang w:val="en-US"/>
+        </w:rPr>
+        <w:t xml:space="preserve">[“o”, None, None, </w:t>
+      </w:r>
+      <w:r>
+        <w:rPr>
+          <w:lang w:val="en-US"/>
+        </w:rPr>
         <w:t>None</w:t>
       </w:r>
-      <w:proofErr w:type="spellEnd"/>
-      <w:r>
-        <w:t xml:space="preserve"> con </w:t>
-      </w:r>
-      <w:proofErr w:type="spellStart"/>
-      <w:r>
-        <w:t>replace_</w:t>
-      </w:r>
-      <w:proofErr w:type="gramStart"/>
-      <w:r>
-        <w:t>all</w:t>
-      </w:r>
-      <w:proofErr w:type="spellEnd"/>
-      <w:r>
-        <w:t>(</w:t>
-      </w:r>
-      <w:proofErr w:type="gramEnd"/>
-      <w:r>
-        <w:t>)</w:t>
-      </w:r>
-      <w:r>
-        <w:t>:</w:t>
+      <w:r>
+        <w:rPr>
+          <w:lang w:val="en-US"/>
+        </w:rPr>
+        <w:t>],</w:t>
+      </w:r>
+      <w:r>
+        <w:rPr>
+          <w:lang w:val="en-US"/>
+        </w:rPr>
+        <w:t xml:space="preserve"> </w:t>
+      </w:r>
+      <w:r>
+        <w:rPr>
+          <w:lang w:val="en-US"/>
+        </w:rPr>
+        <w:t>[</w:t>
+      </w:r>
+      <w:r>
+        <w:rPr>
+          <w:lang w:val="en-US"/>
+        </w:rPr>
+        <w:t>None</w:t>
+      </w:r>
+      <w:r>
+        <w:rPr>
+          <w:lang w:val="en-US"/>
+        </w:rPr>
+        <w:t xml:space="preserve">, </w:t>
+      </w:r>
+      <w:r>
+        <w:rPr>
+          <w:lang w:val="en-US"/>
+        </w:rPr>
+        <w:t>None</w:t>
+      </w:r>
+      <w:r>
+        <w:rPr>
+          <w:lang w:val="en-US"/>
+        </w:rPr>
+        <w:t xml:space="preserve">, </w:t>
+      </w:r>
+      <w:r>
+        <w:rPr>
+          <w:lang w:val="en-US"/>
+        </w:rPr>
+        <w:t>None</w:t>
+      </w:r>
+      <w:r>
+        <w:rPr>
+          <w:lang w:val="en-US"/>
+        </w:rPr>
+        <w:t xml:space="preserve">, </w:t>
+      </w:r>
+      <w:r>
+        <w:rPr>
+          <w:lang w:val="en-US"/>
+        </w:rPr>
+        <w:t>None</w:t>
+      </w:r>
+      <w:r>
+        <w:rPr>
+          <w:lang w:val="en-US"/>
+        </w:rPr>
+        <w:t>],</w:t>
+      </w:r>
+      <w:r>
+        <w:rPr>
+          <w:lang w:val="en-US"/>
+        </w:rPr>
+        <w:t xml:space="preserve"> </w:t>
+      </w:r>
+      <w:r>
+        <w:rPr>
+          <w:lang w:val="en-US"/>
+        </w:rPr>
+        <w:t>[</w:t>
+      </w:r>
+      <w:r>
+        <w:rPr>
+          <w:lang w:val="en-US"/>
+        </w:rPr>
+        <w:t>None</w:t>
+      </w:r>
+      <w:r>
+        <w:rPr>
+          <w:lang w:val="en-US"/>
+        </w:rPr>
+        <w:t xml:space="preserve">, </w:t>
+      </w:r>
+      <w:r>
+        <w:rPr>
+          <w:lang w:val="en-US"/>
+        </w:rPr>
+        <w:t>None</w:t>
+      </w:r>
+      <w:r>
+        <w:rPr>
+          <w:lang w:val="en-US"/>
+        </w:rPr>
+        <w:t xml:space="preserve">, </w:t>
+      </w:r>
+      <w:r>
+        <w:rPr>
+          <w:lang w:val="en-US"/>
+        </w:rPr>
+        <w:t>None</w:t>
+      </w:r>
+      <w:r>
+        <w:rPr>
+          <w:lang w:val="en-US"/>
+        </w:rPr>
+        <w:t xml:space="preserve">, </w:t>
+      </w:r>
+      <w:r>
+        <w:rPr>
+          <w:lang w:val="en-US"/>
+        </w:rPr>
+        <w:t>None</w:t>
+      </w:r>
+      <w:r>
+        <w:rPr>
+          <w:lang w:val="en-US"/>
+        </w:rPr>
+        <w:t>]]</w:t>
       </w:r>
     </w:p>
     <w:p>
@@ -2102,170 +2050,6 @@
           <w:lang w:val="en-US"/>
         </w:rPr>
       </w:pPr>
-      <w:r>
-        <w:rPr>
-          <w:lang w:val="en-US"/>
-        </w:rPr>
-        <w:t>[[“x”</w:t>
-      </w:r>
-      <w:proofErr w:type="gramStart"/>
-      <w:r>
-        <w:rPr>
-          <w:lang w:val="en-US"/>
-        </w:rPr>
-        <w:t>, ”o</w:t>
-      </w:r>
-      <w:proofErr w:type="gramEnd"/>
-      <w:r>
-        <w:rPr>
-          <w:lang w:val="en-US"/>
-        </w:rPr>
-        <w:t>”, None, None],</w:t>
-      </w:r>
-      <w:r>
-        <w:rPr>
-          <w:lang w:val="en-US"/>
-        </w:rPr>
-        <w:t xml:space="preserve"> </w:t>
-      </w:r>
-      <w:r>
-        <w:rPr>
-          <w:lang w:val="en-US"/>
-        </w:rPr>
-        <w:t xml:space="preserve">[“o”, None, None, </w:t>
-      </w:r>
-      <w:r>
-        <w:rPr>
-          <w:lang w:val="en-US"/>
-        </w:rPr>
-        <w:t>None</w:t>
-      </w:r>
-      <w:r>
-        <w:rPr>
-          <w:lang w:val="en-US"/>
-        </w:rPr>
-        <w:t>],</w:t>
-      </w:r>
-      <w:r>
-        <w:rPr>
-          <w:lang w:val="en-US"/>
-        </w:rPr>
-        <w:t xml:space="preserve"> </w:t>
-      </w:r>
-      <w:r>
-        <w:rPr>
-          <w:lang w:val="en-US"/>
-        </w:rPr>
-        <w:t>[</w:t>
-      </w:r>
-      <w:r>
-        <w:rPr>
-          <w:lang w:val="en-US"/>
-        </w:rPr>
-        <w:t>None</w:t>
-      </w:r>
-      <w:r>
-        <w:rPr>
-          <w:lang w:val="en-US"/>
-        </w:rPr>
-        <w:t xml:space="preserve">, </w:t>
-      </w:r>
-      <w:r>
-        <w:rPr>
-          <w:lang w:val="en-US"/>
-        </w:rPr>
-        <w:t>None</w:t>
-      </w:r>
-      <w:r>
-        <w:rPr>
-          <w:lang w:val="en-US"/>
-        </w:rPr>
-        <w:t xml:space="preserve">, </w:t>
-      </w:r>
-      <w:r>
-        <w:rPr>
-          <w:lang w:val="en-US"/>
-        </w:rPr>
-        <w:t>None</w:t>
-      </w:r>
-      <w:r>
-        <w:rPr>
-          <w:lang w:val="en-US"/>
-        </w:rPr>
-        <w:t xml:space="preserve">, </w:t>
-      </w:r>
-      <w:r>
-        <w:rPr>
-          <w:lang w:val="en-US"/>
-        </w:rPr>
-        <w:t>None</w:t>
-      </w:r>
-      <w:r>
-        <w:rPr>
-          <w:lang w:val="en-US"/>
-        </w:rPr>
-        <w:t>],</w:t>
-      </w:r>
-      <w:r>
-        <w:rPr>
-          <w:lang w:val="en-US"/>
-        </w:rPr>
-        <w:t xml:space="preserve"> </w:t>
-      </w:r>
-      <w:r>
-        <w:rPr>
-          <w:lang w:val="en-US"/>
-        </w:rPr>
-        <w:t>[</w:t>
-      </w:r>
-      <w:r>
-        <w:rPr>
-          <w:lang w:val="en-US"/>
-        </w:rPr>
-        <w:t>None</w:t>
-      </w:r>
-      <w:r>
-        <w:rPr>
-          <w:lang w:val="en-US"/>
-        </w:rPr>
-        <w:t xml:space="preserve">, </w:t>
-      </w:r>
-      <w:r>
-        <w:rPr>
-          <w:lang w:val="en-US"/>
-        </w:rPr>
-        <w:t>None</w:t>
-      </w:r>
-      <w:r>
-        <w:rPr>
-          <w:lang w:val="en-US"/>
-        </w:rPr>
-        <w:t xml:space="preserve">, </w:t>
-      </w:r>
-      <w:r>
-        <w:rPr>
-          <w:lang w:val="en-US"/>
-        </w:rPr>
-        <w:t>None</w:t>
-      </w:r>
-      <w:r>
-        <w:rPr>
-          <w:lang w:val="en-US"/>
-        </w:rPr>
-        <w:t xml:space="preserve">, </w:t>
-      </w:r>
-      <w:r>
-        <w:rPr>
-          <w:lang w:val="en-US"/>
-        </w:rPr>
-        <w:t>None</w:t>
-      </w:r>
-      <w:r>
-        <w:rPr>
-          <w:lang w:val="en-US"/>
-        </w:rPr>
-        <w:t>]]</w:t>
-      </w:r>
     </w:p>
     <w:p>
       <w:pPr>
@@ -2273,16 +2057,6 @@
         <w:spacing w:after="200" w:line="300" w:lineRule="auto"/>
         <w:ind w:left="720"/>
         <w:rPr>
-          <w:lang w:val="en-US"/>
-        </w:rPr>
-      </w:pPr>
-    </w:p>
-    <w:p>
-      <w:pPr>
-        <w:pStyle w:val="Prrafodelista"/>
-        <w:spacing w:after="200" w:line="300" w:lineRule="auto"/>
-        <w:ind w:left="720"/>
-        <w:rPr>
           <w:lang w:val="es-ES"/>
         </w:rPr>
       </w:pPr>
@@ -2310,227 +2084,77 @@
         <w:rPr>
           <w:lang w:val="es-ES"/>
         </w:rPr>
-        <w:t xml:space="preserve"> la clase </w:t>
-      </w:r>
-      <w:proofErr w:type="spellStart"/>
+        <w:t xml:space="preserve"> la clase SquareBoard con </w:t>
+      </w:r>
+      <w:proofErr w:type="gramStart"/>
       <w:r>
         <w:rPr>
           <w:lang w:val="es-ES"/>
         </w:rPr>
-        <w:t>SquareBoard</w:t>
-      </w:r>
-      <w:proofErr w:type="spellEnd"/>
+        <w:t>cls.from</w:t>
+      </w:r>
+      <w:proofErr w:type="gramEnd"/>
       <w:r>
         <w:rPr>
           <w:lang w:val="es-ES"/>
         </w:rPr>
-        <w:t xml:space="preserve"> con </w:t>
-      </w:r>
-      <w:proofErr w:type="spellStart"/>
+        <w:t>_</w:t>
+      </w:r>
       <w:proofErr w:type="gramStart"/>
       <w:r>
         <w:rPr>
           <w:lang w:val="es-ES"/>
         </w:rPr>
-        <w:t>cls.from</w:t>
+        <w:t>list(</w:t>
       </w:r>
       <w:proofErr w:type="gramEnd"/>
       <w:r>
         <w:rPr>
           <w:lang w:val="es-ES"/>
         </w:rPr>
-        <w:t>_</w:t>
+        <w:t>), lo cual llama a map_</w:t>
       </w:r>
       <w:proofErr w:type="gramStart"/>
       <w:r>
         <w:rPr>
           <w:lang w:val="es-ES"/>
         </w:rPr>
-        <w:t>list</w:t>
-      </w:r>
-      <w:proofErr w:type="spellEnd"/>
+        <w:t>list(</w:t>
+      </w:r>
+      <w:proofErr w:type="gramEnd"/>
       <w:r>
         <w:rPr>
           <w:lang w:val="es-ES"/>
         </w:rPr>
-        <w:t>(</w:t>
-      </w:r>
-      <w:proofErr w:type="gramEnd"/>
+        <w:t>) y le aplica a cada una de las listas internas el LinearBoard.from_</w:t>
+      </w:r>
+      <w:proofErr w:type="gramStart"/>
       <w:r>
         <w:rPr>
           <w:lang w:val="es-ES"/>
         </w:rPr>
-        <w:t xml:space="preserve">), lo cual llama a </w:t>
-      </w:r>
-      <w:proofErr w:type="spellStart"/>
+        <w:t>list(</w:t>
+      </w:r>
+      <w:proofErr w:type="gramEnd"/>
       <w:r>
         <w:rPr>
           <w:lang w:val="es-ES"/>
         </w:rPr>
-        <w:t>map_</w:t>
+        <w:t xml:space="preserve">) de LinearBoard, que hace </w:t>
       </w:r>
       <w:proofErr w:type="gramStart"/>
       <w:r>
         <w:rPr>
           <w:lang w:val="es-ES"/>
         </w:rPr>
-        <w:t>list</w:t>
-      </w:r>
-      <w:proofErr w:type="spellEnd"/>
+        <w:t>board._</w:t>
+      </w:r>
+      <w:proofErr w:type="gramEnd"/>
       <w:r>
         <w:rPr>
           <w:lang w:val="es-ES"/>
         </w:rPr>
-        <w:t>(</w:t>
-      </w:r>
-      <w:proofErr w:type="gramEnd"/>
-      <w:r>
-        <w:rPr>
-          <w:lang w:val="es-ES"/>
-        </w:rPr>
-        <w:t xml:space="preserve">) y le aplica a cada una de las listas internas el </w:t>
-      </w:r>
-      <w:proofErr w:type="spellStart"/>
-      <w:r>
-        <w:rPr>
-          <w:lang w:val="es-ES"/>
-        </w:rPr>
-        <w:t>LinearBoard.from_</w:t>
-      </w:r>
-      <w:proofErr w:type="gramStart"/>
-      <w:r>
-        <w:rPr>
-          <w:lang w:val="es-ES"/>
-        </w:rPr>
-        <w:t>list</w:t>
-      </w:r>
-      <w:proofErr w:type="spellEnd"/>
-      <w:r>
-        <w:rPr>
-          <w:lang w:val="es-ES"/>
-        </w:rPr>
-        <w:t>(</w:t>
-      </w:r>
-      <w:proofErr w:type="gramEnd"/>
-      <w:r>
-        <w:rPr>
-          <w:lang w:val="es-ES"/>
-        </w:rPr>
-        <w:t xml:space="preserve">) de </w:t>
-      </w:r>
-      <w:proofErr w:type="spellStart"/>
-      <w:r>
-        <w:rPr>
-          <w:lang w:val="es-ES"/>
-        </w:rPr>
-        <w:t>LinearBoard</w:t>
-      </w:r>
-      <w:proofErr w:type="spellEnd"/>
-      <w:r>
-        <w:rPr>
-          <w:lang w:val="es-ES"/>
-        </w:rPr>
-        <w:t xml:space="preserve">, que hace </w:t>
-      </w:r>
-      <w:proofErr w:type="spellStart"/>
-      <w:proofErr w:type="gramStart"/>
-      <w:r>
-        <w:rPr>
-          <w:lang w:val="es-ES"/>
-        </w:rPr>
-        <w:t>board</w:t>
-      </w:r>
-      <w:proofErr w:type="spellEnd"/>
-      <w:r>
-        <w:rPr>
-          <w:lang w:val="es-ES"/>
-        </w:rPr>
-        <w:t>._</w:t>
-      </w:r>
-      <w:proofErr w:type="spellStart"/>
-      <w:proofErr w:type="gramEnd"/>
-      <w:r>
-        <w:rPr>
-          <w:lang w:val="es-ES"/>
-        </w:rPr>
-        <w:t>columns</w:t>
-      </w:r>
-      <w:proofErr w:type="spellEnd"/>
-      <w:r>
-        <w:rPr>
-          <w:lang w:val="es-ES"/>
-        </w:rPr>
-        <w:t xml:space="preserve"> = data. Los datos que le hemos aportado sustituyen a la lista temporal de </w:t>
-      </w:r>
-      <w:proofErr w:type="spellStart"/>
-      <w:r>
-        <w:rPr>
-          <w:lang w:val="es-ES"/>
-        </w:rPr>
-        <w:t>make_list</w:t>
-      </w:r>
-      <w:proofErr w:type="spellEnd"/>
-      <w:r>
-        <w:rPr>
-          <w:lang w:val="es-ES"/>
-        </w:rPr>
-        <w:t xml:space="preserve"> que se inicializa en </w:t>
-      </w:r>
-      <w:proofErr w:type="spellStart"/>
-      <w:r>
-        <w:rPr>
-          <w:lang w:val="es-ES"/>
-        </w:rPr>
-        <w:t>LinearBoard</w:t>
-      </w:r>
-      <w:proofErr w:type="spellEnd"/>
-      <w:r>
-        <w:rPr>
-          <w:lang w:val="es-ES"/>
-        </w:rPr>
-        <w:t xml:space="preserve">, por lo que se entiende que lo que queda en </w:t>
-      </w:r>
-      <w:proofErr w:type="spellStart"/>
-      <w:r>
-        <w:rPr>
-          <w:lang w:val="es-ES"/>
-        </w:rPr>
-        <w:t>SquareBoard</w:t>
-      </w:r>
-      <w:proofErr w:type="spellEnd"/>
-      <w:r>
-        <w:rPr>
-          <w:lang w:val="es-ES"/>
-        </w:rPr>
-        <w:t xml:space="preserve"> son 4 listas de </w:t>
-      </w:r>
-      <w:proofErr w:type="spellStart"/>
-      <w:r>
-        <w:rPr>
-          <w:lang w:val="es-ES"/>
-        </w:rPr>
-        <w:t>LinearBoard</w:t>
-      </w:r>
-      <w:proofErr w:type="spellEnd"/>
-      <w:r>
-        <w:rPr>
-          <w:lang w:val="es-ES"/>
-        </w:rPr>
-        <w:t xml:space="preserve">, aportadas en un </w:t>
-      </w:r>
-      <w:proofErr w:type="spellStart"/>
-      <w:r>
-        <w:rPr>
-          <w:lang w:val="es-ES"/>
-        </w:rPr>
-        <w:t>LoL</w:t>
-      </w:r>
-      <w:proofErr w:type="spellEnd"/>
-      <w:r>
-        <w:rPr>
-          <w:lang w:val="es-ES"/>
-        </w:rPr>
-        <w:t xml:space="preserve"> traducido de una cadena simple.</w:t>
+        <w:t>columns = data. Los datos que le hemos aportado sustituyen a la lista temporal de make_list que se inicializa en LinearBoard, por lo que se entiende que lo que queda en SquareBoard son 4 listas de LinearBoard, aportadas en un LoL traducido de una cadena simple.</w:t>
       </w:r>
     </w:p>
     <w:p>
@@ -2683,15 +2307,7 @@
         <w:t>En</w:t>
       </w:r>
       <w:r>
-        <w:t xml:space="preserve"> el mejor de los casos donde sólo hay una columna que no es FULL y es ganadora, se hace sólo 1 </w:t>
-      </w:r>
-      <w:proofErr w:type="spellStart"/>
-      <w:r>
-        <w:t>deepcopy</w:t>
-      </w:r>
-      <w:proofErr w:type="spellEnd"/>
-      <w:r>
-        <w:t xml:space="preserve">. En el caso de que no </w:t>
+        <w:t xml:space="preserve"> el mejor de los casos donde sólo hay una columna que no es FULL y es ganadora, se hace sólo 1 deepcopy. En el caso de que no </w:t>
       </w:r>
       <w:proofErr w:type="gramStart"/>
       <w:r>
@@ -2699,39 +2315,10 @@
       </w:r>
       <w:proofErr w:type="gramEnd"/>
       <w:r>
-        <w:t xml:space="preserve"> columnas completas y todas sean WIN, serían N </w:t>
-      </w:r>
-      <w:proofErr w:type="spellStart"/>
-      <w:r>
-        <w:t>deepcopies</w:t>
-      </w:r>
-      <w:proofErr w:type="spellEnd"/>
-      <w:r>
-        <w:t xml:space="preserve">, porque </w:t>
-      </w:r>
-      <w:proofErr w:type="spellStart"/>
-      <w:r>
-        <w:t>win</w:t>
-      </w:r>
-      <w:proofErr w:type="spellEnd"/>
-      <w:r>
-        <w:t xml:space="preserve"> sólo hace una </w:t>
-      </w:r>
-      <w:proofErr w:type="spellStart"/>
-      <w:r>
-        <w:t>deepcopy</w:t>
-      </w:r>
-      <w:proofErr w:type="spellEnd"/>
-      <w:r>
-        <w:t xml:space="preserve"> y si se confirma </w:t>
-      </w:r>
-      <w:proofErr w:type="spellStart"/>
-      <w:r>
-        <w:t>win</w:t>
-      </w:r>
-      <w:proofErr w:type="spellEnd"/>
-      <w:r>
-        <w:t xml:space="preserve"> no se sigue a lose</w:t>
+        <w:t xml:space="preserve"> columnas completas y todas sean WIN, serían N deepcopies</w:t>
+      </w:r>
+      <w:r>
+        <w:t>, porque win sólo hace una deepcopy y si se confirma win no se sigue a lose</w:t>
       </w:r>
       <w:r>
         <w:t>.</w:t>
@@ -2744,27 +2331,11 @@
         <w:ind w:left="720"/>
       </w:pPr>
       <w:r>
-        <w:t xml:space="preserve">En el peor de los casos, donde todas son LOSE y no hay columnas llenas, tendríamos por cada columna 1 (comprueba si es WIN), + 1 (primera </w:t>
-      </w:r>
-      <w:proofErr w:type="spellStart"/>
-      <w:r>
-        <w:t>deepcopy</w:t>
-      </w:r>
-      <w:proofErr w:type="spellEnd"/>
-      <w:r>
-        <w:t xml:space="preserve"> de _</w:t>
-      </w:r>
-      <w:proofErr w:type="spellStart"/>
-      <w:r>
-        <w:t>is_losing_</w:t>
-      </w:r>
-      <w:proofErr w:type="gramStart"/>
-      <w:r>
-        <w:t>bet</w:t>
-      </w:r>
-      <w:proofErr w:type="spellEnd"/>
-      <w:r>
-        <w:t>(</w:t>
+        <w:t>En el peor de los casos, donde todas son LOSE y no hay columnas llenas, tendríamos por cada columna 1 (comprueba si es WIN), + 1 (primera deepcopy de _is_losing_</w:t>
+      </w:r>
+      <w:proofErr w:type="gramStart"/>
+      <w:r>
+        <w:t>bet(</w:t>
       </w:r>
       <w:proofErr w:type="gramEnd"/>
       <w:r>
@@ -2774,13 +2345,8 @@
         <w:t>1*</w:t>
       </w:r>
       <w:r>
-        <w:t xml:space="preserve">N </w:t>
-      </w:r>
-      <w:proofErr w:type="spellStart"/>
-      <w:r>
-        <w:t>deepcopies</w:t>
-      </w:r>
-      <w:proofErr w:type="spellEnd"/>
+        <w:t>N deepcopies</w:t>
+      </w:r>
       <w:r>
         <w:t xml:space="preserve"> (una por cada columna)</w:t>
       </w:r>
@@ -2916,7 +2482,6 @@
         </w:rPr>
         <w:t>Player._</w:t>
       </w:r>
-      <w:proofErr w:type="spellStart"/>
       <w:proofErr w:type="gramEnd"/>
       <w:r>
         <w:rPr>
@@ -2931,39 +2496,15 @@
           <w:sz w:val="21"/>
           <w:szCs w:val="21"/>
         </w:rPr>
-        <w:t>recommendation</w:t>
-      </w:r>
-      <w:proofErr w:type="spellEnd"/>
-      <w:r>
-        <w:rPr>
-          <w:sz w:val="21"/>
-          <w:szCs w:val="21"/>
-        </w:rPr>
-        <w:t>(</w:t>
-      </w:r>
-      <w:proofErr w:type="gramEnd"/>
-      <w:r>
-        <w:rPr>
-          <w:sz w:val="21"/>
-          <w:szCs w:val="21"/>
-        </w:rPr>
-        <w:t xml:space="preserve">) y los valores del </w:t>
-      </w:r>
-      <w:proofErr w:type="spellStart"/>
-      <w:r>
-        <w:rPr>
-          <w:sz w:val="21"/>
-          <w:szCs w:val="21"/>
-        </w:rPr>
-        <w:t>Enum</w:t>
-      </w:r>
-      <w:proofErr w:type="spellEnd"/>
-      <w:r>
-        <w:rPr>
-          <w:sz w:val="21"/>
-          <w:szCs w:val="21"/>
-        </w:rPr>
-        <w:t xml:space="preserve"> establecen un orden de prioridad entre las recomendaciones.</w:t>
+        <w:t>recommendation(</w:t>
+      </w:r>
+      <w:proofErr w:type="gramEnd"/>
+      <w:r>
+        <w:rPr>
+          <w:sz w:val="21"/>
+          <w:szCs w:val="21"/>
+        </w:rPr>
+        <w:t>) y los valores del Enum establecen un orden de prioridad entre las recomendaciones.</w:t>
       </w:r>
       <w:r>
         <w:rPr>
@@ -2972,22 +2513,13 @@
         </w:rPr>
         <w:t xml:space="preserve"> El </w:t>
       </w:r>
-      <w:proofErr w:type="spellStart"/>
-      <w:proofErr w:type="gramStart"/>
-      <w:r>
-        <w:rPr>
-          <w:sz w:val="21"/>
-          <w:szCs w:val="21"/>
-        </w:rPr>
-        <w:t>sorted</w:t>
-      </w:r>
-      <w:proofErr w:type="spellEnd"/>
-      <w:r>
-        <w:rPr>
-          <w:sz w:val="21"/>
-          <w:szCs w:val="21"/>
-        </w:rPr>
-        <w:t>(</w:t>
+      <w:proofErr w:type="gramStart"/>
+      <w:r>
+        <w:rPr>
+          <w:sz w:val="21"/>
+          <w:szCs w:val="21"/>
+        </w:rPr>
+        <w:t>sorted(</w:t>
       </w:r>
       <w:proofErr w:type="gramEnd"/>
       <w:r>
@@ -3011,7 +2543,15 @@
           <w:sz w:val="21"/>
           <w:szCs w:val="21"/>
         </w:rPr>
-        <w:t xml:space="preserve">) los valores se escogerían según el orden de declaración, lo cual haría que el juego sea menos escalable en el futuro y podría introducir errores según el orden que se establezca. Además, el -1 en FULL no se podría tener si pusiéramos todos en </w:t>
+        <w:t xml:space="preserve">) los valores se escogerían según el orden de declaración, lo cual haría que el juego sea menos escalable en </w:t>
+      </w:r>
+      <w:r>
+        <w:rPr>
+          <w:sz w:val="21"/>
+          <w:szCs w:val="21"/>
+        </w:rPr>
+        <w:lastRenderedPageBreak/>
+        <w:t xml:space="preserve">el futuro y podría introducir errores según el orden que se establezca. Además, el -1 en FULL no se podría tener si pusiéramos todos en </w:t>
       </w:r>
       <w:proofErr w:type="gramStart"/>
       <w:r>
@@ -3046,7 +2586,6 @@
           <w:sz w:val="21"/>
           <w:szCs w:val="21"/>
         </w:rPr>
-        <w:lastRenderedPageBreak/>
         <w:t xml:space="preserve">18.  </w:t>
       </w:r>
       <w:r>
@@ -3742,55 +3281,7 @@
           <w:sz w:val="21"/>
           <w:szCs w:val="21"/>
         </w:rPr>
-        <w:t xml:space="preserve"> la victoria no es cosa del tablero, sino de uno de los </w:t>
-      </w:r>
-      <w:proofErr w:type="spellStart"/>
-      <w:r>
-        <w:rPr>
-          <w:sz w:val="21"/>
-          <w:szCs w:val="21"/>
-        </w:rPr>
-        <w:t>players</w:t>
-      </w:r>
-      <w:proofErr w:type="spellEnd"/>
-      <w:r>
-        <w:rPr>
-          <w:sz w:val="21"/>
-          <w:szCs w:val="21"/>
-        </w:rPr>
-        <w:t xml:space="preserve">. Se tiene que generar la clave en función del tablero y del </w:t>
-      </w:r>
-      <w:proofErr w:type="spellStart"/>
-      <w:r>
-        <w:rPr>
-          <w:sz w:val="21"/>
-          <w:szCs w:val="21"/>
-        </w:rPr>
-        <w:t>player</w:t>
-      </w:r>
-      <w:proofErr w:type="spellEnd"/>
-      <w:r>
-        <w:rPr>
-          <w:sz w:val="21"/>
-          <w:szCs w:val="21"/>
-        </w:rPr>
-        <w:t xml:space="preserve"> al que se quiere dedicar, porque cuando uno gana el otro pierde. Un jugador podría leer de la caché una jugada evaluada para su rival dependiendo de cómo se almacenen las claves. Ahora mismo cada </w:t>
-      </w:r>
-      <w:proofErr w:type="spellStart"/>
-      <w:r>
-        <w:rPr>
-          <w:sz w:val="21"/>
-          <w:szCs w:val="21"/>
-        </w:rPr>
-        <w:t>player</w:t>
-      </w:r>
-      <w:proofErr w:type="spellEnd"/>
-      <w:r>
-        <w:rPr>
-          <w:sz w:val="21"/>
-          <w:szCs w:val="21"/>
-        </w:rPr>
-        <w:t xml:space="preserve"> tiene su </w:t>
+        <w:t xml:space="preserve"> la victoria no es cosa del tablero, sino de uno de los players. Se tiene que generar la clave en función del tablero y del player al que se quiere dedicar, porque cuando uno gana el otro pierde. Un jugador podría leer de la caché una jugada evaluada para su rival dependiendo de cómo se almacenen las claves. Ahora mismo cada player tiene su </w:t>
       </w:r>
       <w:proofErr w:type="gramStart"/>
       <w:r>
@@ -3841,23 +3332,7 @@
           <w:sz w:val="21"/>
           <w:szCs w:val="21"/>
         </w:rPr>
-        <w:t xml:space="preserve">Qué diferencia hay entre el oráculo </w:t>
-      </w:r>
-      <w:proofErr w:type="spellStart"/>
-      <w:r>
-        <w:rPr>
-          <w:sz w:val="21"/>
-          <w:szCs w:val="21"/>
-        </w:rPr>
-        <w:t>memoizado</w:t>
-      </w:r>
-      <w:proofErr w:type="spellEnd"/>
-      <w:r>
-        <w:rPr>
-          <w:sz w:val="21"/>
-          <w:szCs w:val="21"/>
-        </w:rPr>
-        <w:t xml:space="preserve"> y el que aprende, si los dos usan el mismo diccionario?</w:t>
+        <w:t>Qué diferencia hay entre el oráculo memoizado y el que aprende, si los dos usan el mismo diccionario?</w:t>
       </w:r>
     </w:p>
     <w:p>
@@ -3870,62 +3345,22 @@
           <w:sz w:val="21"/>
           <w:szCs w:val="21"/>
         </w:rPr>
-        <w:t xml:space="preserve">El oráculo </w:t>
-      </w:r>
-      <w:proofErr w:type="spellStart"/>
-      <w:r>
-        <w:rPr>
-          <w:sz w:val="21"/>
-          <w:szCs w:val="21"/>
-        </w:rPr>
-        <w:t>LearningOracle</w:t>
-      </w:r>
-      <w:proofErr w:type="spellEnd"/>
-      <w:r>
-        <w:rPr>
-          <w:sz w:val="21"/>
-          <w:szCs w:val="21"/>
-        </w:rPr>
-        <w:t xml:space="preserve"> hereda del </w:t>
-      </w:r>
-      <w:proofErr w:type="spellStart"/>
-      <w:r>
-        <w:rPr>
-          <w:sz w:val="21"/>
-          <w:szCs w:val="21"/>
-        </w:rPr>
-        <w:t>MemoizationOracle</w:t>
-      </w:r>
-      <w:proofErr w:type="spellEnd"/>
-      <w:r>
-        <w:rPr>
-          <w:sz w:val="21"/>
-          <w:szCs w:val="21"/>
-        </w:rPr>
-        <w:t xml:space="preserve">. El </w:t>
-      </w:r>
-      <w:proofErr w:type="spellStart"/>
-      <w:r>
-        <w:rPr>
-          <w:sz w:val="21"/>
-          <w:szCs w:val="21"/>
-        </w:rPr>
-        <w:t>memoizador</w:t>
-      </w:r>
-      <w:proofErr w:type="spellEnd"/>
-      <w:r>
-        <w:rPr>
-          <w:sz w:val="21"/>
-          <w:szCs w:val="21"/>
-        </w:rPr>
-        <w:t xml:space="preserve"> inicializa un diccionario con las recomendaciones</w:t>
-      </w:r>
-      <w:r>
-        <w:rPr>
-          <w:sz w:val="21"/>
-          <w:szCs w:val="21"/>
-        </w:rPr>
-        <w:t xml:space="preserve"> y el aprendedor evalúa jugadas BAD, evitando que se recomienden al mismo nivel que un MAYBE y habilitando el aprendizaje.</w:t>
+        <w:t>El oráculo LearningOracle hereda del MemoizationOracle. El memoizador inicializa un diccionario con las recomendaciones</w:t>
+      </w:r>
+      <w:r>
+        <w:rPr>
+          <w:sz w:val="21"/>
+          <w:szCs w:val="21"/>
+        </w:rPr>
+        <w:t xml:space="preserve"> y el aprendedor evalúa jugadas BAD, evitando que se recomienden al mismo nivel que </w:t>
+      </w:r>
+      <w:r>
+        <w:rPr>
+          <w:sz w:val="21"/>
+          <w:szCs w:val="21"/>
+        </w:rPr>
+        <w:lastRenderedPageBreak/>
+        <w:t>un MAYBE y habilitando el aprendizaje.</w:t>
       </w:r>
       <w:r>
         <w:rPr>
@@ -3948,23 +3383,14 @@
           <w:sz w:val="21"/>
           <w:szCs w:val="21"/>
         </w:rPr>
-        <w:t xml:space="preserve"> lo único que aporta por sí mismo el </w:t>
-      </w:r>
-      <w:proofErr w:type="spellStart"/>
-      <w:r>
-        <w:rPr>
-          <w:sz w:val="21"/>
-          <w:szCs w:val="21"/>
-        </w:rPr>
-        <w:t>memoizado</w:t>
-      </w:r>
-      <w:proofErr w:type="spellEnd"/>
-      <w:r>
-        <w:rPr>
-          <w:sz w:val="21"/>
-          <w:szCs w:val="21"/>
-        </w:rPr>
-        <w:t xml:space="preserve"> es potencialmente rendimiento, pero su utilidad está en que es la base del que aprende y éste hereda de “él”.</w:t>
+        <w:t xml:space="preserve"> lo único que aporta por sí mismo el memoizado es potencialmente rendimiento, pero su utilidad está en que es la base del que aprende y éste hereda de “él”.</w:t>
+      </w:r>
+      <w:r>
+        <w:rPr>
+          <w:sz w:val="21"/>
+          <w:szCs w:val="21"/>
+        </w:rPr>
+        <w:t xml:space="preserve"> Vaya, que el que aprende usa la caché heredada del memorizador para guardar sus tableros y sus clasificaciones.</w:t>
       </w:r>
     </w:p>
     <w:p>
@@ -3983,7 +3409,6 @@
           <w:sz w:val="21"/>
           <w:szCs w:val="21"/>
         </w:rPr>
-        <w:lastRenderedPageBreak/>
         <w:t xml:space="preserve">21.  </w:t>
       </w:r>
       <w:r>
@@ -4015,39 +3440,7 @@
           <w:sz w:val="21"/>
           <w:szCs w:val="21"/>
         </w:rPr>
-        <w:t xml:space="preserve">orque la primera jugada que se evalúa es la última que es </w:t>
-      </w:r>
-      <w:proofErr w:type="spellStart"/>
-      <w:r>
-        <w:rPr>
-          <w:sz w:val="21"/>
-          <w:szCs w:val="21"/>
-        </w:rPr>
-        <w:t>last_move</w:t>
-      </w:r>
-      <w:proofErr w:type="spellEnd"/>
-      <w:r>
-        <w:rPr>
-          <w:sz w:val="21"/>
-          <w:szCs w:val="21"/>
-        </w:rPr>
-        <w:t xml:space="preserve">, y </w:t>
-      </w:r>
-      <w:proofErr w:type="spellStart"/>
-      <w:r>
-        <w:rPr>
-          <w:sz w:val="21"/>
-          <w:szCs w:val="21"/>
-        </w:rPr>
-        <w:t>back_track</w:t>
-      </w:r>
-      <w:proofErr w:type="spellEnd"/>
-      <w:r>
-        <w:rPr>
-          <w:sz w:val="21"/>
-          <w:szCs w:val="21"/>
-        </w:rPr>
-        <w:t xml:space="preserve"> la recorre desde ese movimiento. La jugada que está justo antes de la derrota es la que lleva a la derrota, y la de antes la que lleva a esa.</w:t>
+        <w:t>orque la primera jugada que se evalúa es la última que es last_move, y back_track la recorre desde ese movimiento. La jugada que está justo antes de la derrota es la que lleva a la derrota, y la de antes la que lleva a esa.</w:t>
       </w:r>
     </w:p>
     <w:p>
@@ -4068,87 +3461,23 @@
           <w:sz w:val="21"/>
           <w:szCs w:val="21"/>
         </w:rPr>
-        <w:t xml:space="preserve"> El bucle se para cuando hay una situación potencial de WIN o MAYBE, así se define en </w:t>
-      </w:r>
-      <w:proofErr w:type="spellStart"/>
-      <w:r>
-        <w:rPr>
-          <w:sz w:val="21"/>
-          <w:szCs w:val="21"/>
-        </w:rPr>
-        <w:t>BaseOracle.full_or_</w:t>
-      </w:r>
-      <w:proofErr w:type="gramStart"/>
-      <w:r>
-        <w:rPr>
-          <w:sz w:val="21"/>
-          <w:szCs w:val="21"/>
-        </w:rPr>
-        <w:t>win</w:t>
-      </w:r>
-      <w:proofErr w:type="spellEnd"/>
-      <w:r>
-        <w:rPr>
-          <w:sz w:val="21"/>
-          <w:szCs w:val="21"/>
-        </w:rPr>
-        <w:t>(</w:t>
-      </w:r>
-      <w:proofErr w:type="gramEnd"/>
-      <w:r>
-        <w:rPr>
-          <w:sz w:val="21"/>
-          <w:szCs w:val="21"/>
-        </w:rPr>
-        <w:t xml:space="preserve">) (que daría false en esa situación, por lo que en el </w:t>
-      </w:r>
-      <w:proofErr w:type="spellStart"/>
-      <w:r>
-        <w:rPr>
-          <w:sz w:val="21"/>
-          <w:szCs w:val="21"/>
-        </w:rPr>
-        <w:t>if</w:t>
-      </w:r>
-      <w:proofErr w:type="spellEnd"/>
-      <w:r>
-        <w:rPr>
-          <w:sz w:val="21"/>
-          <w:szCs w:val="21"/>
-        </w:rPr>
-        <w:t xml:space="preserve"> de </w:t>
-      </w:r>
-      <w:proofErr w:type="spellStart"/>
-      <w:r>
-        <w:rPr>
-          <w:sz w:val="21"/>
-          <w:szCs w:val="21"/>
-        </w:rPr>
-        <w:t>LearningOracle.back_track</w:t>
-      </w:r>
-      <w:proofErr w:type="spellEnd"/>
-      <w:r>
-        <w:rPr>
-          <w:sz w:val="21"/>
-          <w:szCs w:val="21"/>
-        </w:rPr>
-        <w:t xml:space="preserve"> que condiciona al fin del bucle se niega con </w:t>
-      </w:r>
-      <w:proofErr w:type="spellStart"/>
-      <w:r>
-        <w:rPr>
-          <w:sz w:val="21"/>
-          <w:szCs w:val="21"/>
-        </w:rPr>
-        <w:t>not</w:t>
-      </w:r>
-      <w:proofErr w:type="spellEnd"/>
-      <w:r>
-        <w:rPr>
-          <w:sz w:val="21"/>
-          <w:szCs w:val="21"/>
-        </w:rPr>
-        <w:t xml:space="preserve"> y lleva al break).</w:t>
+        <w:t xml:space="preserve"> El bucle se para cuando hay una situación potencial de WIN o MAYBE, así se define en BaseOracle.full_or_</w:t>
+      </w:r>
+      <w:proofErr w:type="gramStart"/>
+      <w:r>
+        <w:rPr>
+          <w:sz w:val="21"/>
+          <w:szCs w:val="21"/>
+        </w:rPr>
+        <w:t>win(</w:t>
+      </w:r>
+      <w:proofErr w:type="gramEnd"/>
+      <w:r>
+        <w:rPr>
+          <w:sz w:val="21"/>
+          <w:szCs w:val="21"/>
+        </w:rPr>
+        <w:t>) (que daría false en esa situación, por lo que en el if de LearningOracle.back_track que condiciona al fin del bucle se niega con not y lleva al break).</w:t>
       </w:r>
     </w:p>
     <w:p>
@@ -4181,45 +3510,107 @@
       <w:pPr>
         <w:spacing w:after="200" w:line="300" w:lineRule="auto"/>
         <w:ind w:left="420" w:hanging="420"/>
-      </w:pPr>
-      <w:r>
-        <w:rPr>
-          <w:sz w:val="21"/>
-          <w:szCs w:val="21"/>
-        </w:rPr>
-        <w:t xml:space="preserve">Es intencionado, porque se presupone que la última jugada es la mayor responsable de la derrota, lo cual es bastante intuitivo. Además, si esa no se marca como BAD, podría potencialmente tomarse como MAYBE o recomendación potencialmente válida para posibles jugadas, por lo que el oráculo no aprendería. Si no se marca como BAD el oráculo no puede aprender, y entonces </w:t>
-      </w:r>
-      <w:proofErr w:type="spellStart"/>
-      <w:r>
-        <w:rPr>
-          <w:sz w:val="21"/>
-          <w:szCs w:val="21"/>
-        </w:rPr>
-        <w:t>to_bad</w:t>
-      </w:r>
-      <w:proofErr w:type="spellEnd"/>
-      <w:r>
-        <w:rPr>
-          <w:sz w:val="21"/>
-          <w:szCs w:val="21"/>
-        </w:rPr>
-        <w:t xml:space="preserve"> y </w:t>
-      </w:r>
-      <w:proofErr w:type="spellStart"/>
-      <w:r>
-        <w:rPr>
-          <w:sz w:val="21"/>
-          <w:szCs w:val="21"/>
-        </w:rPr>
-        <w:t>back_track</w:t>
-      </w:r>
-      <w:proofErr w:type="spellEnd"/>
-      <w:r>
-        <w:rPr>
-          <w:sz w:val="21"/>
-          <w:szCs w:val="21"/>
-        </w:rPr>
-        <w:t xml:space="preserve"> no sirven para nada.</w:t>
+        <w:rPr>
+          <w:sz w:val="21"/>
+          <w:szCs w:val="21"/>
+        </w:rPr>
+      </w:pPr>
+      <w:r>
+        <w:rPr>
+          <w:sz w:val="21"/>
+          <w:szCs w:val="21"/>
+        </w:rPr>
+        <w:t xml:space="preserve">Depende de a lo que se refiera la pregunta con “última jugada de la partida”. </w:t>
+      </w:r>
+      <w:r>
+        <w:rPr>
+          <w:sz w:val="21"/>
+          <w:szCs w:val="21"/>
+        </w:rPr>
+        <w:t>Si se refiere a la última decisión del jugador, e</w:t>
+      </w:r>
+      <w:r>
+        <w:rPr>
+          <w:sz w:val="21"/>
+          <w:szCs w:val="21"/>
+        </w:rPr>
+        <w:t>s intencionado, porque se presupone que la última jugada es la mayor responsable de la derrota, lo cual es bastante intuitivo. Además, si esa no se marca como BAD, podría potencialmente tomarse como MAYBE o recomendación potencialmente válida para posibles jugadas, por lo que el oráculo no aprendería. Si no se marca como BAD el oráculo no puede aprender, y entonces to_bad y back_track no sirven para nada.</w:t>
+      </w:r>
+    </w:p>
+    <w:p>
+      <w:pPr>
+        <w:spacing w:after="200" w:line="300" w:lineRule="auto"/>
+        <w:ind w:left="420" w:hanging="420"/>
+      </w:pPr>
+      <w:r>
+        <w:rPr>
+          <w:sz w:val="21"/>
+          <w:szCs w:val="21"/>
+        </w:rPr>
+        <w:t>Por otro lado</w:t>
+      </w:r>
+      <w:r>
+        <w:rPr>
+          <w:sz w:val="21"/>
+          <w:szCs w:val="21"/>
+        </w:rPr>
+        <w:t>,</w:t>
+      </w:r>
+      <w:r>
+        <w:rPr>
+          <w:sz w:val="21"/>
+          <w:szCs w:val="21"/>
+        </w:rPr>
+        <w:t xml:space="preserve"> si con última jugada esta pregunta se refiere a literalmente la jugada ganadora del oponente, que es la que se almacenaba antes de modificarlo yo, sí que puede ser un error, ya que no puede ser usado por el oráculo del perdedor, no es su jugada. Se almacena la jugada del oponente, no la suya</w:t>
+      </w:r>
+      <w:r>
+        <w:rPr>
+          <w:sz w:val="21"/>
+          <w:szCs w:val="21"/>
+        </w:rPr>
+        <w:t>, así que como nunca se va a simular esa jugada ni se va a poder aplicar el ejemplo concreto, entre otras cosas, no funciona</w:t>
+      </w:r>
+      <w:r>
+        <w:rPr>
+          <w:sz w:val="21"/>
+          <w:szCs w:val="21"/>
+        </w:rPr>
+        <w:t>.</w:t>
+      </w:r>
+      <w:r>
+        <w:rPr>
+          <w:sz w:val="21"/>
+          <w:szCs w:val="21"/>
+        </w:rPr>
+        <w:t xml:space="preserve"> La solución, como digo en la 30, es almacenar </w:t>
+      </w:r>
+      <w:r>
+        <w:rPr>
+          <w:sz w:val="21"/>
+          <w:szCs w:val="21"/>
+        </w:rPr>
+        <w:t xml:space="preserve">el último move </w:t>
+      </w:r>
+      <w:r>
+        <w:rPr>
+          <w:sz w:val="21"/>
+          <w:szCs w:val="21"/>
+        </w:rPr>
+        <w:t>del player, no la última jugada del tablero cuando pierde, porque esa obviamente es del rival</w:t>
+      </w:r>
+      <w:r>
+        <w:rPr>
+          <w:sz w:val="21"/>
+          <w:szCs w:val="21"/>
+        </w:rPr>
+        <w:t xml:space="preserve"> y después de eso no se puede jugar</w:t>
+      </w:r>
+      <w:r>
+        <w:rPr>
+          <w:sz w:val="21"/>
+          <w:szCs w:val="21"/>
+        </w:rPr>
+        <w:t>.</w:t>
       </w:r>
     </w:p>
     <w:p>
@@ -4362,103 +3753,30 @@
           <w:sz w:val="21"/>
           <w:szCs w:val="21"/>
         </w:rPr>
-        <w:t xml:space="preserve">l único método </w:t>
-      </w:r>
-      <w:proofErr w:type="spellStart"/>
-      <w:r>
-        <w:rPr>
-          <w:sz w:val="21"/>
-          <w:szCs w:val="21"/>
-        </w:rPr>
-        <w:t>sobreescrito</w:t>
-      </w:r>
-      <w:proofErr w:type="spellEnd"/>
-      <w:r>
-        <w:rPr>
-          <w:sz w:val="21"/>
-          <w:szCs w:val="21"/>
-        </w:rPr>
-        <w:t xml:space="preserve"> es _</w:t>
-      </w:r>
-      <w:proofErr w:type="spellStart"/>
-      <w:r>
-        <w:rPr>
-          <w:sz w:val="21"/>
-          <w:szCs w:val="21"/>
-        </w:rPr>
-        <w:t>ask_</w:t>
-      </w:r>
-      <w:proofErr w:type="gramStart"/>
-      <w:r>
-        <w:rPr>
-          <w:sz w:val="21"/>
-          <w:szCs w:val="21"/>
-        </w:rPr>
-        <w:t>oracle</w:t>
-      </w:r>
-      <w:proofErr w:type="spellEnd"/>
-      <w:r>
-        <w:rPr>
-          <w:sz w:val="21"/>
-          <w:szCs w:val="21"/>
-        </w:rPr>
-        <w:t>(</w:t>
-      </w:r>
-      <w:proofErr w:type="gramEnd"/>
-      <w:r>
-        <w:rPr>
-          <w:sz w:val="21"/>
-          <w:szCs w:val="21"/>
-        </w:rPr>
-        <w:t xml:space="preserve">), porque el oráculo del </w:t>
-      </w:r>
-      <w:proofErr w:type="spellStart"/>
-      <w:r>
-        <w:rPr>
-          <w:sz w:val="21"/>
-          <w:szCs w:val="21"/>
-        </w:rPr>
-        <w:t>HumanPlayer</w:t>
-      </w:r>
-      <w:proofErr w:type="spellEnd"/>
-      <w:r>
-        <w:rPr>
-          <w:sz w:val="21"/>
-          <w:szCs w:val="21"/>
-        </w:rPr>
-        <w:t xml:space="preserve"> es el propio jugador humano, así que se pide el input. El resto del programa funciona correctamente porque el input está vigilado para que respete el tipo y rango, y posteriormente se adapta para que el valor sea de la clase </w:t>
-      </w:r>
-      <w:proofErr w:type="spellStart"/>
-      <w:r>
-        <w:rPr>
-          <w:sz w:val="21"/>
-          <w:szCs w:val="21"/>
-        </w:rPr>
-        <w:t>ColumnRecommendations</w:t>
-      </w:r>
-      <w:proofErr w:type="spellEnd"/>
-      <w:r>
-        <w:rPr>
-          <w:sz w:val="21"/>
-          <w:szCs w:val="21"/>
-        </w:rPr>
-        <w:t xml:space="preserve"> con la plantilla de </w:t>
-      </w:r>
-      <w:proofErr w:type="spellStart"/>
-      <w:r>
-        <w:rPr>
-          <w:sz w:val="21"/>
-          <w:szCs w:val="21"/>
-        </w:rPr>
-        <w:t>Player.play</w:t>
-      </w:r>
-      <w:proofErr w:type="spellEnd"/>
-      <w:r>
-        <w:rPr>
-          <w:sz w:val="21"/>
-          <w:szCs w:val="21"/>
-        </w:rPr>
-        <w:t>().</w:t>
+        <w:t>l único método sobreescrito es _ask_</w:t>
+      </w:r>
+      <w:proofErr w:type="gramStart"/>
+      <w:r>
+        <w:rPr>
+          <w:sz w:val="21"/>
+          <w:szCs w:val="21"/>
+        </w:rPr>
+        <w:t>oracle(</w:t>
+      </w:r>
+      <w:proofErr w:type="gramEnd"/>
+      <w:r>
+        <w:rPr>
+          <w:sz w:val="21"/>
+          <w:szCs w:val="21"/>
+        </w:rPr>
+        <w:t>), porque el oráculo del HumanPlayer es el propio jugador humano, así que se pide el input. El resto del programa funciona correctamente porque el input está vigilado para que respete el tipo y rango, y posteriormente se adapta para que el valor sea de la clase ColumnRecommendations</w:t>
+      </w:r>
+      <w:r>
+        <w:rPr>
+          <w:sz w:val="21"/>
+          <w:szCs w:val="21"/>
+        </w:rPr>
+        <w:t xml:space="preserve"> con la plantilla de Player.play().</w:t>
       </w:r>
     </w:p>
     <w:p>
@@ -4477,6 +3795,7 @@
           <w:sz w:val="21"/>
           <w:szCs w:val="21"/>
         </w:rPr>
+        <w:lastRenderedPageBreak/>
         <w:t xml:space="preserve">25.  </w:t>
       </w:r>
       <w:r>
@@ -4484,23 +3803,7 @@
           <w:sz w:val="21"/>
           <w:szCs w:val="21"/>
         </w:rPr>
-        <w:t xml:space="preserve">El método que pide la columna al humano devuelve una recomendación con la clasificación a </w:t>
-      </w:r>
-      <w:proofErr w:type="spellStart"/>
-      <w:r>
-        <w:rPr>
-          <w:sz w:val="21"/>
-          <w:szCs w:val="21"/>
-        </w:rPr>
-        <w:t>None</w:t>
-      </w:r>
-      <w:proofErr w:type="spellEnd"/>
-      <w:r>
-        <w:rPr>
-          <w:sz w:val="21"/>
-          <w:szCs w:val="21"/>
-        </w:rPr>
-        <w:t>. ¿Por qué no se le asigna una clasificación real?</w:t>
+        <w:t>El método que pide la columna al humano devuelve una recomendación con la clasificación a None. ¿Por qué no se le asigna una clasificación real?</w:t>
       </w:r>
     </w:p>
     <w:p>
@@ -4575,22 +3878,13 @@
         </w:rPr>
         <w:t xml:space="preserve">Las jugadas podrían ser siempre las mismas porque </w:t>
       </w:r>
-      <w:proofErr w:type="spellStart"/>
-      <w:proofErr w:type="gramStart"/>
-      <w:r>
-        <w:rPr>
-          <w:sz w:val="21"/>
-          <w:szCs w:val="21"/>
-        </w:rPr>
-        <w:t>sorted</w:t>
-      </w:r>
-      <w:proofErr w:type="spellEnd"/>
-      <w:r>
-        <w:rPr>
-          <w:sz w:val="21"/>
-          <w:szCs w:val="21"/>
-        </w:rPr>
-        <w:t>(</w:t>
+      <w:proofErr w:type="gramStart"/>
+      <w:r>
+        <w:rPr>
+          <w:sz w:val="21"/>
+          <w:szCs w:val="21"/>
+        </w:rPr>
+        <w:t>sorted(</w:t>
       </w:r>
       <w:proofErr w:type="gramEnd"/>
       <w:r>
@@ -4617,7 +3911,6 @@
           <w:sz w:val="21"/>
           <w:szCs w:val="21"/>
         </w:rPr>
-        <w:lastRenderedPageBreak/>
         <w:t xml:space="preserve">27.  </w:t>
       </w:r>
       <w:r>
@@ -4633,25 +3926,7 @@
           <w:sz w:val="21"/>
           <w:szCs w:val="21"/>
         </w:rPr>
-        <w:t>__</w:t>
-      </w:r>
-      <w:proofErr w:type="spellStart"/>
-      <w:r>
-        <w:rPr>
-          <w:rFonts w:ascii="Consolas" w:eastAsia="Consolas" w:hAnsi="Consolas" w:cs="Consolas"/>
-          <w:sz w:val="21"/>
-          <w:szCs w:val="21"/>
-        </w:rPr>
-        <w:t>eq</w:t>
-      </w:r>
-      <w:proofErr w:type="spellEnd"/>
-      <w:r>
-        <w:rPr>
-          <w:rFonts w:ascii="Consolas" w:eastAsia="Consolas" w:hAnsi="Consolas" w:cs="Consolas"/>
-          <w:sz w:val="21"/>
-          <w:szCs w:val="21"/>
-        </w:rPr>
-        <w:t>__</w:t>
+        <w:t>__eq__</w:t>
       </w:r>
       <w:r>
         <w:rPr>
@@ -4689,23 +3964,7 @@
           <w:sz w:val="21"/>
           <w:szCs w:val="21"/>
         </w:rPr>
-        <w:t>en la comparación a la que alude este __</w:t>
-      </w:r>
-      <w:proofErr w:type="spellStart"/>
-      <w:r>
-        <w:rPr>
-          <w:sz w:val="21"/>
-          <w:szCs w:val="21"/>
-        </w:rPr>
-        <w:t>eq</w:t>
-      </w:r>
-      <w:proofErr w:type="spellEnd"/>
-      <w:r>
-        <w:rPr>
-          <w:sz w:val="21"/>
-          <w:szCs w:val="21"/>
-        </w:rPr>
-        <w:t>__ es que</w:t>
+        <w:t>en la comparación a la que alude este __eq__ es que</w:t>
       </w:r>
       <w:r>
         <w:rPr>
@@ -4714,7 +3973,6 @@
         </w:rPr>
         <w:t xml:space="preserve"> al comparar dos recomendaciones sólo comparemos el valor de ambas, de modo que el índice no interviene al momento de calcular si son diferentes (lo que podría introducir un sesgo que haría que el oráculo fuera predecible, no tendría sentido el </w:t>
       </w:r>
-      <w:proofErr w:type="spellStart"/>
       <w:proofErr w:type="gramStart"/>
       <w:r>
         <w:rPr>
@@ -4723,30 +3981,13 @@
         </w:rPr>
         <w:t>random.choice</w:t>
       </w:r>
-      <w:proofErr w:type="spellEnd"/>
-      <w:proofErr w:type="gramEnd"/>
-      <w:r>
-        <w:rPr>
-          <w:sz w:val="21"/>
-          <w:szCs w:val="21"/>
-        </w:rPr>
-        <w:t xml:space="preserve"> porque no funcionaría la condición). El contrato que se rompe es que el índice sí se </w:t>
-      </w:r>
-      <w:proofErr w:type="spellStart"/>
-      <w:r>
-        <w:rPr>
-          <w:sz w:val="21"/>
-          <w:szCs w:val="21"/>
-        </w:rPr>
-        <w:t>hashea</w:t>
-      </w:r>
-      <w:proofErr w:type="spellEnd"/>
-      <w:r>
-        <w:rPr>
-          <w:sz w:val="21"/>
-          <w:szCs w:val="21"/>
-        </w:rPr>
-        <w:t xml:space="preserve"> de todas formas en __hash__.</w:t>
+      <w:proofErr w:type="gramEnd"/>
+      <w:r>
+        <w:rPr>
+          <w:sz w:val="21"/>
+          <w:szCs w:val="21"/>
+        </w:rPr>
+        <w:t xml:space="preserve"> porque no funcionaría la condición). El contrato que se rompe es que el índice sí se hashea de todas formas en __hash__.</w:t>
       </w:r>
     </w:p>
     <w:p>
@@ -4789,39 +4030,7 @@
           <w:sz w:val="21"/>
           <w:szCs w:val="21"/>
         </w:rPr>
-        <w:t xml:space="preserve">Es un </w:t>
-      </w:r>
-      <w:proofErr w:type="spellStart"/>
-      <w:r>
-        <w:rPr>
-          <w:sz w:val="21"/>
-          <w:szCs w:val="21"/>
-        </w:rPr>
-        <w:t>hook</w:t>
-      </w:r>
-      <w:proofErr w:type="spellEnd"/>
-      <w:r>
-        <w:rPr>
-          <w:sz w:val="21"/>
-          <w:szCs w:val="21"/>
-        </w:rPr>
-        <w:t xml:space="preserve"> que permite </w:t>
-      </w:r>
-      <w:proofErr w:type="spellStart"/>
-      <w:r>
-        <w:rPr>
-          <w:sz w:val="21"/>
-          <w:szCs w:val="21"/>
-        </w:rPr>
-        <w:t>sobreescribir</w:t>
-      </w:r>
-      <w:proofErr w:type="spellEnd"/>
-      <w:r>
-        <w:rPr>
-          <w:sz w:val="21"/>
-          <w:szCs w:val="21"/>
-        </w:rPr>
-        <w:t xml:space="preserve"> el método</w:t>
+        <w:t>Es un hook que permite sobreescribir el método</w:t>
       </w:r>
       <w:r>
         <w:rPr>
@@ -4842,95 +4051,31 @@
           <w:sz w:val="21"/>
           <w:szCs w:val="21"/>
         </w:rPr>
-        <w:t xml:space="preserve"> Eso si esta pregunta se refiere a _</w:t>
-      </w:r>
-      <w:proofErr w:type="spellStart"/>
-      <w:r>
-        <w:rPr>
-          <w:sz w:val="21"/>
-          <w:szCs w:val="21"/>
-        </w:rPr>
-        <w:t>on_</w:t>
-      </w:r>
-      <w:proofErr w:type="gramStart"/>
-      <w:r>
-        <w:rPr>
-          <w:sz w:val="21"/>
-          <w:szCs w:val="21"/>
-        </w:rPr>
-        <w:t>lose</w:t>
-      </w:r>
-      <w:proofErr w:type="spellEnd"/>
-      <w:r>
-        <w:rPr>
-          <w:sz w:val="21"/>
-          <w:szCs w:val="21"/>
-        </w:rPr>
-        <w:t>(</w:t>
-      </w:r>
-      <w:proofErr w:type="gramEnd"/>
-      <w:r>
-        <w:rPr>
-          <w:sz w:val="21"/>
-          <w:szCs w:val="21"/>
-        </w:rPr>
-        <w:t xml:space="preserve">), que en este caso es </w:t>
-      </w:r>
-      <w:proofErr w:type="spellStart"/>
-      <w:r>
-        <w:rPr>
-          <w:sz w:val="21"/>
-          <w:szCs w:val="21"/>
-        </w:rPr>
-        <w:t>sobreescrita</w:t>
-      </w:r>
-      <w:proofErr w:type="spellEnd"/>
-      <w:r>
-        <w:rPr>
-          <w:sz w:val="21"/>
-          <w:szCs w:val="21"/>
-        </w:rPr>
-        <w:t xml:space="preserve"> por </w:t>
-      </w:r>
-      <w:proofErr w:type="spellStart"/>
-      <w:r>
-        <w:rPr>
-          <w:sz w:val="21"/>
-          <w:szCs w:val="21"/>
-        </w:rPr>
-        <w:t>ReportingPlayer</w:t>
-      </w:r>
-      <w:proofErr w:type="spellEnd"/>
-      <w:r>
-        <w:rPr>
-          <w:sz w:val="21"/>
-          <w:szCs w:val="21"/>
-        </w:rPr>
-        <w:t xml:space="preserve">, que llama a su oráculo y hace que el oráculo haga </w:t>
-      </w:r>
-      <w:proofErr w:type="spellStart"/>
-      <w:r>
-        <w:rPr>
-          <w:sz w:val="21"/>
-          <w:szCs w:val="21"/>
-        </w:rPr>
-        <w:t>LearningOracle.back_</w:t>
-      </w:r>
-      <w:proofErr w:type="gramStart"/>
-      <w:r>
-        <w:rPr>
-          <w:sz w:val="21"/>
-          <w:szCs w:val="21"/>
-        </w:rPr>
-        <w:t>track</w:t>
-      </w:r>
-      <w:proofErr w:type="spellEnd"/>
-      <w:r>
-        <w:rPr>
-          <w:sz w:val="21"/>
-          <w:szCs w:val="21"/>
-        </w:rPr>
-        <w:t>(</w:t>
+        <w:t xml:space="preserve"> Eso si esta pregunta se refiere a _on_</w:t>
+      </w:r>
+      <w:proofErr w:type="gramStart"/>
+      <w:r>
+        <w:rPr>
+          <w:sz w:val="21"/>
+          <w:szCs w:val="21"/>
+        </w:rPr>
+        <w:t>lose(</w:t>
+      </w:r>
+      <w:proofErr w:type="gramEnd"/>
+      <w:r>
+        <w:rPr>
+          <w:sz w:val="21"/>
+          <w:szCs w:val="21"/>
+        </w:rPr>
+        <w:t>), que en este caso es sobreescrita por ReportingPlayer, que llama a su oráculo y hace que el oráculo haga LearningOracle.back_</w:t>
+      </w:r>
+      <w:proofErr w:type="gramStart"/>
+      <w:r>
+        <w:rPr>
+          <w:sz w:val="21"/>
+          <w:szCs w:val="21"/>
+        </w:rPr>
+        <w:t>track(</w:t>
       </w:r>
       <w:proofErr w:type="gramEnd"/>
       <w:r>
@@ -4945,135 +4090,23 @@
           <w:sz w:val="21"/>
           <w:szCs w:val="21"/>
         </w:rPr>
-        <w:t xml:space="preserve"> cuando se pierde la partida. Si el oráculo no aprende porque no es dificultad difícil, el código no se rompe porque el oráculo base también tiene un </w:t>
-      </w:r>
-      <w:proofErr w:type="spellStart"/>
-      <w:r>
-        <w:rPr>
-          <w:sz w:val="21"/>
-          <w:szCs w:val="21"/>
-        </w:rPr>
-        <w:t>hook</w:t>
-      </w:r>
-      <w:proofErr w:type="spellEnd"/>
-      <w:r>
-        <w:rPr>
-          <w:sz w:val="21"/>
-          <w:szCs w:val="21"/>
-        </w:rPr>
-        <w:t xml:space="preserve"> en </w:t>
-      </w:r>
-      <w:proofErr w:type="spellStart"/>
-      <w:r>
-        <w:rPr>
-          <w:sz w:val="21"/>
-          <w:szCs w:val="21"/>
-        </w:rPr>
-        <w:t>BaseOracle.back_</w:t>
-      </w:r>
-      <w:proofErr w:type="gramStart"/>
-      <w:r>
-        <w:rPr>
-          <w:sz w:val="21"/>
-          <w:szCs w:val="21"/>
-        </w:rPr>
-        <w:t>track</w:t>
-      </w:r>
-      <w:proofErr w:type="spellEnd"/>
-      <w:r>
-        <w:rPr>
-          <w:sz w:val="21"/>
-          <w:szCs w:val="21"/>
-        </w:rPr>
-        <w:t>(</w:t>
-      </w:r>
-      <w:proofErr w:type="gramEnd"/>
-      <w:r>
-        <w:rPr>
-          <w:sz w:val="21"/>
-          <w:szCs w:val="21"/>
-        </w:rPr>
-        <w:t xml:space="preserve">), que no hace nada hasta que </w:t>
-      </w:r>
-      <w:proofErr w:type="spellStart"/>
-      <w:r>
-        <w:rPr>
-          <w:sz w:val="21"/>
-          <w:szCs w:val="21"/>
-        </w:rPr>
-        <w:t>LearningOracle</w:t>
-      </w:r>
-      <w:proofErr w:type="spellEnd"/>
-      <w:r>
-        <w:rPr>
-          <w:sz w:val="21"/>
-          <w:szCs w:val="21"/>
-        </w:rPr>
-        <w:t xml:space="preserve"> lo </w:t>
-      </w:r>
-      <w:proofErr w:type="spellStart"/>
-      <w:r>
-        <w:rPr>
-          <w:sz w:val="21"/>
-          <w:szCs w:val="21"/>
-        </w:rPr>
-        <w:t>sobreescribe</w:t>
-      </w:r>
-      <w:proofErr w:type="spellEnd"/>
-      <w:r>
-        <w:rPr>
-          <w:sz w:val="21"/>
-          <w:szCs w:val="21"/>
-        </w:rPr>
-        <w:t xml:space="preserve">. Entonces este código funciona en realidad para hacer que en dificultad difícil la IA aprenda cuando pierde, pero si no está en esa dificultad el código no se rompe, y para el </w:t>
-      </w:r>
-      <w:proofErr w:type="spellStart"/>
-      <w:r>
-        <w:rPr>
-          <w:sz w:val="21"/>
-          <w:szCs w:val="21"/>
-        </w:rPr>
-        <w:t>HumanPlayer</w:t>
-      </w:r>
-      <w:proofErr w:type="spellEnd"/>
-      <w:r>
-        <w:rPr>
-          <w:sz w:val="21"/>
-          <w:szCs w:val="21"/>
-        </w:rPr>
-        <w:t xml:space="preserve"> por supuesto no pasa nada, porque no </w:t>
-      </w:r>
-      <w:proofErr w:type="spellStart"/>
-      <w:r>
-        <w:rPr>
-          <w:sz w:val="21"/>
-          <w:szCs w:val="21"/>
-        </w:rPr>
-        <w:t>sobreescribe</w:t>
-      </w:r>
-      <w:proofErr w:type="spellEnd"/>
-      <w:r>
-        <w:rPr>
-          <w:sz w:val="21"/>
-          <w:szCs w:val="21"/>
-        </w:rPr>
-        <w:t xml:space="preserve"> el método vacío base. Además, no hay método _</w:t>
-      </w:r>
-      <w:proofErr w:type="spellStart"/>
-      <w:r>
-        <w:rPr>
-          <w:sz w:val="21"/>
-          <w:szCs w:val="21"/>
-        </w:rPr>
-        <w:t>on_win</w:t>
-      </w:r>
-      <w:proofErr w:type="spellEnd"/>
-      <w:r>
-        <w:rPr>
-          <w:sz w:val="21"/>
-          <w:szCs w:val="21"/>
-        </w:rPr>
-        <w:t>, no existe.</w:t>
+        <w:t xml:space="preserve"> cuando se pierde la partida. Si el oráculo no aprende porque no es dificultad difícil, el código no se rompe porque el oráculo base también tiene un hook en BaseOracle.back_</w:t>
+      </w:r>
+      <w:proofErr w:type="gramStart"/>
+      <w:r>
+        <w:rPr>
+          <w:sz w:val="21"/>
+          <w:szCs w:val="21"/>
+        </w:rPr>
+        <w:t>track(</w:t>
+      </w:r>
+      <w:proofErr w:type="gramEnd"/>
+      <w:r>
+        <w:rPr>
+          <w:sz w:val="21"/>
+          <w:szCs w:val="21"/>
+        </w:rPr>
+        <w:t>), que no hace nada hasta que LearningOracle lo sobreescribe. Entonces este código funciona en realidad para hacer que en dificultad difícil la IA aprenda cuando pierde, pero si no está en esa dificultad el código no se rompe, y para el HumanPlayer por supuesto no pasa nada, porque no sobreescribe el método vacío base. Además, no hay método _on_win, no existe.</w:t>
       </w:r>
     </w:p>
     <w:p>
@@ -5087,39 +4120,7 @@
           <w:szCs w:val="21"/>
         </w:rPr>
         <w:tab/>
-        <w:t xml:space="preserve">Si se borrara este </w:t>
-      </w:r>
-      <w:proofErr w:type="spellStart"/>
-      <w:r>
-        <w:rPr>
-          <w:sz w:val="21"/>
-          <w:szCs w:val="21"/>
-        </w:rPr>
-        <w:t>hook</w:t>
-      </w:r>
-      <w:proofErr w:type="spellEnd"/>
-      <w:r>
-        <w:rPr>
-          <w:sz w:val="21"/>
-          <w:szCs w:val="21"/>
-        </w:rPr>
-        <w:t xml:space="preserve">, el programa fallaría si el humano perdiera, porque no </w:t>
-      </w:r>
-      <w:proofErr w:type="spellStart"/>
-      <w:r>
-        <w:rPr>
-          <w:sz w:val="21"/>
-          <w:szCs w:val="21"/>
-        </w:rPr>
-        <w:t>sobreescribe</w:t>
-      </w:r>
-      <w:proofErr w:type="spellEnd"/>
-      <w:r>
-        <w:rPr>
-          <w:sz w:val="21"/>
-          <w:szCs w:val="21"/>
-        </w:rPr>
-        <w:t xml:space="preserve"> el método. </w:t>
+        <w:t xml:space="preserve">Si se borrara este hook, el programa fallaría si el humano perdiera, porque no sobreescribe el método. </w:t>
       </w:r>
     </w:p>
     <w:p>
@@ -5161,7 +4162,6 @@
         </w:rPr>
         <w:t xml:space="preserve">El setter de </w:t>
       </w:r>
-      <w:proofErr w:type="spellStart"/>
       <w:r>
         <w:rPr>
           <w:rFonts w:ascii="Consolas" w:eastAsia="Consolas" w:hAnsi="Consolas" w:cs="Consolas"/>
@@ -5170,7 +4170,6 @@
         </w:rPr>
         <w:t>opponent</w:t>
       </w:r>
-      <w:proofErr w:type="spellEnd"/>
       <w:r>
         <w:rPr>
           <w:sz w:val="21"/>
@@ -5178,7 +4177,6 @@
         </w:rPr>
         <w:t xml:space="preserve"> asigna la relación en los dos sentidos. Explica por qué dentro del setter se escribe en </w:t>
       </w:r>
-      <w:proofErr w:type="spellStart"/>
       <w:proofErr w:type="gramStart"/>
       <w:r>
         <w:rPr>
@@ -5186,46 +4184,33 @@
           <w:sz w:val="21"/>
           <w:szCs w:val="21"/>
         </w:rPr>
-        <w:t>self</w:t>
-      </w:r>
-      <w:proofErr w:type="spellEnd"/>
+        <w:t>self._</w:t>
+      </w:r>
+      <w:proofErr w:type="gramEnd"/>
       <w:r>
         <w:rPr>
           <w:rFonts w:ascii="Consolas" w:eastAsia="Consolas" w:hAnsi="Consolas" w:cs="Consolas"/>
           <w:sz w:val="21"/>
           <w:szCs w:val="21"/>
         </w:rPr>
-        <w:t>._</w:t>
-      </w:r>
-      <w:proofErr w:type="spellStart"/>
-      <w:proofErr w:type="gramEnd"/>
+        <w:t>opponent</w:t>
+      </w:r>
+      <w:r>
+        <w:rPr>
+          <w:sz w:val="21"/>
+          <w:szCs w:val="21"/>
+        </w:rPr>
+        <w:t xml:space="preserve"> y no en </w:t>
+      </w:r>
+      <w:proofErr w:type="gramStart"/>
       <w:r>
         <w:rPr>
           <w:rFonts w:ascii="Consolas" w:eastAsia="Consolas" w:hAnsi="Consolas" w:cs="Consolas"/>
           <w:sz w:val="21"/>
           <w:szCs w:val="21"/>
         </w:rPr>
-        <w:t>opponent</w:t>
-      </w:r>
-      <w:proofErr w:type="spellEnd"/>
-      <w:r>
-        <w:rPr>
-          <w:sz w:val="21"/>
-          <w:szCs w:val="21"/>
-        </w:rPr>
-        <w:t xml:space="preserve"> y no en </w:t>
-      </w:r>
-      <w:proofErr w:type="spellStart"/>
-      <w:proofErr w:type="gramStart"/>
-      <w:r>
-        <w:rPr>
-          <w:rFonts w:ascii="Consolas" w:eastAsia="Consolas" w:hAnsi="Consolas" w:cs="Consolas"/>
-          <w:sz w:val="21"/>
-          <w:szCs w:val="21"/>
-        </w:rPr>
         <w:t>self.opponent</w:t>
       </w:r>
-      <w:proofErr w:type="spellEnd"/>
       <w:proofErr w:type="gramEnd"/>
       <w:r>
         <w:rPr>
@@ -5247,7 +4232,6 @@
         </w:rPr>
         <w:t xml:space="preserve">Porque en </w:t>
       </w:r>
-      <w:proofErr w:type="spellStart"/>
       <w:proofErr w:type="gramStart"/>
       <w:r>
         <w:rPr>
@@ -5263,7 +4247,6 @@
         </w:rPr>
         <w:t>elf.opponent</w:t>
       </w:r>
-      <w:proofErr w:type="spellEnd"/>
       <w:proofErr w:type="gramEnd"/>
       <w:r>
         <w:rPr>
@@ -5288,41 +4271,22 @@
         </w:rPr>
         <w:t xml:space="preserve"> no llama a </w:t>
       </w:r>
-      <w:proofErr w:type="spellStart"/>
-      <w:proofErr w:type="gramStart"/>
-      <w:r>
-        <w:rPr>
-          <w:sz w:val="21"/>
-          <w:szCs w:val="21"/>
-        </w:rPr>
-        <w:t>self</w:t>
-      </w:r>
-      <w:proofErr w:type="spellEnd"/>
-      <w:r>
-        <w:rPr>
-          <w:sz w:val="21"/>
-          <w:szCs w:val="21"/>
-        </w:rPr>
-        <w:t>._</w:t>
-      </w:r>
-      <w:proofErr w:type="spellStart"/>
-      <w:proofErr w:type="gramEnd"/>
-      <w:r>
-        <w:rPr>
-          <w:sz w:val="21"/>
-          <w:szCs w:val="21"/>
-        </w:rPr>
-        <w:t>opponent</w:t>
-      </w:r>
-      <w:proofErr w:type="spellEnd"/>
-      <w:r>
-        <w:rPr>
-          <w:sz w:val="21"/>
-          <w:szCs w:val="21"/>
-        </w:rPr>
-        <w:t xml:space="preserve">, así que para poder escribir en el atributo real hay que escribir directamente. La utilidad de </w:t>
-      </w:r>
-      <w:proofErr w:type="spellStart"/>
+      <w:proofErr w:type="gramStart"/>
+      <w:r>
+        <w:rPr>
+          <w:sz w:val="21"/>
+          <w:szCs w:val="21"/>
+        </w:rPr>
+        <w:t>self._</w:t>
+      </w:r>
+      <w:proofErr w:type="gramEnd"/>
+      <w:r>
+        <w:rPr>
+          <w:sz w:val="21"/>
+          <w:szCs w:val="21"/>
+        </w:rPr>
+        <w:t xml:space="preserve">opponent, así que para poder escribir en el atributo real hay que escribir directamente. La utilidad de </w:t>
+      </w:r>
       <w:proofErr w:type="gramStart"/>
       <w:r>
         <w:rPr>
@@ -5331,7 +4295,6 @@
         </w:rPr>
         <w:t>self.opponent</w:t>
       </w:r>
-      <w:proofErr w:type="spellEnd"/>
       <w:proofErr w:type="gramEnd"/>
       <w:r>
         <w:rPr>
@@ -5340,39 +4303,21 @@
         </w:rPr>
         <w:t xml:space="preserve"> no es escribir manualmente en </w:t>
       </w:r>
-      <w:proofErr w:type="spellStart"/>
-      <w:proofErr w:type="gramStart"/>
-      <w:r>
-        <w:rPr>
-          <w:sz w:val="21"/>
-          <w:szCs w:val="21"/>
-        </w:rPr>
-        <w:t>self</w:t>
-      </w:r>
-      <w:proofErr w:type="spellEnd"/>
-      <w:r>
-        <w:rPr>
-          <w:sz w:val="21"/>
-          <w:szCs w:val="21"/>
-        </w:rPr>
-        <w:t>._</w:t>
-      </w:r>
-      <w:proofErr w:type="spellStart"/>
-      <w:proofErr w:type="gramEnd"/>
-      <w:r>
-        <w:rPr>
-          <w:sz w:val="21"/>
-          <w:szCs w:val="21"/>
-        </w:rPr>
-        <w:t>opponent</w:t>
-      </w:r>
-      <w:proofErr w:type="spellEnd"/>
-      <w:r>
-        <w:rPr>
-          <w:sz w:val="21"/>
-          <w:szCs w:val="21"/>
-        </w:rPr>
-        <w:t>.</w:t>
+      <w:proofErr w:type="gramStart"/>
+      <w:r>
+        <w:rPr>
+          <w:sz w:val="21"/>
+          <w:szCs w:val="21"/>
+        </w:rPr>
+        <w:t>self._</w:t>
+      </w:r>
+      <w:proofErr w:type="gramEnd"/>
+      <w:r>
+        <w:rPr>
+          <w:sz w:val="21"/>
+          <w:szCs w:val="21"/>
+        </w:rPr>
+        <w:t>opponent.</w:t>
       </w:r>
     </w:p>
     <w:p>
@@ -5415,6 +4360,7 @@
           <w:sz w:val="21"/>
           <w:szCs w:val="21"/>
         </w:rPr>
+        <w:lastRenderedPageBreak/>
         <w:t xml:space="preserve">Un error de diseño que SÍ he arreglado en el código es que en </w:t>
       </w:r>
       <w:proofErr w:type="gramStart"/>
@@ -5425,38 +4371,13 @@
         </w:rPr>
         <w:t>Player._</w:t>
       </w:r>
-      <w:proofErr w:type="spellStart"/>
-      <w:proofErr w:type="gramEnd"/>
-      <w:r>
-        <w:rPr>
-          <w:sz w:val="21"/>
-          <w:szCs w:val="21"/>
-        </w:rPr>
-        <w:t>play_on</w:t>
-      </w:r>
-      <w:proofErr w:type="spellEnd"/>
-      <w:r>
-        <w:rPr>
-          <w:sz w:val="21"/>
-          <w:szCs w:val="21"/>
-        </w:rPr>
-        <w:t xml:space="preserve">, el código de tablero que se usa en </w:t>
-      </w:r>
-      <w:proofErr w:type="spellStart"/>
-      <w:r>
-        <w:rPr>
-          <w:sz w:val="21"/>
-          <w:szCs w:val="21"/>
-        </w:rPr>
-        <w:t>back_track</w:t>
-      </w:r>
-      <w:proofErr w:type="spellEnd"/>
-      <w:r>
-        <w:rPr>
-          <w:sz w:val="21"/>
-          <w:szCs w:val="21"/>
-        </w:rPr>
-        <w:t xml:space="preserve"> se guarda después de mover, y no al momento de decidir, así que el oráculo que aprende literalmente no funcionaba. Simplemente he cambiado el orden de dos líneas de código y ya está bien.</w:t>
+      <w:proofErr w:type="gramEnd"/>
+      <w:r>
+        <w:rPr>
+          <w:sz w:val="21"/>
+          <w:szCs w:val="21"/>
+        </w:rPr>
+        <w:t>play_on, el código de tablero que se usa en back_track se guarda después de mover, y no al momento de decidir, así que el oráculo que aprende literalmente no funcionaba. Simplemente he cambiado el orden de dos líneas de código y ya está bien.</w:t>
       </w:r>
     </w:p>
     <w:p>
@@ -5469,7 +4390,6 @@
           <w:lang w:val="en-US"/>
         </w:rPr>
       </w:pPr>
-      <w:proofErr w:type="spellStart"/>
       <w:proofErr w:type="gramStart"/>
       <w:r>
         <w:rPr>
@@ -5477,34 +4397,229 @@
           <w:szCs w:val="21"/>
           <w:lang w:val="en-US"/>
         </w:rPr>
-        <w:t>board.add</w:t>
-      </w:r>
-      <w:proofErr w:type="spellEnd"/>
+        <w:t>board.add(self.char</w:t>
+      </w:r>
+      <w:proofErr w:type="gramEnd"/>
       <w:r>
         <w:rPr>
           <w:sz w:val="21"/>
           <w:szCs w:val="21"/>
           <w:lang w:val="en-US"/>
         </w:rPr>
-        <w:t>(</w:t>
-      </w:r>
-      <w:proofErr w:type="spellStart"/>
-      <w:r>
+        <w:t>, position)</w:t>
+      </w:r>
+    </w:p>
+    <w:p>
+      <w:pPr>
+        <w:spacing w:after="200" w:line="300" w:lineRule="auto"/>
+        <w:ind w:left="420" w:hanging="420"/>
         <w:rPr>
           <w:sz w:val="21"/>
           <w:szCs w:val="21"/>
           <w:lang w:val="en-US"/>
         </w:rPr>
-        <w:t>self.char</w:t>
-      </w:r>
-      <w:proofErr w:type="spellEnd"/>
-      <w:proofErr w:type="gramEnd"/>
+      </w:pPr>
+      <w:proofErr w:type="gramStart"/>
       <w:r>
         <w:rPr>
           <w:sz w:val="21"/>
           <w:szCs w:val="21"/>
           <w:lang w:val="en-US"/>
         </w:rPr>
+        <w:t>self.last</w:t>
+      </w:r>
+      <w:proofErr w:type="gramEnd"/>
+      <w:r>
+        <w:rPr>
+          <w:sz w:val="21"/>
+          <w:szCs w:val="21"/>
+          <w:lang w:val="en-US"/>
+        </w:rPr>
+        <w:t>_</w:t>
+      </w:r>
+      <w:proofErr w:type="gramStart"/>
+      <w:r>
+        <w:rPr>
+          <w:sz w:val="21"/>
+          <w:szCs w:val="21"/>
+          <w:lang w:val="en-US"/>
+        </w:rPr>
+        <w:t>moves.insert</w:t>
+      </w:r>
+      <w:proofErr w:type="gramEnd"/>
+      <w:r>
+        <w:rPr>
+          <w:sz w:val="21"/>
+          <w:szCs w:val="21"/>
+          <w:lang w:val="en-US"/>
+        </w:rPr>
+        <w:t xml:space="preserve">(0, </w:t>
+      </w:r>
+      <w:proofErr w:type="gramStart"/>
+      <w:r>
+        <w:rPr>
+          <w:sz w:val="21"/>
+          <w:szCs w:val="21"/>
+          <w:lang w:val="en-US"/>
+        </w:rPr>
+        <w:t>Move(</w:t>
+      </w:r>
+      <w:proofErr w:type="gramEnd"/>
+      <w:r>
+        <w:rPr>
+          <w:sz w:val="21"/>
+          <w:szCs w:val="21"/>
+          <w:lang w:val="en-US"/>
+        </w:rPr>
+        <w:t>position, board.as_</w:t>
+      </w:r>
+      <w:proofErr w:type="gramStart"/>
+      <w:r>
+        <w:rPr>
+          <w:sz w:val="21"/>
+          <w:szCs w:val="21"/>
+          <w:lang w:val="en-US"/>
+        </w:rPr>
+        <w:t>code(),recommendations</w:t>
+      </w:r>
+      <w:proofErr w:type="gramEnd"/>
+      <w:r>
+        <w:rPr>
+          <w:sz w:val="21"/>
+          <w:szCs w:val="21"/>
+          <w:lang w:val="en-US"/>
+        </w:rPr>
+        <w:t>, self))</w:t>
+      </w:r>
+    </w:p>
+    <w:p>
+      <w:pPr>
+        <w:spacing w:after="200" w:line="300" w:lineRule="auto"/>
+        <w:ind w:left="420" w:hanging="420"/>
+        <w:rPr>
+          <w:sz w:val="21"/>
+          <w:szCs w:val="21"/>
+          <w:lang w:val="en-US"/>
+        </w:rPr>
+      </w:pPr>
+      <w:r>
+        <w:rPr>
+          <w:sz w:val="21"/>
+          <w:szCs w:val="21"/>
+          <w:lang w:val="en-US"/>
+        </w:rPr>
+        <w:t>He cambiado a:</w:t>
+      </w:r>
+    </w:p>
+    <w:p>
+      <w:pPr>
+        <w:spacing w:after="200" w:line="300" w:lineRule="auto"/>
+        <w:ind w:left="420" w:hanging="420"/>
+        <w:rPr>
+          <w:sz w:val="21"/>
+          <w:szCs w:val="21"/>
+          <w:lang w:val="en-US"/>
+        </w:rPr>
+      </w:pPr>
+      <w:proofErr w:type="gramStart"/>
+      <w:r>
+        <w:rPr>
+          <w:sz w:val="21"/>
+          <w:szCs w:val="21"/>
+          <w:lang w:val="en-US"/>
+        </w:rPr>
+        <w:t>self.last</w:t>
+      </w:r>
+      <w:proofErr w:type="gramEnd"/>
+      <w:r>
+        <w:rPr>
+          <w:sz w:val="21"/>
+          <w:szCs w:val="21"/>
+          <w:lang w:val="en-US"/>
+        </w:rPr>
+        <w:t>_</w:t>
+      </w:r>
+      <w:proofErr w:type="gramStart"/>
+      <w:r>
+        <w:rPr>
+          <w:sz w:val="21"/>
+          <w:szCs w:val="21"/>
+          <w:lang w:val="en-US"/>
+        </w:rPr>
+        <w:t>moves.insert</w:t>
+      </w:r>
+      <w:proofErr w:type="gramEnd"/>
+      <w:r>
+        <w:rPr>
+          <w:sz w:val="21"/>
+          <w:szCs w:val="21"/>
+          <w:lang w:val="en-US"/>
+        </w:rPr>
+        <w:t xml:space="preserve">(0, </w:t>
+      </w:r>
+      <w:proofErr w:type="gramStart"/>
+      <w:r>
+        <w:rPr>
+          <w:sz w:val="21"/>
+          <w:szCs w:val="21"/>
+          <w:lang w:val="en-US"/>
+        </w:rPr>
+        <w:t>Move(</w:t>
+      </w:r>
+      <w:proofErr w:type="gramEnd"/>
+      <w:r>
+        <w:rPr>
+          <w:sz w:val="21"/>
+          <w:szCs w:val="21"/>
+          <w:lang w:val="en-US"/>
+        </w:rPr>
+        <w:t>position, board.as_</w:t>
+      </w:r>
+      <w:proofErr w:type="gramStart"/>
+      <w:r>
+        <w:rPr>
+          <w:sz w:val="21"/>
+          <w:szCs w:val="21"/>
+          <w:lang w:val="en-US"/>
+        </w:rPr>
+        <w:t>code(</w:t>
+      </w:r>
+      <w:proofErr w:type="gramEnd"/>
+      <w:r>
+        <w:rPr>
+          <w:sz w:val="21"/>
+          <w:szCs w:val="21"/>
+          <w:lang w:val="en-US"/>
+        </w:rPr>
+        <w:t>), recommendations, self))</w:t>
+      </w:r>
+    </w:p>
+    <w:p>
+      <w:pPr>
+        <w:spacing w:after="200" w:line="300" w:lineRule="auto"/>
+        <w:ind w:left="420" w:hanging="420"/>
+        <w:rPr>
+          <w:sz w:val="21"/>
+          <w:szCs w:val="21"/>
+          <w:lang w:val="en-US"/>
+        </w:rPr>
+      </w:pPr>
+      <w:proofErr w:type="gramStart"/>
+      <w:r>
+        <w:rPr>
+          <w:sz w:val="21"/>
+          <w:szCs w:val="21"/>
+          <w:lang w:val="en-US"/>
+        </w:rPr>
+        <w:t>board.add(self.char</w:t>
+      </w:r>
+      <w:proofErr w:type="gramEnd"/>
+      <w:r>
+        <w:rPr>
+          <w:sz w:val="21"/>
+          <w:szCs w:val="21"/>
+          <w:lang w:val="en-US"/>
+        </w:rPr>
         <w:t>, position)</w:t>
       </w:r>
     </w:p>
@@ -5518,98 +4633,6 @@
           <w:lang w:val="en-US"/>
         </w:rPr>
       </w:pPr>
-      <w:proofErr w:type="spellStart"/>
-      <w:proofErr w:type="gramStart"/>
-      <w:r>
-        <w:rPr>
-          <w:sz w:val="21"/>
-          <w:szCs w:val="21"/>
-          <w:lang w:val="en-US"/>
-        </w:rPr>
-        <w:t>self.last</w:t>
-      </w:r>
-      <w:proofErr w:type="gramEnd"/>
-      <w:r>
-        <w:rPr>
-          <w:sz w:val="21"/>
-          <w:szCs w:val="21"/>
-          <w:lang w:val="en-US"/>
-        </w:rPr>
-        <w:t>_</w:t>
-      </w:r>
-      <w:proofErr w:type="gramStart"/>
-      <w:r>
-        <w:rPr>
-          <w:sz w:val="21"/>
-          <w:szCs w:val="21"/>
-          <w:lang w:val="en-US"/>
-        </w:rPr>
-        <w:t>moves.insert</w:t>
-      </w:r>
-      <w:proofErr w:type="spellEnd"/>
-      <w:proofErr w:type="gramEnd"/>
-      <w:r>
-        <w:rPr>
-          <w:sz w:val="21"/>
-          <w:szCs w:val="21"/>
-          <w:lang w:val="en-US"/>
-        </w:rPr>
-        <w:t xml:space="preserve">(0, </w:t>
-      </w:r>
-      <w:proofErr w:type="gramStart"/>
-      <w:r>
-        <w:rPr>
-          <w:sz w:val="21"/>
-          <w:szCs w:val="21"/>
-          <w:lang w:val="en-US"/>
-        </w:rPr>
-        <w:t>Move(</w:t>
-      </w:r>
-      <w:proofErr w:type="gramEnd"/>
-      <w:r>
-        <w:rPr>
-          <w:sz w:val="21"/>
-          <w:szCs w:val="21"/>
-          <w:lang w:val="en-US"/>
-        </w:rPr>
-        <w:t xml:space="preserve">position, </w:t>
-      </w:r>
-      <w:proofErr w:type="spellStart"/>
-      <w:r>
-        <w:rPr>
-          <w:sz w:val="21"/>
-          <w:szCs w:val="21"/>
-          <w:lang w:val="en-US"/>
-        </w:rPr>
-        <w:t>board.as_</w:t>
-      </w:r>
-      <w:proofErr w:type="gramStart"/>
-      <w:r>
-        <w:rPr>
-          <w:sz w:val="21"/>
-          <w:szCs w:val="21"/>
-          <w:lang w:val="en-US"/>
-        </w:rPr>
-        <w:t>code</w:t>
-      </w:r>
-      <w:proofErr w:type="spellEnd"/>
-      <w:r>
-        <w:rPr>
-          <w:sz w:val="21"/>
-          <w:szCs w:val="21"/>
-          <w:lang w:val="en-US"/>
-        </w:rPr>
-        <w:t>(),recommendations</w:t>
-      </w:r>
-      <w:proofErr w:type="gramEnd"/>
-      <w:r>
-        <w:rPr>
-          <w:sz w:val="21"/>
-          <w:szCs w:val="21"/>
-          <w:lang w:val="en-US"/>
-        </w:rPr>
-        <w:t>, self))</w:t>
-      </w:r>
     </w:p>
     <w:p>
       <w:pPr>
@@ -5618,34 +4641,65 @@
         <w:rPr>
           <w:sz w:val="21"/>
           <w:szCs w:val="21"/>
-          <w:lang w:val="en-US"/>
-        </w:rPr>
-      </w:pPr>
-      <w:r>
-        <w:rPr>
-          <w:sz w:val="21"/>
-          <w:szCs w:val="21"/>
-          <w:lang w:val="en-US"/>
-        </w:rPr>
-        <w:t xml:space="preserve">He </w:t>
-      </w:r>
-      <w:proofErr w:type="spellStart"/>
-      <w:r>
-        <w:rPr>
-          <w:sz w:val="21"/>
-          <w:szCs w:val="21"/>
-          <w:lang w:val="en-US"/>
-        </w:rPr>
-        <w:t>cambiado</w:t>
-      </w:r>
-      <w:proofErr w:type="spellEnd"/>
-      <w:r>
-        <w:rPr>
-          <w:sz w:val="21"/>
-          <w:szCs w:val="21"/>
-          <w:lang w:val="en-US"/>
-        </w:rPr>
-        <w:t xml:space="preserve"> a:</w:t>
+        </w:rPr>
+      </w:pPr>
+      <w:r>
+        <w:rPr>
+          <w:sz w:val="21"/>
+          <w:szCs w:val="21"/>
+        </w:rPr>
+        <w:t>Tampoco</w:t>
+      </w:r>
+      <w:r>
+        <w:rPr>
+          <w:sz w:val="21"/>
+          <w:szCs w:val="21"/>
+        </w:rPr>
+        <w:t xml:space="preserve"> estoy de acuerdo con el manejo que se hace de las comprobaciones del SmartOracle. El diseño tiene una iteración anidada que puede alcanzar una eficiencia de </w:t>
+      </w:r>
+      <w:proofErr w:type="gramStart"/>
+      <w:r>
+        <w:rPr>
+          <w:sz w:val="21"/>
+          <w:szCs w:val="21"/>
+        </w:rPr>
+        <w:t>O(</w:t>
+      </w:r>
+      <w:proofErr w:type="gramEnd"/>
+      <w:r>
+        <w:rPr>
+          <w:sz w:val="21"/>
+          <w:szCs w:val="21"/>
+        </w:rPr>
+        <w:t>N^2 + 2N) en un caso que puede no ser muy raro, sobre todo teniendo en cuenta jugadas que pongan en situaciones incómodas al oráculo</w:t>
+      </w:r>
+      <w:r>
+        <w:rPr>
+          <w:sz w:val="21"/>
+          <w:szCs w:val="21"/>
+        </w:rPr>
+        <w:t xml:space="preserve">. </w:t>
+      </w:r>
+      <w:r>
+        <w:rPr>
+          <w:sz w:val="21"/>
+          <w:szCs w:val="21"/>
+        </w:rPr>
+        <w:t>Esto</w:t>
+      </w:r>
+      <w:r>
+        <w:rPr>
+          <w:sz w:val="21"/>
+          <w:szCs w:val="21"/>
+        </w:rPr>
+        <w:t xml:space="preserve"> afecta sobre todo a la dificultad media que no memoriza y</w:t>
+      </w:r>
+      <w:r>
+        <w:rPr>
+          <w:sz w:val="21"/>
+          <w:szCs w:val="21"/>
+        </w:rPr>
+        <w:t xml:space="preserve"> hace que tableros más grandes puedan ser altamente ineficientes, por lo que dependiendo del consumo de recursos que suponga deepcopy, el código puede no ser escalable.</w:t>
       </w:r>
     </w:p>
     <w:p>
@@ -5655,100 +4709,58 @@
         <w:rPr>
           <w:sz w:val="21"/>
           <w:szCs w:val="21"/>
-          <w:lang w:val="en-US"/>
-        </w:rPr>
-      </w:pPr>
-      <w:proofErr w:type="spellStart"/>
-      <w:proofErr w:type="gramStart"/>
-      <w:r>
-        <w:rPr>
-          <w:sz w:val="21"/>
-          <w:szCs w:val="21"/>
-          <w:lang w:val="en-US"/>
-        </w:rPr>
-        <w:t>self.last</w:t>
-      </w:r>
-      <w:proofErr w:type="gramEnd"/>
-      <w:r>
-        <w:rPr>
-          <w:sz w:val="21"/>
-          <w:szCs w:val="21"/>
-          <w:lang w:val="en-US"/>
-        </w:rPr>
-        <w:t>_</w:t>
-      </w:r>
-      <w:proofErr w:type="gramStart"/>
-      <w:r>
-        <w:rPr>
-          <w:sz w:val="21"/>
-          <w:szCs w:val="21"/>
-          <w:lang w:val="en-US"/>
-        </w:rPr>
-        <w:t>moves.insert</w:t>
-      </w:r>
-      <w:proofErr w:type="spellEnd"/>
-      <w:proofErr w:type="gramEnd"/>
-      <w:r>
-        <w:rPr>
-          <w:sz w:val="21"/>
-          <w:szCs w:val="21"/>
-          <w:lang w:val="en-US"/>
-        </w:rPr>
-        <w:t xml:space="preserve">(0, </w:t>
-      </w:r>
-      <w:proofErr w:type="gramStart"/>
-      <w:r>
-        <w:rPr>
-          <w:sz w:val="21"/>
-          <w:szCs w:val="21"/>
-          <w:lang w:val="en-US"/>
-        </w:rPr>
-        <w:t>Move(</w:t>
-      </w:r>
-      <w:proofErr w:type="gramEnd"/>
-      <w:r>
-        <w:rPr>
-          <w:sz w:val="21"/>
-          <w:szCs w:val="21"/>
-          <w:lang w:val="en-US"/>
-        </w:rPr>
-        <w:t xml:space="preserve">position, </w:t>
-      </w:r>
-      <w:proofErr w:type="spellStart"/>
-      <w:r>
-        <w:rPr>
-          <w:sz w:val="21"/>
-          <w:szCs w:val="21"/>
-          <w:lang w:val="en-US"/>
-        </w:rPr>
-        <w:t>board.as_</w:t>
-      </w:r>
-      <w:proofErr w:type="gramStart"/>
-      <w:r>
-        <w:rPr>
-          <w:sz w:val="21"/>
-          <w:szCs w:val="21"/>
-          <w:lang w:val="en-US"/>
-        </w:rPr>
-        <w:t>code</w:t>
-      </w:r>
-      <w:proofErr w:type="spellEnd"/>
-      <w:r>
-        <w:rPr>
-          <w:sz w:val="21"/>
-          <w:szCs w:val="21"/>
-          <w:lang w:val="en-US"/>
-        </w:rPr>
-        <w:t>(</w:t>
-      </w:r>
-      <w:proofErr w:type="gramEnd"/>
-      <w:r>
-        <w:rPr>
-          <w:sz w:val="21"/>
-          <w:szCs w:val="21"/>
-          <w:lang w:val="en-US"/>
-        </w:rPr>
-        <w:t>), recommendations, self))</w:t>
+        </w:rPr>
+      </w:pPr>
+      <w:r>
+        <w:rPr>
+          <w:sz w:val="21"/>
+          <w:szCs w:val="21"/>
+        </w:rPr>
+        <w:t xml:space="preserve">Una solución que propondría sería usar una sola deepcopy y comprobar victoria en cada tablero lineal, pero </w:t>
+      </w:r>
+      <w:r>
+        <w:rPr>
+          <w:sz w:val="21"/>
+          <w:szCs w:val="21"/>
+        </w:rPr>
+        <w:t xml:space="preserve">hacer </w:t>
+      </w:r>
+      <w:proofErr w:type="gramStart"/>
+      <w:r>
+        <w:rPr>
+          <w:sz w:val="21"/>
+          <w:szCs w:val="21"/>
+        </w:rPr>
+        <w:t>self._</w:t>
+      </w:r>
+      <w:proofErr w:type="gramEnd"/>
+      <w:r>
+        <w:rPr>
+          <w:sz w:val="21"/>
+          <w:szCs w:val="21"/>
+        </w:rPr>
+        <w:t xml:space="preserve">is_winning_bet(temporal_bet) me parece </w:t>
+      </w:r>
+      <w:r>
+        <w:rPr>
+          <w:sz w:val="21"/>
+          <w:szCs w:val="21"/>
+        </w:rPr>
+        <w:t xml:space="preserve">muy redundante y me da la impresión de </w:t>
+      </w:r>
+      <w:r>
+        <w:rPr>
+          <w:sz w:val="21"/>
+          <w:szCs w:val="21"/>
+        </w:rPr>
+        <w:t>que funciona porque el tablero es muy pequeñito</w:t>
+      </w:r>
+      <w:r>
+        <w:rPr>
+          <w:sz w:val="21"/>
+          <w:szCs w:val="21"/>
+        </w:rPr>
+        <w:t>.</w:t>
       </w:r>
     </w:p>
     <w:p>
@@ -5758,264 +4770,6 @@
         <w:rPr>
           <w:sz w:val="21"/>
           <w:szCs w:val="21"/>
-          <w:lang w:val="en-US"/>
-        </w:rPr>
-      </w:pPr>
-      <w:proofErr w:type="spellStart"/>
-      <w:proofErr w:type="gramStart"/>
-      <w:r>
-        <w:rPr>
-          <w:sz w:val="21"/>
-          <w:szCs w:val="21"/>
-          <w:lang w:val="en-US"/>
-        </w:rPr>
-        <w:t>board.add</w:t>
-      </w:r>
-      <w:proofErr w:type="spellEnd"/>
-      <w:r>
-        <w:rPr>
-          <w:sz w:val="21"/>
-          <w:szCs w:val="21"/>
-          <w:lang w:val="en-US"/>
-        </w:rPr>
-        <w:t>(</w:t>
-      </w:r>
-      <w:proofErr w:type="spellStart"/>
-      <w:r>
-        <w:rPr>
-          <w:sz w:val="21"/>
-          <w:szCs w:val="21"/>
-          <w:lang w:val="en-US"/>
-        </w:rPr>
-        <w:t>self.char</w:t>
-      </w:r>
-      <w:proofErr w:type="spellEnd"/>
-      <w:proofErr w:type="gramEnd"/>
-      <w:r>
-        <w:rPr>
-          <w:sz w:val="21"/>
-          <w:szCs w:val="21"/>
-          <w:lang w:val="en-US"/>
-        </w:rPr>
-        <w:t>, position)</w:t>
-      </w:r>
-    </w:p>
-    <w:p>
-      <w:pPr>
-        <w:spacing w:after="200" w:line="300" w:lineRule="auto"/>
-        <w:ind w:left="420" w:hanging="420"/>
-        <w:rPr>
-          <w:sz w:val="21"/>
-          <w:szCs w:val="21"/>
-          <w:lang w:val="en-US"/>
-        </w:rPr>
-      </w:pPr>
-    </w:p>
-    <w:p>
-      <w:pPr>
-        <w:spacing w:after="200" w:line="300" w:lineRule="auto"/>
-        <w:ind w:left="420" w:hanging="420"/>
-        <w:rPr>
-          <w:sz w:val="21"/>
-          <w:szCs w:val="21"/>
-        </w:rPr>
-      </w:pPr>
-      <w:r>
-        <w:rPr>
-          <w:sz w:val="21"/>
-          <w:szCs w:val="21"/>
-        </w:rPr>
-        <w:lastRenderedPageBreak/>
-        <w:t>Tampoco</w:t>
-      </w:r>
-      <w:r>
-        <w:rPr>
-          <w:sz w:val="21"/>
-          <w:szCs w:val="21"/>
-        </w:rPr>
-        <w:t xml:space="preserve"> estoy de acuerdo con el manejo que se hace de las comprobaciones del </w:t>
-      </w:r>
-      <w:proofErr w:type="spellStart"/>
-      <w:r>
-        <w:rPr>
-          <w:sz w:val="21"/>
-          <w:szCs w:val="21"/>
-        </w:rPr>
-        <w:t>SmartOracle</w:t>
-      </w:r>
-      <w:proofErr w:type="spellEnd"/>
-      <w:r>
-        <w:rPr>
-          <w:sz w:val="21"/>
-          <w:szCs w:val="21"/>
-        </w:rPr>
-        <w:t xml:space="preserve">. El diseño tiene una iteración anidada que puede alcanzar una eficiencia de </w:t>
-      </w:r>
-      <w:proofErr w:type="gramStart"/>
-      <w:r>
-        <w:rPr>
-          <w:sz w:val="21"/>
-          <w:szCs w:val="21"/>
-        </w:rPr>
-        <w:t>O(</w:t>
-      </w:r>
-      <w:proofErr w:type="gramEnd"/>
-      <w:r>
-        <w:rPr>
-          <w:sz w:val="21"/>
-          <w:szCs w:val="21"/>
-        </w:rPr>
-        <w:t>N^2 + 2N) en un caso que puede no ser muy raro, sobre todo teniendo en cuenta jugadas que pongan en situaciones incómodas al oráculo</w:t>
-      </w:r>
-      <w:r>
-        <w:rPr>
-          <w:sz w:val="21"/>
-          <w:szCs w:val="21"/>
-        </w:rPr>
-        <w:t xml:space="preserve">. </w:t>
-      </w:r>
-      <w:r>
-        <w:rPr>
-          <w:sz w:val="21"/>
-          <w:szCs w:val="21"/>
-        </w:rPr>
-        <w:t>Esto</w:t>
-      </w:r>
-      <w:r>
-        <w:rPr>
-          <w:sz w:val="21"/>
-          <w:szCs w:val="21"/>
-        </w:rPr>
-        <w:t xml:space="preserve"> afecta sobre todo a la dificultad media que no memoriza y</w:t>
-      </w:r>
-      <w:r>
-        <w:rPr>
-          <w:sz w:val="21"/>
-          <w:szCs w:val="21"/>
-        </w:rPr>
-        <w:t xml:space="preserve"> hace que tableros más grandes puedan ser altamente ineficientes, por lo que dependiendo del consumo de recursos que suponga </w:t>
-      </w:r>
-      <w:proofErr w:type="spellStart"/>
-      <w:r>
-        <w:rPr>
-          <w:sz w:val="21"/>
-          <w:szCs w:val="21"/>
-        </w:rPr>
-        <w:t>deepcopy</w:t>
-      </w:r>
-      <w:proofErr w:type="spellEnd"/>
-      <w:r>
-        <w:rPr>
-          <w:sz w:val="21"/>
-          <w:szCs w:val="21"/>
-        </w:rPr>
-        <w:t>, el código puede no ser escalable.</w:t>
-      </w:r>
-    </w:p>
-    <w:p>
-      <w:pPr>
-        <w:spacing w:after="200" w:line="300" w:lineRule="auto"/>
-        <w:ind w:left="420" w:hanging="420"/>
-        <w:rPr>
-          <w:sz w:val="21"/>
-          <w:szCs w:val="21"/>
-        </w:rPr>
-      </w:pPr>
-      <w:r>
-        <w:rPr>
-          <w:sz w:val="21"/>
-          <w:szCs w:val="21"/>
-        </w:rPr>
-        <w:t xml:space="preserve">Una solución que propondría sería usar una sola </w:t>
-      </w:r>
-      <w:proofErr w:type="spellStart"/>
-      <w:r>
-        <w:rPr>
-          <w:sz w:val="21"/>
-          <w:szCs w:val="21"/>
-        </w:rPr>
-        <w:t>deepcopy</w:t>
-      </w:r>
-      <w:proofErr w:type="spellEnd"/>
-      <w:r>
-        <w:rPr>
-          <w:sz w:val="21"/>
-          <w:szCs w:val="21"/>
-        </w:rPr>
-        <w:t xml:space="preserve"> y comprobar victoria en cada tablero lineal, pero </w:t>
-      </w:r>
-      <w:r>
-        <w:rPr>
-          <w:sz w:val="21"/>
-          <w:szCs w:val="21"/>
-        </w:rPr>
-        <w:t xml:space="preserve">hacer </w:t>
-      </w:r>
-      <w:proofErr w:type="spellStart"/>
-      <w:proofErr w:type="gramStart"/>
-      <w:r>
-        <w:rPr>
-          <w:sz w:val="21"/>
-          <w:szCs w:val="21"/>
-        </w:rPr>
-        <w:t>self</w:t>
-      </w:r>
-      <w:proofErr w:type="spellEnd"/>
-      <w:r>
-        <w:rPr>
-          <w:sz w:val="21"/>
-          <w:szCs w:val="21"/>
-        </w:rPr>
-        <w:t>._</w:t>
-      </w:r>
-      <w:proofErr w:type="spellStart"/>
-      <w:proofErr w:type="gramEnd"/>
-      <w:r>
-        <w:rPr>
-          <w:sz w:val="21"/>
-          <w:szCs w:val="21"/>
-        </w:rPr>
-        <w:t>is_winning_bet</w:t>
-      </w:r>
-      <w:proofErr w:type="spellEnd"/>
-      <w:r>
-        <w:rPr>
-          <w:sz w:val="21"/>
-          <w:szCs w:val="21"/>
-        </w:rPr>
-        <w:t>(</w:t>
-      </w:r>
-      <w:proofErr w:type="spellStart"/>
-      <w:r>
-        <w:rPr>
-          <w:sz w:val="21"/>
-          <w:szCs w:val="21"/>
-        </w:rPr>
-        <w:t>temporal_bet</w:t>
-      </w:r>
-      <w:proofErr w:type="spellEnd"/>
-      <w:r>
-        <w:rPr>
-          <w:sz w:val="21"/>
-          <w:szCs w:val="21"/>
-        </w:rPr>
-        <w:t>) me parece un desfase totalmente innecesario que funciona porque el tablero es muy pequeñito</w:t>
-      </w:r>
-      <w:r>
-        <w:rPr>
-          <w:sz w:val="21"/>
-          <w:szCs w:val="21"/>
-        </w:rPr>
-        <w:t>.</w:t>
-      </w:r>
-    </w:p>
-    <w:p>
-      <w:pPr>
-        <w:spacing w:after="200" w:line="300" w:lineRule="auto"/>
-        <w:ind w:left="420" w:hanging="420"/>
-        <w:rPr>
-          <w:sz w:val="21"/>
-          <w:szCs w:val="21"/>
         </w:rPr>
       </w:pPr>
       <w:r>
@@ -6032,73 +4786,37 @@
         </w:rPr>
         <w:t xml:space="preserve">, como en </w:t>
       </w:r>
-      <w:proofErr w:type="spellStart"/>
-      <w:proofErr w:type="gramStart"/>
-      <w:r>
-        <w:rPr>
-          <w:sz w:val="21"/>
-          <w:szCs w:val="21"/>
-        </w:rPr>
-        <w:t>BaseOracle</w:t>
-      </w:r>
-      <w:proofErr w:type="spellEnd"/>
-      <w:r>
-        <w:rPr>
-          <w:sz w:val="21"/>
-          <w:szCs w:val="21"/>
-        </w:rPr>
-        <w:t>._</w:t>
-      </w:r>
-      <w:proofErr w:type="spellStart"/>
-      <w:proofErr w:type="gramEnd"/>
-      <w:r>
-        <w:rPr>
-          <w:sz w:val="21"/>
-          <w:szCs w:val="21"/>
-        </w:rPr>
-        <w:t>get_columns_recommendations</w:t>
-      </w:r>
-      <w:proofErr w:type="spellEnd"/>
-      <w:r>
-        <w:rPr>
-          <w:sz w:val="21"/>
-          <w:szCs w:val="21"/>
-        </w:rPr>
-        <w:t xml:space="preserve">, que se llama a </w:t>
-      </w:r>
-      <w:proofErr w:type="spellStart"/>
-      <w:proofErr w:type="gramStart"/>
-      <w:r>
-        <w:rPr>
-          <w:sz w:val="21"/>
-          <w:szCs w:val="21"/>
-        </w:rPr>
-        <w:t>board</w:t>
-      </w:r>
-      <w:proofErr w:type="spellEnd"/>
-      <w:r>
-        <w:rPr>
-          <w:sz w:val="21"/>
-          <w:szCs w:val="21"/>
-        </w:rPr>
-        <w:t>._</w:t>
-      </w:r>
-      <w:proofErr w:type="spellStart"/>
-      <w:proofErr w:type="gramEnd"/>
-      <w:r>
-        <w:rPr>
-          <w:sz w:val="21"/>
-          <w:szCs w:val="21"/>
-        </w:rPr>
-        <w:t>columns</w:t>
-      </w:r>
-      <w:proofErr w:type="spellEnd"/>
-      <w:r>
-        <w:rPr>
-          <w:sz w:val="21"/>
-          <w:szCs w:val="21"/>
-        </w:rPr>
-        <w:t>, lo que parece un error</w:t>
+      <w:proofErr w:type="gramStart"/>
+      <w:r>
+        <w:rPr>
+          <w:sz w:val="21"/>
+          <w:szCs w:val="21"/>
+        </w:rPr>
+        <w:t>BaseOracle._</w:t>
+      </w:r>
+      <w:proofErr w:type="gramEnd"/>
+      <w:r>
+        <w:rPr>
+          <w:sz w:val="21"/>
+          <w:szCs w:val="21"/>
+        </w:rPr>
+        <w:t xml:space="preserve">get_columns_recommendations, que se llama a </w:t>
+      </w:r>
+      <w:proofErr w:type="gramStart"/>
+      <w:r>
+        <w:rPr>
+          <w:sz w:val="21"/>
+          <w:szCs w:val="21"/>
+        </w:rPr>
+        <w:t>board._</w:t>
+      </w:r>
+      <w:proofErr w:type="gramEnd"/>
+      <w:r>
+        <w:rPr>
+          <w:sz w:val="21"/>
+          <w:szCs w:val="21"/>
+        </w:rPr>
+        <w:t>columns, lo que parece un error</w:t>
       </w:r>
       <w:r>
         <w:rPr>
@@ -6825,6 +5543,7 @@
   <w:style w:type="character" w:default="1" w:styleId="Fuentedeprrafopredeter">
     <w:name w:val="Default Paragraph Font"/>
     <w:uiPriority w:val="1"/>
+    <w:semiHidden/>
     <w:unhideWhenUsed/>
   </w:style>
   <w:style w:type="table" w:default="1" w:styleId="Tablanormal">

</xml_diff>

<commit_message>
Primer commit tests base, falta a importar resto de tests
</commit_message>
<xml_diff>
--- a/cuestionario_conecta4.docx
+++ b/cuestionario_conecta4.docx
@@ -149,23 +149,7 @@
         <w:ind w:left="720"/>
       </w:pPr>
       <w:r>
-        <w:t>Suponiendo que tenemos find_</w:t>
-      </w:r>
-      <w:proofErr w:type="gramStart"/>
-      <w:r>
-        <w:t>n(</w:t>
-      </w:r>
-      <w:proofErr w:type="gramEnd"/>
-      <w:r>
-        <w:t>lista, 2, 3) y find_</w:t>
-      </w:r>
-      <w:proofErr w:type="gramStart"/>
-      <w:r>
-        <w:t>strike(</w:t>
-      </w:r>
-      <w:proofErr w:type="gramEnd"/>
-      <w:r>
-        <w:t>lista, 2, 3), la primera función devolvería True y la segunda False.</w:t>
+        <w:t>Suponiendo que tenemos find_n(lista, 2, 3) y find_strike(lista, 2, 3), la primera función devolvería True y la segunda False.</w:t>
       </w:r>
     </w:p>
     <w:p>
@@ -1069,15 +1053,7 @@
         <w:ind w:left="720"/>
       </w:pPr>
       <w:r>
-        <w:t>Porque en algunos casos no se sabría dónde exactamente están las fichas y dónde hay celdas vacías. [“ox”] podría ser tanto [“.o.x”] como [“o..x”] como [“</w:t>
-      </w:r>
-      <w:proofErr w:type="gramStart"/>
-      <w:r>
-        <w:t>ox..</w:t>
-      </w:r>
-      <w:proofErr w:type="gramEnd"/>
-      <w:r>
-        <w:t>”], entre otras tantas posibilidades. Dado este requisito de un carácter “filler”, para poder procesar la lista de caracteres con explode_list, cada casilla del tablero debe ser exactamente de un carácter, dado que itera sobre la cadena y crea una LoL donde cada carácter es un elemento.</w:t>
+        <w:t>Porque en algunos casos no se sabría dónde exactamente están las fichas y dónde hay celdas vacías. [“ox”] podría ser tanto [“.o.x”] como [“o..x”] como [“ox..”], entre otras tantas posibilidades. Dado este requisito de un carácter “filler”, para poder procesar la lista de caracteres con explode_list, cada casilla del tablero debe ser exactamente de un carácter, dado que itera sobre la cadena y crea una LoL donde cada carácter es un elemento.</w:t>
       </w:r>
     </w:p>
     <w:p>
@@ -1125,15 +1101,7 @@
         <w:t>Esta decisión permite que e</w:t>
       </w:r>
       <w:r>
-        <w:t xml:space="preserve">l juego no se pare y evita tener que capturar el error en un nivel más alto, lo cual supone un esfuerzo y más partes móviles. De todas </w:t>
-      </w:r>
-      <w:proofErr w:type="gramStart"/>
-      <w:r>
-        <w:t>formas</w:t>
-      </w:r>
-      <w:proofErr w:type="gramEnd"/>
-      <w:r>
-        <w:t xml:space="preserve"> ya tenemos verificaciones del lado del player para asegurar que no está introduciendo un valor en una columna completa. Ahorra trabajo e introducir más partes podría considerarse innecesario. Por otro lado, dado que es poco probable que esto ocurra, también es poco probable que el error inutilice el juego, sobre todo si funciona bien, por lo que en el caso de que se explote el juego y se produzca un error inesperado podría llegar a capturarse y en última instancia evitar mayores catástrofes, lo que sería un punto positivo también.</w:t>
+        <w:t>l juego no se pare y evita tener que capturar el error en un nivel más alto, lo cual supone un esfuerzo y más partes móviles. De todas formas ya tenemos verificaciones del lado del player para asegurar que no está introduciendo un valor en una columna completa. Ahorra trabajo e introducir más partes podría considerarse innecesario. Por otro lado, dado que es poco probable que esto ocurra, también es poco probable que el error inutilice el juego, sobre todo si funciona bien, por lo que en el caso de que se explote el juego y se produzca un error inesperado podría llegar a capturarse y en última instancia evitar mayores catástrofes, lo que sería un punto positivo también.</w:t>
       </w:r>
     </w:p>
     <w:p>
@@ -1199,31 +1167,7 @@
         <w:ind w:left="720"/>
       </w:pPr>
       <w:r>
-        <w:t>La victoria vertical resuelve en preguntarle a la lista elemental o “columna”. La victoria horizontal transpone la matriz y comprueba victoria vertical con list_</w:t>
-      </w:r>
-      <w:proofErr w:type="gramStart"/>
-      <w:r>
-        <w:t>utils.transpose</w:t>
-      </w:r>
-      <w:proofErr w:type="gramEnd"/>
-      <w:r>
-        <w:t>(). En el caso de las diagonales, como mencioné antes, la diagonal descendente se puede solucionar con list_</w:t>
-      </w:r>
-      <w:proofErr w:type="gramStart"/>
-      <w:r>
-        <w:t>utils.displace</w:t>
-      </w:r>
-      <w:proofErr w:type="gramEnd"/>
-      <w:r>
-        <w:t>_</w:t>
-      </w:r>
-      <w:proofErr w:type="gramStart"/>
-      <w:r>
-        <w:t>matrix(</w:t>
-      </w:r>
-      <w:proofErr w:type="gramEnd"/>
-      <w:r>
-        <w:t>), que desplaza las “filas” y comprueba victoria horizontal, y en el caso de las victorias diagonales ascendentes, se invierte cada</w:t>
+        <w:t>La victoria vertical resuelve en preguntarle a la lista elemental o “columna”. La victoria horizontal transpone la matriz y comprueba victoria vertical con list_utils.transpose(). En el caso de las diagonales, como mencioné antes, la diagonal descendente se puede solucionar con list_utils.displace_matrix(), que desplaza las “filas” y comprueba victoria horizontal, y en el caso de las victorias diagonales ascendentes, se invierte cada</w:t>
       </w:r>
       <w:r>
         <w:t xml:space="preserve"> una de las</w:t>
@@ -1235,23 +1179,7 @@
         <w:t>s</w:t>
       </w:r>
       <w:r>
-        <w:t xml:space="preserve"> con list_</w:t>
-      </w:r>
-      <w:proofErr w:type="gramStart"/>
-      <w:r>
-        <w:t>utils.reverse</w:t>
-      </w:r>
-      <w:proofErr w:type="gramEnd"/>
-      <w:r>
-        <w:t>_</w:t>
-      </w:r>
-      <w:proofErr w:type="gramStart"/>
-      <w:r>
-        <w:t>matrix(</w:t>
-      </w:r>
-      <w:proofErr w:type="gramEnd"/>
-      <w:r>
-        <w:t>), para después comprobar diagonal descendente. Cada uno añade una pequeña capa de complejidad y en última instancia comprueba siempre victoria vertical.</w:t>
+        <w:t xml:space="preserve"> con list_utils.reverse_matrix(), para después comprobar diagonal descendente. Cada uno añade una pequeña capa de complejidad y en última instancia comprueba siempre victoria vertical.</w:t>
       </w:r>
     </w:p>
     <w:p>
@@ -1482,21 +1410,13 @@
         <w:t>”</w:t>
       </w:r>
       <w:r>
-        <w:t xml:space="preserve"> si el objeto se modifica. Precisamente está hecho para ser un objeto mutable con el </w:t>
-      </w:r>
-      <w:proofErr w:type="gramStart"/>
-      <w:r>
-        <w:t xml:space="preserve">método </w:t>
+        <w:t xml:space="preserve"> si el objeto se modifica. Precisamente está hecho para ser un objeto mutable con el método </w:t>
       </w:r>
       <w:r>
         <w:t>.</w:t>
       </w:r>
       <w:r>
-        <w:t>add</w:t>
-      </w:r>
-      <w:proofErr w:type="gramEnd"/>
-      <w:r>
-        <w:t xml:space="preserve">, </w:t>
+        <w:t xml:space="preserve">add, </w:t>
       </w:r>
       <w:r>
         <w:t>así que el hash se quedaría obsoleto continuamente</w:t>
@@ -1534,43 +1454,7 @@
           <w:sz w:val="21"/>
           <w:szCs w:val="21"/>
         </w:rPr>
-        <w:t>'</w:t>
-      </w:r>
-      <w:proofErr w:type="gramStart"/>
-      <w:r>
-        <w:rPr>
-          <w:rFonts w:ascii="Consolas" w:eastAsia="Consolas" w:hAnsi="Consolas" w:cs="Consolas"/>
-          <w:sz w:val="21"/>
-          <w:szCs w:val="21"/>
-        </w:rPr>
-        <w:t>xo..</w:t>
-      </w:r>
-      <w:proofErr w:type="gramEnd"/>
-      <w:r>
-        <w:rPr>
-          <w:rFonts w:ascii="Consolas" w:eastAsia="Consolas" w:hAnsi="Consolas" w:cs="Consolas"/>
-          <w:sz w:val="21"/>
-          <w:szCs w:val="21"/>
-        </w:rPr>
-        <w:t>|</w:t>
-      </w:r>
-      <w:proofErr w:type="gramStart"/>
-      <w:r>
-        <w:rPr>
-          <w:rFonts w:ascii="Consolas" w:eastAsia="Consolas" w:hAnsi="Consolas" w:cs="Consolas"/>
-          <w:sz w:val="21"/>
-          <w:szCs w:val="21"/>
-        </w:rPr>
-        <w:t>o...|....|....</w:t>
-      </w:r>
-      <w:proofErr w:type="gramEnd"/>
-      <w:r>
-        <w:rPr>
-          <w:rFonts w:ascii="Consolas" w:eastAsia="Consolas" w:hAnsi="Consolas" w:cs="Consolas"/>
-          <w:sz w:val="21"/>
-          <w:szCs w:val="21"/>
-        </w:rPr>
-        <w:t>'</w:t>
+        <w:t>'xo..|o...|....|....'</w:t>
       </w:r>
       <w:r>
         <w:rPr>
@@ -1590,34 +1474,10 @@
         <w:t>Primero se tokeniza con el separador “|”</w:t>
       </w:r>
       <w:r>
-        <w:t xml:space="preserve"> con el método de </w:t>
-      </w:r>
-      <w:proofErr w:type="gramStart"/>
-      <w:r>
-        <w:t>cadenas .split</w:t>
-      </w:r>
-      <w:proofErr w:type="gramEnd"/>
-      <w:r>
-        <w:t>(‘|’)</w:t>
-      </w:r>
-      <w:r>
-        <w:t>: [“</w:t>
-      </w:r>
-      <w:proofErr w:type="gramStart"/>
-      <w:r>
-        <w:t>xo..”,“</w:t>
-      </w:r>
-      <w:proofErr w:type="gramEnd"/>
-      <w:r>
-        <w:t>o…</w:t>
-      </w:r>
-      <w:proofErr w:type="gramStart"/>
-      <w:r>
-        <w:t>”,“….”,“….</w:t>
-      </w:r>
-      <w:proofErr w:type="gramEnd"/>
-      <w:r>
-        <w:t>”]</w:t>
+        <w:t xml:space="preserve"> con el método de cadenas .split(‘|’)</w:t>
+      </w:r>
+      <w:r>
+        <w:t>: [“xo..”,“o…”,“….”,“….”]</w:t>
       </w:r>
     </w:p>
     <w:p>
@@ -1627,23 +1487,7 @@
         <w:ind w:left="720"/>
       </w:pPr>
       <w:r>
-        <w:t>Luego se crea una lista de listas con list_</w:t>
-      </w:r>
-      <w:proofErr w:type="gramStart"/>
-      <w:r>
-        <w:t>utils.explode</w:t>
-      </w:r>
-      <w:proofErr w:type="gramEnd"/>
-      <w:r>
-        <w:t>_</w:t>
-      </w:r>
-      <w:proofErr w:type="gramStart"/>
-      <w:r>
-        <w:t>list(</w:t>
-      </w:r>
-      <w:proofErr w:type="gramEnd"/>
-      <w:r>
-        <w:t xml:space="preserve">): </w:t>
+        <w:t xml:space="preserve">Luego se crea una lista de listas con list_utils.explode_list(): </w:t>
       </w:r>
     </w:p>
     <w:p>
@@ -1653,139 +1497,67 @@
         <w:ind w:left="720"/>
       </w:pPr>
       <w:r>
-        <w:t>[[“x”</w:t>
-      </w:r>
-      <w:proofErr w:type="gramStart"/>
-      <w:r>
-        <w:t>,</w:t>
+        <w:t>[[“x”,</w:t>
       </w:r>
       <w:r>
         <w:t xml:space="preserve"> </w:t>
       </w:r>
       <w:r>
-        <w:t>”o</w:t>
-      </w:r>
-      <w:proofErr w:type="gramEnd"/>
-      <w:r>
-        <w:t>”</w:t>
-      </w:r>
-      <w:proofErr w:type="gramStart"/>
-      <w:r>
-        <w:t>,</w:t>
+        <w:t>”o”,</w:t>
       </w:r>
       <w:r>
         <w:t xml:space="preserve"> </w:t>
       </w:r>
       <w:r>
-        <w:t>”</w:t>
-      </w:r>
-      <w:proofErr w:type="gramEnd"/>
-      <w:r>
-        <w:t>.”</w:t>
-      </w:r>
-      <w:proofErr w:type="gramStart"/>
-      <w:r>
-        <w:t>,</w:t>
+        <w:t>”.”,</w:t>
       </w:r>
       <w:r>
         <w:t xml:space="preserve"> </w:t>
       </w:r>
       <w:r>
-        <w:t>”.”],[</w:t>
-      </w:r>
-      <w:proofErr w:type="gramEnd"/>
-      <w:r>
-        <w:t>“o”</w:t>
-      </w:r>
-      <w:proofErr w:type="gramStart"/>
-      <w:r>
-        <w:t>,</w:t>
+        <w:t>”.”],[“o”,</w:t>
       </w:r>
       <w:r>
         <w:t xml:space="preserve"> </w:t>
       </w:r>
       <w:r>
-        <w:t>”</w:t>
-      </w:r>
-      <w:proofErr w:type="gramEnd"/>
-      <w:r>
-        <w:t>.”</w:t>
-      </w:r>
-      <w:proofErr w:type="gramStart"/>
-      <w:r>
-        <w:t>,</w:t>
+        <w:t>”.”,</w:t>
       </w:r>
       <w:r>
         <w:t xml:space="preserve"> </w:t>
       </w:r>
       <w:r>
-        <w:t>”</w:t>
-      </w:r>
-      <w:proofErr w:type="gramEnd"/>
-      <w:r>
-        <w:t>.”</w:t>
-      </w:r>
-      <w:proofErr w:type="gramStart"/>
-      <w:r>
-        <w:t>,</w:t>
+        <w:t>”.”,</w:t>
       </w:r>
       <w:r>
         <w:t xml:space="preserve"> </w:t>
       </w:r>
       <w:r>
-        <w:t>”</w:t>
-      </w:r>
-      <w:proofErr w:type="gramEnd"/>
-      <w:r>
-        <w:t>.”],</w:t>
+        <w:t>”.”],</w:t>
       </w:r>
       <w:r>
         <w:t xml:space="preserve"> </w:t>
       </w:r>
       <w:r>
-        <w:t>[“.”</w:t>
-      </w:r>
-      <w:proofErr w:type="gramStart"/>
-      <w:r>
-        <w:t>,</w:t>
+        <w:t>[“.”,</w:t>
       </w:r>
       <w:r>
         <w:t xml:space="preserve"> </w:t>
       </w:r>
       <w:r>
-        <w:t>”</w:t>
-      </w:r>
-      <w:proofErr w:type="gramEnd"/>
-      <w:r>
-        <w:t>.”</w:t>
-      </w:r>
-      <w:proofErr w:type="gramStart"/>
-      <w:r>
-        <w:t>,</w:t>
+        <w:t>”.”,</w:t>
       </w:r>
       <w:r>
         <w:t xml:space="preserve"> </w:t>
       </w:r>
       <w:r>
-        <w:t>”</w:t>
-      </w:r>
-      <w:proofErr w:type="gramEnd"/>
-      <w:r>
-        <w:t>.”</w:t>
-      </w:r>
-      <w:proofErr w:type="gramStart"/>
-      <w:r>
-        <w:t>,</w:t>
+        <w:t>”.”,</w:t>
       </w:r>
       <w:r>
         <w:t xml:space="preserve"> </w:t>
       </w:r>
       <w:r>
-        <w:t>”</w:t>
-      </w:r>
-      <w:proofErr w:type="gramEnd"/>
-      <w:r>
-        <w:t>.”],</w:t>
+        <w:t>”.”],</w:t>
       </w:r>
       <w:r>
         <w:t xml:space="preserve"> </w:t>
@@ -1797,49 +1569,25 @@
         <w:t xml:space="preserve"> </w:t>
       </w:r>
       <w:r>
-        <w:t>“.”</w:t>
-      </w:r>
-      <w:proofErr w:type="gramStart"/>
-      <w:r>
-        <w:t>,</w:t>
+        <w:t>“.”,</w:t>
       </w:r>
       <w:r>
         <w:t xml:space="preserve"> </w:t>
       </w:r>
       <w:r>
-        <w:t>”</w:t>
-      </w:r>
-      <w:proofErr w:type="gramEnd"/>
-      <w:r>
-        <w:t>.”</w:t>
-      </w:r>
-      <w:proofErr w:type="gramStart"/>
-      <w:r>
-        <w:t>,</w:t>
+        <w:t>”.”,</w:t>
       </w:r>
       <w:r>
         <w:t xml:space="preserve"> </w:t>
       </w:r>
       <w:r>
-        <w:t>”</w:t>
-      </w:r>
-      <w:proofErr w:type="gramEnd"/>
-      <w:r>
-        <w:t>.”</w:t>
-      </w:r>
-      <w:proofErr w:type="gramStart"/>
-      <w:r>
-        <w:t>,</w:t>
+        <w:t>”.”,</w:t>
       </w:r>
       <w:r>
         <w:t xml:space="preserve"> </w:t>
       </w:r>
       <w:r>
-        <w:t>”</w:t>
-      </w:r>
-      <w:proofErr w:type="gramEnd"/>
-      <w:r>
-        <w:t>.”]]</w:t>
+        <w:t>”.”]]</w:t>
       </w:r>
     </w:p>
     <w:p>
@@ -1853,15 +1601,7 @@
         <w:t>Después se cambian los “.” por None</w:t>
       </w:r>
       <w:r>
-        <w:t xml:space="preserve"> con replace_</w:t>
-      </w:r>
-      <w:proofErr w:type="gramStart"/>
-      <w:r>
-        <w:t>all(</w:t>
-      </w:r>
-      <w:proofErr w:type="gramEnd"/>
-      <w:r>
-        <w:t>)</w:t>
+        <w:t xml:space="preserve"> con replace_all()</w:t>
       </w:r>
       <w:r>
         <w:t>:</w:t>
@@ -1880,33 +1620,43 @@
         <w:rPr>
           <w:lang w:val="en-US"/>
         </w:rPr>
-        <w:t>[[“x”</w:t>
-      </w:r>
-      <w:proofErr w:type="gramStart"/>
+        <w:t>[[“x”, ”o”, None, None],</w:t>
+      </w:r>
       <w:r>
         <w:rPr>
           <w:lang w:val="en-US"/>
         </w:rPr>
-        <w:t>, ”o</w:t>
-      </w:r>
-      <w:proofErr w:type="gramEnd"/>
+        <w:t xml:space="preserve"> </w:t>
+      </w:r>
       <w:r>
         <w:rPr>
           <w:lang w:val="en-US"/>
         </w:rPr>
-        <w:t>”, None, None],</w:t>
+        <w:t xml:space="preserve">[“o”, None, None, </w:t>
       </w:r>
       <w:r>
         <w:rPr>
           <w:lang w:val="en-US"/>
         </w:rPr>
+        <w:t>None</w:t>
+      </w:r>
+      <w:r>
+        <w:rPr>
+          <w:lang w:val="en-US"/>
+        </w:rPr>
+        <w:t>],</w:t>
+      </w:r>
+      <w:r>
+        <w:rPr>
+          <w:lang w:val="en-US"/>
+        </w:rPr>
         <w:t xml:space="preserve"> </w:t>
       </w:r>
       <w:r>
         <w:rPr>
           <w:lang w:val="en-US"/>
         </w:rPr>
-        <w:t xml:space="preserve">[“o”, None, None, </w:t>
+        <w:t>[</w:t>
       </w:r>
       <w:r>
         <w:rPr>
@@ -1918,6 +1668,42 @@
         <w:rPr>
           <w:lang w:val="en-US"/>
         </w:rPr>
+        <w:t xml:space="preserve">, </w:t>
+      </w:r>
+      <w:r>
+        <w:rPr>
+          <w:lang w:val="en-US"/>
+        </w:rPr>
+        <w:t>None</w:t>
+      </w:r>
+      <w:r>
+        <w:rPr>
+          <w:lang w:val="en-US"/>
+        </w:rPr>
+        <w:t xml:space="preserve">, </w:t>
+      </w:r>
+      <w:r>
+        <w:rPr>
+          <w:lang w:val="en-US"/>
+        </w:rPr>
+        <w:t>None</w:t>
+      </w:r>
+      <w:r>
+        <w:rPr>
+          <w:lang w:val="en-US"/>
+        </w:rPr>
+        <w:t xml:space="preserve">, </w:t>
+      </w:r>
+      <w:r>
+        <w:rPr>
+          <w:lang w:val="en-US"/>
+        </w:rPr>
+        <w:t>None</w:t>
+      </w:r>
+      <w:r>
+        <w:rPr>
+          <w:lang w:val="en-US"/>
+        </w:rPr>
         <w:t>],</w:t>
       </w:r>
       <w:r>
@@ -1978,68 +1764,18 @@
         <w:rPr>
           <w:lang w:val="en-US"/>
         </w:rPr>
-        <w:t>],</w:t>
-      </w:r>
-      <w:r>
+        <w:t>]]</w:t>
+      </w:r>
+    </w:p>
+    <w:p>
+      <w:pPr>
+        <w:pStyle w:val="Prrafodelista"/>
+        <w:spacing w:after="200" w:line="300" w:lineRule="auto"/>
+        <w:ind w:left="720"/>
         <w:rPr>
           <w:lang w:val="en-US"/>
         </w:rPr>
-        <w:t xml:space="preserve"> </w:t>
-      </w:r>
-      <w:r>
-        <w:rPr>
-          <w:lang w:val="en-US"/>
-        </w:rPr>
-        <w:t>[</w:t>
-      </w:r>
-      <w:r>
-        <w:rPr>
-          <w:lang w:val="en-US"/>
-        </w:rPr>
-        <w:t>None</w:t>
-      </w:r>
-      <w:r>
-        <w:rPr>
-          <w:lang w:val="en-US"/>
-        </w:rPr>
-        <w:t xml:space="preserve">, </w:t>
-      </w:r>
-      <w:r>
-        <w:rPr>
-          <w:lang w:val="en-US"/>
-        </w:rPr>
-        <w:t>None</w:t>
-      </w:r>
-      <w:r>
-        <w:rPr>
-          <w:lang w:val="en-US"/>
-        </w:rPr>
-        <w:t xml:space="preserve">, </w:t>
-      </w:r>
-      <w:r>
-        <w:rPr>
-          <w:lang w:val="en-US"/>
-        </w:rPr>
-        <w:t>None</w:t>
-      </w:r>
-      <w:r>
-        <w:rPr>
-          <w:lang w:val="en-US"/>
-        </w:rPr>
-        <w:t xml:space="preserve">, </w:t>
-      </w:r>
-      <w:r>
-        <w:rPr>
-          <w:lang w:val="en-US"/>
-        </w:rPr>
-        <w:t>None</w:t>
-      </w:r>
-      <w:r>
-        <w:rPr>
-          <w:lang w:val="en-US"/>
-        </w:rPr>
-        <w:t>]]</w:t>
-      </w:r>
+      </w:pPr>
     </w:p>
     <w:p>
       <w:pPr>
@@ -2047,16 +1783,6 @@
         <w:spacing w:after="200" w:line="300" w:lineRule="auto"/>
         <w:ind w:left="720"/>
         <w:rPr>
-          <w:lang w:val="en-US"/>
-        </w:rPr>
-      </w:pPr>
-    </w:p>
-    <w:p>
-      <w:pPr>
-        <w:pStyle w:val="Prrafodelista"/>
-        <w:spacing w:after="200" w:line="300" w:lineRule="auto"/>
-        <w:ind w:left="720"/>
-        <w:rPr>
           <w:lang w:val="es-ES"/>
         </w:rPr>
       </w:pPr>
@@ -2064,97 +1790,13 @@
         <w:rPr>
           <w:lang w:val="es-ES"/>
         </w:rPr>
-        <w:t xml:space="preserve">Por </w:t>
-      </w:r>
-      <w:proofErr w:type="gramStart"/>
+        <w:t>Por último se transforman a</w:t>
+      </w:r>
       <w:r>
         <w:rPr>
           <w:lang w:val="es-ES"/>
         </w:rPr>
-        <w:t>último</w:t>
-      </w:r>
-      <w:proofErr w:type="gramEnd"/>
-      <w:r>
-        <w:rPr>
-          <w:lang w:val="es-ES"/>
-        </w:rPr>
-        <w:t xml:space="preserve"> se transforman a</w:t>
-      </w:r>
-      <w:r>
-        <w:rPr>
-          <w:lang w:val="es-ES"/>
-        </w:rPr>
-        <w:t xml:space="preserve"> la clase SquareBoard con </w:t>
-      </w:r>
-      <w:proofErr w:type="gramStart"/>
-      <w:r>
-        <w:rPr>
-          <w:lang w:val="es-ES"/>
-        </w:rPr>
-        <w:t>cls.from</w:t>
-      </w:r>
-      <w:proofErr w:type="gramEnd"/>
-      <w:r>
-        <w:rPr>
-          <w:lang w:val="es-ES"/>
-        </w:rPr>
-        <w:t>_</w:t>
-      </w:r>
-      <w:proofErr w:type="gramStart"/>
-      <w:r>
-        <w:rPr>
-          <w:lang w:val="es-ES"/>
-        </w:rPr>
-        <w:t>list(</w:t>
-      </w:r>
-      <w:proofErr w:type="gramEnd"/>
-      <w:r>
-        <w:rPr>
-          <w:lang w:val="es-ES"/>
-        </w:rPr>
-        <w:t>), lo cual llama a map_</w:t>
-      </w:r>
-      <w:proofErr w:type="gramStart"/>
-      <w:r>
-        <w:rPr>
-          <w:lang w:val="es-ES"/>
-        </w:rPr>
-        <w:t>list(</w:t>
-      </w:r>
-      <w:proofErr w:type="gramEnd"/>
-      <w:r>
-        <w:rPr>
-          <w:lang w:val="es-ES"/>
-        </w:rPr>
-        <w:t>) y le aplica a cada una de las listas internas el LinearBoard.from_</w:t>
-      </w:r>
-      <w:proofErr w:type="gramStart"/>
-      <w:r>
-        <w:rPr>
-          <w:lang w:val="es-ES"/>
-        </w:rPr>
-        <w:t>list(</w:t>
-      </w:r>
-      <w:proofErr w:type="gramEnd"/>
-      <w:r>
-        <w:rPr>
-          <w:lang w:val="es-ES"/>
-        </w:rPr>
-        <w:t xml:space="preserve">) de LinearBoard, que hace </w:t>
-      </w:r>
-      <w:proofErr w:type="gramStart"/>
-      <w:r>
-        <w:rPr>
-          <w:lang w:val="es-ES"/>
-        </w:rPr>
-        <w:t>board._</w:t>
-      </w:r>
-      <w:proofErr w:type="gramEnd"/>
-      <w:r>
-        <w:rPr>
-          <w:lang w:val="es-ES"/>
-        </w:rPr>
-        <w:t>columns = data. Los datos que le hemos aportado sustituyen a la lista temporal de make_list que se inicializa en LinearBoard, por lo que se entiende que lo que queda en SquareBoard son 4 listas de LinearBoard, aportadas en un LoL traducido de una cadena simple.</w:t>
+        <w:t xml:space="preserve"> la clase SquareBoard con cls.from_list(), lo cual llama a map_list() y le aplica a cada una de las listas internas el LinearBoard.from_list() de LinearBoard, que hace board._columns = data. Los datos que le hemos aportado sustituyen a la lista temporal de make_list que se inicializa en LinearBoard, por lo que se entiende que lo que queda en SquareBoard son 4 listas de LinearBoard, aportadas en un LoL traducido de una cadena simple.</w:t>
       </w:r>
     </w:p>
     <w:p>
@@ -2257,13 +1899,8 @@
       <w:r>
         <w:t xml:space="preserve"> </w:t>
       </w:r>
-      <w:proofErr w:type="gramStart"/>
-      <w:r>
-        <w:t>Además</w:t>
-      </w:r>
-      <w:proofErr w:type="gramEnd"/>
-      <w:r>
-        <w:t xml:space="preserve"> podría ser muy problemático porque las simulaciones del oráculo se anidan y replicar eso puede ser muy complejo, lioso y exigente.</w:t>
+      <w:r>
+        <w:t>Además podría ser muy problemático porque las simulaciones del oráculo se anidan y replicar eso puede ser muy complejo, lioso y exigente.</w:t>
       </w:r>
     </w:p>
     <w:p>
@@ -2307,15 +1944,7 @@
         <w:t>En</w:t>
       </w:r>
       <w:r>
-        <w:t xml:space="preserve"> el mejor de los casos donde sólo hay una columna que no es FULL y es ganadora, se hace sólo 1 deepcopy. En el caso de que no </w:t>
-      </w:r>
-      <w:proofErr w:type="gramStart"/>
-      <w:r>
-        <w:t>hayan</w:t>
-      </w:r>
-      <w:proofErr w:type="gramEnd"/>
-      <w:r>
-        <w:t xml:space="preserve"> columnas completas y todas sean WIN, serían N deepcopies</w:t>
+        <w:t xml:space="preserve"> el mejor de los casos donde sólo hay una columna que no es FULL y es ganadora, se hace sólo 1 deepcopy. En el caso de que no hayan columnas completas y todas sean WIN, serían N deepcopies</w:t>
       </w:r>
       <w:r>
         <w:t>, porque win sólo hace una deepcopy y si se confirma win no se sigue a lose</w:t>
@@ -2331,15 +1960,7 @@
         <w:ind w:left="720"/>
       </w:pPr>
       <w:r>
-        <w:t>En el peor de los casos, donde todas son LOSE y no hay columnas llenas, tendríamos por cada columna 1 (comprueba si es WIN), + 1 (primera deepcopy de _is_losing_</w:t>
-      </w:r>
-      <w:proofErr w:type="gramStart"/>
-      <w:r>
-        <w:t>bet(</w:t>
-      </w:r>
-      <w:proofErr w:type="gramEnd"/>
-      <w:r>
-        <w:t xml:space="preserve">)) + </w:t>
+        <w:t xml:space="preserve">En el peor de los casos, donde todas son LOSE y no hay columnas llenas, tendríamos por cada columna 1 (comprueba si es WIN), + 1 (primera deepcopy de _is_losing_bet()) + </w:t>
       </w:r>
       <w:r>
         <w:t>1*</w:t>
@@ -2411,48 +2032,28 @@
         </w:rPr>
         <w:t xml:space="preserve">Los valores de ColumnClassification no son </w:t>
       </w:r>
-      <w:proofErr w:type="gramStart"/>
       <w:r>
         <w:rPr>
           <w:rFonts w:ascii="Consolas" w:eastAsia="Consolas" w:hAnsi="Consolas" w:cs="Consolas"/>
           <w:sz w:val="21"/>
           <w:szCs w:val="21"/>
         </w:rPr>
-        <w:t>auto(</w:t>
-      </w:r>
-      <w:proofErr w:type="gramEnd"/>
+        <w:t>auto()</w:t>
+      </w:r>
+      <w:r>
+        <w:rPr>
+          <w:sz w:val="21"/>
+          <w:szCs w:val="21"/>
+        </w:rPr>
+        <w:t xml:space="preserve">, sino números elegidos a mano. ¿Dónde se usan esos números y qué pasaría si pusieras </w:t>
+      </w:r>
       <w:r>
         <w:rPr>
           <w:rFonts w:ascii="Consolas" w:eastAsia="Consolas" w:hAnsi="Consolas" w:cs="Consolas"/>
           <w:sz w:val="21"/>
           <w:szCs w:val="21"/>
         </w:rPr>
-        <w:t>)</w:t>
-      </w:r>
-      <w:r>
-        <w:rPr>
-          <w:sz w:val="21"/>
-          <w:szCs w:val="21"/>
-        </w:rPr>
-        <w:t xml:space="preserve">, sino números elegidos a mano. ¿Dónde se usan esos números y qué pasaría si pusieras </w:t>
-      </w:r>
-      <w:proofErr w:type="gramStart"/>
-      <w:r>
-        <w:rPr>
-          <w:rFonts w:ascii="Consolas" w:eastAsia="Consolas" w:hAnsi="Consolas" w:cs="Consolas"/>
-          <w:sz w:val="21"/>
-          <w:szCs w:val="21"/>
-        </w:rPr>
-        <w:t>auto(</w:t>
-      </w:r>
-      <w:proofErr w:type="gramEnd"/>
-      <w:r>
-        <w:rPr>
-          <w:rFonts w:ascii="Consolas" w:eastAsia="Consolas" w:hAnsi="Consolas" w:cs="Consolas"/>
-          <w:sz w:val="21"/>
-          <w:szCs w:val="21"/>
-        </w:rPr>
-        <w:t>)</w:t>
+        <w:t>auto()</w:t>
       </w:r>
       <w:r>
         <w:rPr>
@@ -2472,78 +2073,14 @@
           <w:sz w:val="21"/>
           <w:szCs w:val="21"/>
         </w:rPr>
-        <w:t xml:space="preserve">Los números sólo se usan en </w:t>
-      </w:r>
-      <w:proofErr w:type="gramStart"/>
-      <w:r>
-        <w:rPr>
-          <w:sz w:val="21"/>
-          <w:szCs w:val="21"/>
-        </w:rPr>
-        <w:t>Player._</w:t>
-      </w:r>
-      <w:proofErr w:type="gramEnd"/>
-      <w:r>
-        <w:rPr>
-          <w:sz w:val="21"/>
-          <w:szCs w:val="21"/>
-        </w:rPr>
-        <w:t>choose_a_</w:t>
-      </w:r>
-      <w:proofErr w:type="gramStart"/>
-      <w:r>
-        <w:rPr>
-          <w:sz w:val="21"/>
-          <w:szCs w:val="21"/>
-        </w:rPr>
-        <w:t>recommendation(</w:t>
-      </w:r>
-      <w:proofErr w:type="gramEnd"/>
-      <w:r>
-        <w:rPr>
-          <w:sz w:val="21"/>
-          <w:szCs w:val="21"/>
-        </w:rPr>
-        <w:t>) y los valores del Enum establecen un orden de prioridad entre las recomendaciones.</w:t>
-      </w:r>
-      <w:r>
-        <w:rPr>
-          <w:sz w:val="21"/>
-          <w:szCs w:val="21"/>
-        </w:rPr>
-        <w:t xml:space="preserve"> El </w:t>
-      </w:r>
-      <w:proofErr w:type="gramStart"/>
-      <w:r>
-        <w:rPr>
-          <w:sz w:val="21"/>
-          <w:szCs w:val="21"/>
-        </w:rPr>
-        <w:t>sorted(</w:t>
-      </w:r>
-      <w:proofErr w:type="gramEnd"/>
-      <w:r>
-        <w:rPr>
-          <w:sz w:val="21"/>
-          <w:szCs w:val="21"/>
-        </w:rPr>
-        <w:t xml:space="preserve">) ordena de mayor a menor sobre las recomendaciones que son válidas (no son columnas llenas) y luego devuelve la que tiene el mayor valor. Si se usara </w:t>
-      </w:r>
-      <w:proofErr w:type="gramStart"/>
-      <w:r>
-        <w:rPr>
-          <w:sz w:val="21"/>
-          <w:szCs w:val="21"/>
-        </w:rPr>
-        <w:t>auto(</w:t>
-      </w:r>
-      <w:proofErr w:type="gramEnd"/>
-      <w:r>
-        <w:rPr>
-          <w:sz w:val="21"/>
-          <w:szCs w:val="21"/>
-        </w:rPr>
-        <w:t xml:space="preserve">) los valores se escogerían según el orden de declaración, lo cual haría que el juego sea menos escalable en </w:t>
+        <w:t>Los números sólo se usan en Player._choose_a_recommendation() y los valores del Enum establecen un orden de prioridad entre las recomendaciones.</w:t>
+      </w:r>
+      <w:r>
+        <w:rPr>
+          <w:sz w:val="21"/>
+          <w:szCs w:val="21"/>
+        </w:rPr>
+        <w:t xml:space="preserve"> El sorted() ordena de mayor a menor sobre las recomendaciones que son válidas (no son columnas llenas) y luego devuelve la que tiene el mayor valor. Si se usara auto() los valores se escogerían según el orden de declaración, lo cual haría que el juego sea menos escalable en </w:t>
       </w:r>
       <w:r>
         <w:rPr>
@@ -2551,23 +2088,7 @@
           <w:szCs w:val="21"/>
         </w:rPr>
         <w:lastRenderedPageBreak/>
-        <w:t xml:space="preserve">el futuro y podría introducir errores según el orden que se establezca. Además, el -1 en FULL no se podría tener si pusiéramos todos en </w:t>
-      </w:r>
-      <w:proofErr w:type="gramStart"/>
-      <w:r>
-        <w:rPr>
-          <w:sz w:val="21"/>
-          <w:szCs w:val="21"/>
-        </w:rPr>
-        <w:t>auto(</w:t>
-      </w:r>
-      <w:proofErr w:type="gramEnd"/>
-      <w:r>
-        <w:rPr>
-          <w:sz w:val="21"/>
-          <w:szCs w:val="21"/>
-        </w:rPr>
-        <w:t>).</w:t>
+        <w:t>el futuro y podría introducir errores según el orden que se establezca. Además, el -1 en FULL no se podría tener si pusiéramos todos en auto().</w:t>
       </w:r>
     </w:p>
     <w:p>
@@ -3238,7 +2759,6 @@
           <w:szCs w:val="21"/>
         </w:rPr>
       </w:pPr>
-      <w:proofErr w:type="gramStart"/>
       <w:r>
         <w:rPr>
           <w:b/>
@@ -3253,15 +2773,7 @@
           <w:sz w:val="21"/>
           <w:szCs w:val="21"/>
         </w:rPr>
-        <w:t>¿</w:t>
-      </w:r>
-      <w:proofErr w:type="gramEnd"/>
-      <w:r>
-        <w:rPr>
-          <w:sz w:val="21"/>
-          <w:szCs w:val="21"/>
-        </w:rPr>
-        <w:t>Por qué la clave de la caché incluye el carácter del jugador y no solo el código del tablero?</w:t>
+        <w:t>¿Por qué la clave de la caché incluye el carácter del jugador y no solo el código del tablero?</w:t>
       </w:r>
     </w:p>
     <w:p>
@@ -3281,23 +2793,7 @@
           <w:sz w:val="21"/>
           <w:szCs w:val="21"/>
         </w:rPr>
-        <w:t xml:space="preserve"> la victoria no es cosa del tablero, sino de uno de los players. Se tiene que generar la clave en función del tablero y del player al que se quiere dedicar, porque cuando uno gana el otro pierde. Un jugador podría leer de la caché una jugada evaluada para su rival dependiendo de cómo se almacenen las claves. Ahora mismo cada player tiene su </w:t>
-      </w:r>
-      <w:proofErr w:type="gramStart"/>
-      <w:r>
-        <w:rPr>
-          <w:sz w:val="21"/>
-          <w:szCs w:val="21"/>
-        </w:rPr>
-        <w:t>oráculo</w:t>
-      </w:r>
-      <w:proofErr w:type="gramEnd"/>
-      <w:r>
-        <w:rPr>
-          <w:sz w:val="21"/>
-          <w:szCs w:val="21"/>
-        </w:rPr>
-        <w:t xml:space="preserve"> pero es importante que sea así.</w:t>
+        <w:t xml:space="preserve"> la victoria no es cosa del tablero, sino de uno de los players. Se tiene que generar la clave en función del tablero y del player al que se quiere dedicar, porque cuando uno gana el otro pierde. Un jugador podría leer de la caché una jugada evaluada para su rival dependiendo de cómo se almacenen las claves. Ahora mismo cada player tiene su oráculo pero es importante que sea así.</w:t>
       </w:r>
     </w:p>
     <w:p>
@@ -3309,7 +2805,6 @@
           <w:szCs w:val="21"/>
         </w:rPr>
       </w:pPr>
-      <w:proofErr w:type="gramStart"/>
       <w:r>
         <w:rPr>
           <w:b/>
@@ -3324,15 +2819,7 @@
           <w:sz w:val="21"/>
           <w:szCs w:val="21"/>
         </w:rPr>
-        <w:t>¿</w:t>
-      </w:r>
-      <w:proofErr w:type="gramEnd"/>
-      <w:r>
-        <w:rPr>
-          <w:sz w:val="21"/>
-          <w:szCs w:val="21"/>
-        </w:rPr>
-        <w:t>Qué diferencia hay entre el oráculo memoizado y el que aprende, si los dos usan el mismo diccionario?</w:t>
+        <w:t>¿Qué diferencia hay entre el oráculo memoizado y el que aprende, si los dos usan el mismo diccionario?</w:t>
       </w:r>
     </w:p>
     <w:p>
@@ -3367,23 +2854,7 @@
           <w:sz w:val="21"/>
           <w:szCs w:val="21"/>
         </w:rPr>
-        <w:t xml:space="preserve"> En </w:t>
-      </w:r>
-      <w:proofErr w:type="gramStart"/>
-      <w:r>
-        <w:rPr>
-          <w:sz w:val="21"/>
-          <w:szCs w:val="21"/>
-        </w:rPr>
-        <w:t>realidad</w:t>
-      </w:r>
-      <w:proofErr w:type="gramEnd"/>
-      <w:r>
-        <w:rPr>
-          <w:sz w:val="21"/>
-          <w:szCs w:val="21"/>
-        </w:rPr>
-        <w:t xml:space="preserve"> lo único que aporta por sí mismo el memoizado es potencialmente rendimiento, pero su utilidad está en que es la base del que aprende y éste hereda de “él”.</w:t>
+        <w:t xml:space="preserve"> En realidad lo único que aporta por sí mismo el memoizado es potencialmente rendimiento, pero su utilidad está en que es la base del que aprende y éste hereda de “él”.</w:t>
       </w:r>
       <w:r>
         <w:rPr>
@@ -3461,23 +2932,7 @@
           <w:sz w:val="21"/>
           <w:szCs w:val="21"/>
         </w:rPr>
-        <w:t xml:space="preserve"> El bucle se para cuando hay una situación potencial de WIN o MAYBE, así se define en BaseOracle.full_or_</w:t>
-      </w:r>
-      <w:proofErr w:type="gramStart"/>
-      <w:r>
-        <w:rPr>
-          <w:sz w:val="21"/>
-          <w:szCs w:val="21"/>
-        </w:rPr>
-        <w:t>win(</w:t>
-      </w:r>
-      <w:proofErr w:type="gramEnd"/>
-      <w:r>
-        <w:rPr>
-          <w:sz w:val="21"/>
-          <w:szCs w:val="21"/>
-        </w:rPr>
-        <w:t>) (que daría false en esa situación, por lo que en el if de LearningOracle.back_track que condiciona al fin del bucle se niega con not y lleva al break).</w:t>
+        <w:t xml:space="preserve"> El bucle se para cuando hay una situación potencial de WIN o MAYBE, así se define en BaseOracle.full_or_win() (que daría false en esa situación, por lo que en el if de LearningOracle.back_track que condiciona al fin del bucle se niega con not y lleva al break).</w:t>
       </w:r>
     </w:p>
     <w:p>
@@ -3714,23 +3169,7 @@
           <w:sz w:val="21"/>
           <w:szCs w:val="21"/>
         </w:rPr>
-        <w:t xml:space="preserve">El jugador humano hereda del jugador </w:t>
-      </w:r>
-      <w:proofErr w:type="gramStart"/>
-      <w:r>
-        <w:rPr>
-          <w:sz w:val="21"/>
-          <w:szCs w:val="21"/>
-        </w:rPr>
-        <w:t>máquina</w:t>
-      </w:r>
-      <w:proofErr w:type="gramEnd"/>
-      <w:r>
-        <w:rPr>
-          <w:sz w:val="21"/>
-          <w:szCs w:val="21"/>
-        </w:rPr>
-        <w:t xml:space="preserve"> pero solo sobrescribe un método. ¿Cuál, y por qué eso basta para que el resto del programa no note la diferencia?</w:t>
+        <w:t>El jugador humano hereda del jugador máquina pero solo sobrescribe un método. ¿Cuál, y por qué eso basta para que el resto del programa no note la diferencia?</w:t>
       </w:r>
     </w:p>
     <w:p>
@@ -3753,23 +3192,7 @@
           <w:sz w:val="21"/>
           <w:szCs w:val="21"/>
         </w:rPr>
-        <w:t>l único método sobreescrito es _ask_</w:t>
-      </w:r>
-      <w:proofErr w:type="gramStart"/>
-      <w:r>
-        <w:rPr>
-          <w:sz w:val="21"/>
-          <w:szCs w:val="21"/>
-        </w:rPr>
-        <w:t>oracle(</w:t>
-      </w:r>
-      <w:proofErr w:type="gramEnd"/>
-      <w:r>
-        <w:rPr>
-          <w:sz w:val="21"/>
-          <w:szCs w:val="21"/>
-        </w:rPr>
-        <w:t>), porque el oráculo del HumanPlayer es el propio jugador humano, así que se pide el input. El resto del programa funciona correctamente porque el input está vigilado para que respete el tipo y rango, y posteriormente se adapta para que el valor sea de la clase ColumnRecommendations</w:t>
+        <w:t>l único método sobreescrito es _ask_oracle(), porque el oráculo del HumanPlayer es el propio jugador humano, así que se pide el input. El resto del programa funciona correctamente porque el input está vigilado para que respete el tipo y rango, y posteriormente se adapta para que el valor sea de la clase ColumnRecommendations</w:t>
       </w:r>
       <w:r>
         <w:rPr>
@@ -3876,23 +3299,7 @@
           <w:sz w:val="21"/>
           <w:szCs w:val="21"/>
         </w:rPr>
-        <w:t xml:space="preserve">Las jugadas podrían ser siempre las mismas porque </w:t>
-      </w:r>
-      <w:proofErr w:type="gramStart"/>
-      <w:r>
-        <w:rPr>
-          <w:sz w:val="21"/>
-          <w:szCs w:val="21"/>
-        </w:rPr>
-        <w:t>sorted(</w:t>
-      </w:r>
-      <w:proofErr w:type="gramEnd"/>
-      <w:r>
-        <w:rPr>
-          <w:sz w:val="21"/>
-          <w:szCs w:val="21"/>
-        </w:rPr>
-        <w:t>) ordenaría de manera estable, lo que podría dar como resultados oráculos explotables o menores posibilidades de aprendizaje. Cogerla aleatoriamente hace que el oráculo y el juego funcionen mejor en general.</w:t>
+        <w:t>Las jugadas podrían ser siempre las mismas porque sorted() ordenaría de manera estable, lo que podría dar como resultados oráculos explotables o menores posibilidades de aprendizaje. Cogerla aleatoriamente hace que el oráculo y el juego funcionen mejor en general.</w:t>
       </w:r>
     </w:p>
     <w:p>
@@ -3971,23 +3378,7 @@
           <w:sz w:val="21"/>
           <w:szCs w:val="21"/>
         </w:rPr>
-        <w:t xml:space="preserve"> al comparar dos recomendaciones sólo comparemos el valor de ambas, de modo que el índice no interviene al momento de calcular si son diferentes (lo que podría introducir un sesgo que haría que el oráculo fuera predecible, no tendría sentido el </w:t>
-      </w:r>
-      <w:proofErr w:type="gramStart"/>
-      <w:r>
-        <w:rPr>
-          <w:sz w:val="21"/>
-          <w:szCs w:val="21"/>
-        </w:rPr>
-        <w:t>random.choice</w:t>
-      </w:r>
-      <w:proofErr w:type="gramEnd"/>
-      <w:r>
-        <w:rPr>
-          <w:sz w:val="21"/>
-          <w:szCs w:val="21"/>
-        </w:rPr>
-        <w:t xml:space="preserve"> porque no funcionaría la condición). El contrato que se rompe es que el índice sí se hashea de todas formas en __hash__.</w:t>
+        <w:t xml:space="preserve"> al comparar dos recomendaciones sólo comparemos el valor de ambas, de modo que el índice no interviene al momento de calcular si son diferentes (lo que podría introducir un sesgo que haría que el oráculo fuera predecible, no tendría sentido el random.choice porque no funcionaría la condición). El contrato que se rompe es que el índice sí se hashea de todas formas en __hash__.</w:t>
       </w:r>
     </w:p>
     <w:p>
@@ -4051,62 +3442,14 @@
           <w:sz w:val="21"/>
           <w:szCs w:val="21"/>
         </w:rPr>
-        <w:t xml:space="preserve"> Eso si esta pregunta se refiere a _on_</w:t>
-      </w:r>
-      <w:proofErr w:type="gramStart"/>
-      <w:r>
-        <w:rPr>
-          <w:sz w:val="21"/>
-          <w:szCs w:val="21"/>
-        </w:rPr>
-        <w:t>lose(</w:t>
-      </w:r>
-      <w:proofErr w:type="gramEnd"/>
-      <w:r>
-        <w:rPr>
-          <w:sz w:val="21"/>
-          <w:szCs w:val="21"/>
-        </w:rPr>
-        <w:t>), que en este caso es sobreescrita por ReportingPlayer, que llama a su oráculo y hace que el oráculo haga LearningOracle.back_</w:t>
-      </w:r>
-      <w:proofErr w:type="gramStart"/>
-      <w:r>
-        <w:rPr>
-          <w:sz w:val="21"/>
-          <w:szCs w:val="21"/>
-        </w:rPr>
-        <w:t>track(</w:t>
-      </w:r>
-      <w:proofErr w:type="gramEnd"/>
-      <w:r>
-        <w:rPr>
-          <w:sz w:val="21"/>
-          <w:szCs w:val="21"/>
-        </w:rPr>
-        <w:t>)</w:t>
-      </w:r>
-      <w:r>
-        <w:rPr>
-          <w:sz w:val="21"/>
-          <w:szCs w:val="21"/>
-        </w:rPr>
-        <w:t xml:space="preserve"> cuando se pierde la partida. Si el oráculo no aprende porque no es dificultad difícil, el código no se rompe porque el oráculo base también tiene un hook en BaseOracle.back_</w:t>
-      </w:r>
-      <w:proofErr w:type="gramStart"/>
-      <w:r>
-        <w:rPr>
-          <w:sz w:val="21"/>
-          <w:szCs w:val="21"/>
-        </w:rPr>
-        <w:t>track(</w:t>
-      </w:r>
-      <w:proofErr w:type="gramEnd"/>
-      <w:r>
-        <w:rPr>
-          <w:sz w:val="21"/>
-          <w:szCs w:val="21"/>
-        </w:rPr>
-        <w:t>), que no hace nada hasta que LearningOracle lo sobreescribe. Entonces este código funciona en realidad para hacer que en dificultad difícil la IA aprenda cuando pierde, pero si no está en esa dificultad el código no se rompe, y para el HumanPlayer por supuesto no pasa nada, porque no sobreescribe el método vacío base. Además, no hay método _on_win, no existe.</w:t>
+        <w:t xml:space="preserve"> Eso si esta pregunta se refiere a _on_lose(), que en este caso es sobreescrita por ReportingPlayer, que llama a su oráculo y hace que el oráculo haga LearningOracle.back_track()</w:t>
+      </w:r>
+      <w:r>
+        <w:rPr>
+          <w:sz w:val="21"/>
+          <w:szCs w:val="21"/>
+        </w:rPr>
+        <w:t xml:space="preserve"> cuando se pierde la partida. Si el oráculo no aprende porque no es dificultad difícil, el código no se rompe porque el oráculo base también tiene un hook en BaseOracle.back_track(), que no hace nada hasta que LearningOracle lo sobreescribe. Entonces este código funciona en realidad para hacer que en dificultad difícil la IA aprenda cuando pierde, pero si no está en esa dificultad el código no se rompe, y para el HumanPlayer por supuesto no pasa nada, porque no sobreescribe el método vacío base. Además, no hay método _on_win, no existe.</w:t>
       </w:r>
     </w:p>
     <w:p>
@@ -4177,41 +3520,29 @@
         </w:rPr>
         <w:t xml:space="preserve"> asigna la relación en los dos sentidos. Explica por qué dentro del setter se escribe en </w:t>
       </w:r>
-      <w:proofErr w:type="gramStart"/>
       <w:r>
         <w:rPr>
           <w:rFonts w:ascii="Consolas" w:eastAsia="Consolas" w:hAnsi="Consolas" w:cs="Consolas"/>
           <w:sz w:val="21"/>
           <w:szCs w:val="21"/>
         </w:rPr>
-        <w:t>self._</w:t>
-      </w:r>
-      <w:proofErr w:type="gramEnd"/>
+        <w:t>self._opponent</w:t>
+      </w:r>
+      <w:r>
+        <w:rPr>
+          <w:sz w:val="21"/>
+          <w:szCs w:val="21"/>
+        </w:rPr>
+        <w:t xml:space="preserve"> y no en </w:t>
+      </w:r>
       <w:r>
         <w:rPr>
           <w:rFonts w:ascii="Consolas" w:eastAsia="Consolas" w:hAnsi="Consolas" w:cs="Consolas"/>
           <w:sz w:val="21"/>
           <w:szCs w:val="21"/>
         </w:rPr>
-        <w:t>opponent</w:t>
-      </w:r>
-      <w:r>
-        <w:rPr>
-          <w:sz w:val="21"/>
-          <w:szCs w:val="21"/>
-        </w:rPr>
-        <w:t xml:space="preserve"> y no en </w:t>
-      </w:r>
-      <w:proofErr w:type="gramStart"/>
-      <w:r>
-        <w:rPr>
-          <w:rFonts w:ascii="Consolas" w:eastAsia="Consolas" w:hAnsi="Consolas" w:cs="Consolas"/>
-          <w:sz w:val="21"/>
-          <w:szCs w:val="21"/>
-        </w:rPr>
         <w:t>self.opponent</w:t>
       </w:r>
-      <w:proofErr w:type="gramEnd"/>
       <w:r>
         <w:rPr>
           <w:sz w:val="21"/>
@@ -4230,94 +3561,56 @@
           <w:sz w:val="21"/>
           <w:szCs w:val="21"/>
         </w:rPr>
-        <w:t xml:space="preserve">Porque en </w:t>
-      </w:r>
-      <w:proofErr w:type="gramStart"/>
-      <w:r>
-        <w:rPr>
-          <w:sz w:val="21"/>
-          <w:szCs w:val="21"/>
-        </w:rPr>
-        <w:t>s</w:t>
-      </w:r>
-      <w:r>
-        <w:rPr>
-          <w:sz w:val="21"/>
-          <w:szCs w:val="21"/>
-        </w:rPr>
-        <w:t>elf.opponent</w:t>
-      </w:r>
-      <w:proofErr w:type="gramEnd"/>
-      <w:r>
-        <w:rPr>
-          <w:sz w:val="21"/>
-          <w:szCs w:val="21"/>
-        </w:rPr>
-        <w:t xml:space="preserve"> hay un bucle que se llama a sí mismo continuamente. En </w:t>
-      </w:r>
-      <w:proofErr w:type="gramStart"/>
-      <w:r>
-        <w:rPr>
-          <w:sz w:val="21"/>
-          <w:szCs w:val="21"/>
-        </w:rPr>
-        <w:t>realidad</w:t>
-      </w:r>
-      <w:proofErr w:type="gramEnd"/>
-      <w:r>
-        <w:rPr>
-          <w:sz w:val="21"/>
-          <w:szCs w:val="21"/>
-        </w:rPr>
-        <w:t xml:space="preserve"> no llama a </w:t>
-      </w:r>
-      <w:proofErr w:type="gramStart"/>
-      <w:r>
-        <w:rPr>
-          <w:sz w:val="21"/>
-          <w:szCs w:val="21"/>
-        </w:rPr>
-        <w:t>self._</w:t>
-      </w:r>
-      <w:proofErr w:type="gramEnd"/>
-      <w:r>
-        <w:rPr>
-          <w:sz w:val="21"/>
-          <w:szCs w:val="21"/>
-        </w:rPr>
-        <w:t xml:space="preserve">opponent, así que para poder escribir en el atributo real hay que escribir directamente. La utilidad de </w:t>
-      </w:r>
-      <w:proofErr w:type="gramStart"/>
-      <w:r>
-        <w:rPr>
-          <w:sz w:val="21"/>
-          <w:szCs w:val="21"/>
-        </w:rPr>
-        <w:t>self.opponent</w:t>
-      </w:r>
-      <w:proofErr w:type="gramEnd"/>
-      <w:r>
-        <w:rPr>
-          <w:sz w:val="21"/>
-          <w:szCs w:val="21"/>
-        </w:rPr>
-        <w:t xml:space="preserve"> no es escribir manualmente en </w:t>
-      </w:r>
-      <w:proofErr w:type="gramStart"/>
-      <w:r>
-        <w:rPr>
-          <w:sz w:val="21"/>
-          <w:szCs w:val="21"/>
-        </w:rPr>
-        <w:t>self._</w:t>
-      </w:r>
-      <w:proofErr w:type="gramEnd"/>
-      <w:r>
-        <w:rPr>
-          <w:sz w:val="21"/>
-          <w:szCs w:val="21"/>
-        </w:rPr>
-        <w:t>opponent.</w:t>
+        <w:t>Porque en s</w:t>
+      </w:r>
+      <w:r>
+        <w:rPr>
+          <w:sz w:val="21"/>
+          <w:szCs w:val="21"/>
+        </w:rPr>
+        <w:t xml:space="preserve">elf.opponent hay un bucle que se llama a sí mismo continuamente. En realidad no </w:t>
+      </w:r>
+      <w:r>
+        <w:rPr>
+          <w:sz w:val="21"/>
+          <w:szCs w:val="21"/>
+        </w:rPr>
+        <w:t>escribe</w:t>
+      </w:r>
+      <w:r>
+        <w:rPr>
+          <w:sz w:val="21"/>
+          <w:szCs w:val="21"/>
+        </w:rPr>
+        <w:t xml:space="preserve"> </w:t>
+      </w:r>
+      <w:r>
+        <w:rPr>
+          <w:sz w:val="21"/>
+          <w:szCs w:val="21"/>
+        </w:rPr>
+        <w:t>en</w:t>
+      </w:r>
+      <w:r>
+        <w:rPr>
+          <w:sz w:val="21"/>
+          <w:szCs w:val="21"/>
+        </w:rPr>
+        <w:t xml:space="preserve"> self._opponent, así que para poder escribir en el atributo real hay que escribir directamente</w:t>
+      </w:r>
+      <w:r>
+        <w:rPr>
+          <w:sz w:val="21"/>
+          <w:szCs w:val="21"/>
+        </w:rPr>
+        <w:t>.</w:t>
+      </w:r>
+      <w:r>
+        <w:rPr>
+          <w:sz w:val="21"/>
+          <w:szCs w:val="21"/>
+        </w:rPr>
+        <w:t xml:space="preserve"> No entiendo perfectamente cómo funcionan estos decoradores y el setter.</w:t>
       </w:r>
     </w:p>
     <w:p>
@@ -4361,23 +3654,7 @@
           <w:szCs w:val="21"/>
         </w:rPr>
         <w:lastRenderedPageBreak/>
-        <w:t xml:space="preserve">Un error de diseño que SÍ he arreglado en el código es que en </w:t>
-      </w:r>
-      <w:proofErr w:type="gramStart"/>
-      <w:r>
-        <w:rPr>
-          <w:sz w:val="21"/>
-          <w:szCs w:val="21"/>
-        </w:rPr>
-        <w:t>Player._</w:t>
-      </w:r>
-      <w:proofErr w:type="gramEnd"/>
-      <w:r>
-        <w:rPr>
-          <w:sz w:val="21"/>
-          <w:szCs w:val="21"/>
-        </w:rPr>
-        <w:t>play_on, el código de tablero que se usa en back_track se guarda después de mover, y no al momento de decidir, así que el oráculo que aprende literalmente no funcionaba. Simplemente he cambiado el orden de dos líneas de código y ya está bien.</w:t>
+        <w:t>Un error de diseño que SÍ he arreglado en el código es que en Player._play_on, el código de tablero que se usa en back_track se guarda después de mover, y no al momento de decidir, así que el oráculo que aprende literalmente no funcionaba. Simplemente he cambiado el orden de dos líneas de código y ya está bien.</w:t>
       </w:r>
     </w:p>
     <w:p>
@@ -4390,23 +3667,32 @@
           <w:lang w:val="en-US"/>
         </w:rPr>
       </w:pPr>
-      <w:proofErr w:type="gramStart"/>
       <w:r>
         <w:rPr>
           <w:sz w:val="21"/>
           <w:szCs w:val="21"/>
           <w:lang w:val="en-US"/>
         </w:rPr>
-        <w:t>board.add(self.char</w:t>
-      </w:r>
-      <w:proofErr w:type="gramEnd"/>
-      <w:r>
+        <w:t>board.add(self.char, position)</w:t>
+      </w:r>
+    </w:p>
+    <w:p>
+      <w:pPr>
+        <w:spacing w:after="200" w:line="300" w:lineRule="auto"/>
+        <w:ind w:left="420" w:hanging="420"/>
         <w:rPr>
           <w:sz w:val="21"/>
           <w:szCs w:val="21"/>
           <w:lang w:val="en-US"/>
         </w:rPr>
-        <w:t>, position)</w:t>
+      </w:pPr>
+      <w:r>
+        <w:rPr>
+          <w:sz w:val="21"/>
+          <w:szCs w:val="21"/>
+          <w:lang w:val="en-US"/>
+        </w:rPr>
+        <w:t>self.last_moves.insert(0, Move(position, board.as_code(),recommendations, self))</w:t>
       </w:r>
     </w:p>
     <w:p>
@@ -4419,78 +3705,63 @@
           <w:lang w:val="en-US"/>
         </w:rPr>
       </w:pPr>
-      <w:proofErr w:type="gramStart"/>
       <w:r>
         <w:rPr>
           <w:sz w:val="21"/>
           <w:szCs w:val="21"/>
           <w:lang w:val="en-US"/>
         </w:rPr>
-        <w:t>self.last</w:t>
-      </w:r>
-      <w:proofErr w:type="gramEnd"/>
-      <w:r>
+        <w:t>He cambiado a:</w:t>
+      </w:r>
+    </w:p>
+    <w:p>
+      <w:pPr>
+        <w:spacing w:after="200" w:line="300" w:lineRule="auto"/>
+        <w:ind w:left="420" w:hanging="420"/>
         <w:rPr>
           <w:sz w:val="21"/>
           <w:szCs w:val="21"/>
           <w:lang w:val="en-US"/>
         </w:rPr>
-        <w:t>_</w:t>
-      </w:r>
-      <w:proofErr w:type="gramStart"/>
+      </w:pPr>
       <w:r>
         <w:rPr>
           <w:sz w:val="21"/>
           <w:szCs w:val="21"/>
           <w:lang w:val="en-US"/>
         </w:rPr>
-        <w:t>moves.insert</w:t>
-      </w:r>
-      <w:proofErr w:type="gramEnd"/>
-      <w:r>
+        <w:t>self.last_moves.insert(0, Move(position, board.as_code(), recommendations, self))</w:t>
+      </w:r>
+    </w:p>
+    <w:p>
+      <w:pPr>
+        <w:spacing w:after="200" w:line="300" w:lineRule="auto"/>
+        <w:ind w:left="420" w:hanging="420"/>
         <w:rPr>
           <w:sz w:val="21"/>
           <w:szCs w:val="21"/>
           <w:lang w:val="en-US"/>
         </w:rPr>
-        <w:t xml:space="preserve">(0, </w:t>
-      </w:r>
-      <w:proofErr w:type="gramStart"/>
+      </w:pPr>
       <w:r>
         <w:rPr>
           <w:sz w:val="21"/>
           <w:szCs w:val="21"/>
           <w:lang w:val="en-US"/>
         </w:rPr>
-        <w:t>Move(</w:t>
-      </w:r>
-      <w:proofErr w:type="gramEnd"/>
-      <w:r>
+        <w:t>board.add(self.char, position)</w:t>
+      </w:r>
+    </w:p>
+    <w:p>
+      <w:pPr>
+        <w:spacing w:after="200" w:line="300" w:lineRule="auto"/>
+        <w:ind w:left="420" w:hanging="420"/>
         <w:rPr>
           <w:sz w:val="21"/>
           <w:szCs w:val="21"/>
           <w:lang w:val="en-US"/>
         </w:rPr>
-        <w:t>position, board.as_</w:t>
-      </w:r>
-      <w:proofErr w:type="gramStart"/>
-      <w:r>
-        <w:rPr>
-          <w:sz w:val="21"/>
-          <w:szCs w:val="21"/>
-          <w:lang w:val="en-US"/>
-        </w:rPr>
-        <w:t>code(),recommendations</w:t>
-      </w:r>
-      <w:proofErr w:type="gramEnd"/>
-      <w:r>
-        <w:rPr>
-          <w:sz w:val="21"/>
-          <w:szCs w:val="21"/>
-          <w:lang w:val="en-US"/>
-        </w:rPr>
-        <w:t>, self))</w:t>
-      </w:r>
+      </w:pPr>
     </w:p>
     <w:p>
       <w:pPr>
@@ -4499,16 +3770,49 @@
         <w:rPr>
           <w:sz w:val="21"/>
           <w:szCs w:val="21"/>
-          <w:lang w:val="en-US"/>
-        </w:rPr>
-      </w:pPr>
-      <w:r>
-        <w:rPr>
-          <w:sz w:val="21"/>
-          <w:szCs w:val="21"/>
-          <w:lang w:val="en-US"/>
-        </w:rPr>
-        <w:t>He cambiado a:</w:t>
+        </w:rPr>
+      </w:pPr>
+      <w:r>
+        <w:rPr>
+          <w:sz w:val="21"/>
+          <w:szCs w:val="21"/>
+        </w:rPr>
+        <w:t>Tampoco</w:t>
+      </w:r>
+      <w:r>
+        <w:rPr>
+          <w:sz w:val="21"/>
+          <w:szCs w:val="21"/>
+        </w:rPr>
+        <w:t xml:space="preserve"> estoy de acuerdo con el manejo que se hace de las comprobaciones del SmartOracle. El diseño tiene una iteración anidada que puede alcanzar una eficiencia de O(N^2 + 2N) en un caso que puede no ser muy raro, sobre todo teniendo en cuenta jugadas que pongan en situaciones incómodas al oráculo</w:t>
+      </w:r>
+      <w:r>
+        <w:rPr>
+          <w:sz w:val="21"/>
+          <w:szCs w:val="21"/>
+        </w:rPr>
+        <w:t xml:space="preserve">. </w:t>
+      </w:r>
+      <w:r>
+        <w:rPr>
+          <w:sz w:val="21"/>
+          <w:szCs w:val="21"/>
+        </w:rPr>
+        <w:t>Esto</w:t>
+      </w:r>
+      <w:r>
+        <w:rPr>
+          <w:sz w:val="21"/>
+          <w:szCs w:val="21"/>
+        </w:rPr>
+        <w:t xml:space="preserve"> afecta sobre todo a la dificultad media que no memoriza y</w:t>
+      </w:r>
+      <w:r>
+        <w:rPr>
+          <w:sz w:val="21"/>
+          <w:szCs w:val="21"/>
+        </w:rPr>
+        <w:t xml:space="preserve"> hace que tableros más grandes puedan ser altamente ineficientes, por lo que dependiendo del consumo de recursos que suponga deepcopy, el código puede no ser escalable.</w:t>
       </w:r>
     </w:p>
     <w:p>
@@ -4518,80 +3822,42 @@
         <w:rPr>
           <w:sz w:val="21"/>
           <w:szCs w:val="21"/>
-          <w:lang w:val="en-US"/>
-        </w:rPr>
-      </w:pPr>
-      <w:proofErr w:type="gramStart"/>
-      <w:r>
-        <w:rPr>
-          <w:sz w:val="21"/>
-          <w:szCs w:val="21"/>
-          <w:lang w:val="en-US"/>
-        </w:rPr>
-        <w:t>self.last</w:t>
-      </w:r>
-      <w:proofErr w:type="gramEnd"/>
-      <w:r>
-        <w:rPr>
-          <w:sz w:val="21"/>
-          <w:szCs w:val="21"/>
-          <w:lang w:val="en-US"/>
-        </w:rPr>
-        <w:t>_</w:t>
-      </w:r>
-      <w:proofErr w:type="gramStart"/>
-      <w:r>
-        <w:rPr>
-          <w:sz w:val="21"/>
-          <w:szCs w:val="21"/>
-          <w:lang w:val="en-US"/>
-        </w:rPr>
-        <w:t>moves.insert</w:t>
-      </w:r>
-      <w:proofErr w:type="gramEnd"/>
-      <w:r>
-        <w:rPr>
-          <w:sz w:val="21"/>
-          <w:szCs w:val="21"/>
-          <w:lang w:val="en-US"/>
-        </w:rPr>
-        <w:t xml:space="preserve">(0, </w:t>
-      </w:r>
-      <w:proofErr w:type="gramStart"/>
-      <w:r>
-        <w:rPr>
-          <w:sz w:val="21"/>
-          <w:szCs w:val="21"/>
-          <w:lang w:val="en-US"/>
-        </w:rPr>
-        <w:t>Move(</w:t>
-      </w:r>
-      <w:proofErr w:type="gramEnd"/>
-      <w:r>
-        <w:rPr>
-          <w:sz w:val="21"/>
-          <w:szCs w:val="21"/>
-          <w:lang w:val="en-US"/>
-        </w:rPr>
-        <w:t>position, board.as_</w:t>
-      </w:r>
-      <w:proofErr w:type="gramStart"/>
-      <w:r>
-        <w:rPr>
-          <w:sz w:val="21"/>
-          <w:szCs w:val="21"/>
-          <w:lang w:val="en-US"/>
-        </w:rPr>
-        <w:t>code(</w:t>
-      </w:r>
-      <w:proofErr w:type="gramEnd"/>
-      <w:r>
-        <w:rPr>
-          <w:sz w:val="21"/>
-          <w:szCs w:val="21"/>
-          <w:lang w:val="en-US"/>
-        </w:rPr>
-        <w:t>), recommendations, self))</w:t>
+        </w:rPr>
+      </w:pPr>
+      <w:r>
+        <w:rPr>
+          <w:sz w:val="21"/>
+          <w:szCs w:val="21"/>
+        </w:rPr>
+        <w:t xml:space="preserve">Una solución que propondría sería usar una sola deepcopy y comprobar victoria en cada tablero lineal, pero </w:t>
+      </w:r>
+      <w:r>
+        <w:rPr>
+          <w:sz w:val="21"/>
+          <w:szCs w:val="21"/>
+        </w:rPr>
+        <w:t xml:space="preserve">hacer self._is_winning_bet(temporal_bet) me parece </w:t>
+      </w:r>
+      <w:r>
+        <w:rPr>
+          <w:sz w:val="21"/>
+          <w:szCs w:val="21"/>
+        </w:rPr>
+        <w:t xml:space="preserve">muy redundante y me da la impresión de </w:t>
+      </w:r>
+      <w:r>
+        <w:rPr>
+          <w:sz w:val="21"/>
+          <w:szCs w:val="21"/>
+        </w:rPr>
+        <w:t>que funciona porque el tablero es muy pequeñito</w:t>
+      </w:r>
+      <w:r>
+        <w:rPr>
+          <w:sz w:val="21"/>
+          <w:szCs w:val="21"/>
+        </w:rPr>
+        <w:t>.</w:t>
       </w:r>
     </w:p>
     <w:p>
@@ -4601,175 +3867,6 @@
         <w:rPr>
           <w:sz w:val="21"/>
           <w:szCs w:val="21"/>
-          <w:lang w:val="en-US"/>
-        </w:rPr>
-      </w:pPr>
-      <w:proofErr w:type="gramStart"/>
-      <w:r>
-        <w:rPr>
-          <w:sz w:val="21"/>
-          <w:szCs w:val="21"/>
-          <w:lang w:val="en-US"/>
-        </w:rPr>
-        <w:t>board.add(self.char</w:t>
-      </w:r>
-      <w:proofErr w:type="gramEnd"/>
-      <w:r>
-        <w:rPr>
-          <w:sz w:val="21"/>
-          <w:szCs w:val="21"/>
-          <w:lang w:val="en-US"/>
-        </w:rPr>
-        <w:t>, position)</w:t>
-      </w:r>
-    </w:p>
-    <w:p>
-      <w:pPr>
-        <w:spacing w:after="200" w:line="300" w:lineRule="auto"/>
-        <w:ind w:left="420" w:hanging="420"/>
-        <w:rPr>
-          <w:sz w:val="21"/>
-          <w:szCs w:val="21"/>
-          <w:lang w:val="en-US"/>
-        </w:rPr>
-      </w:pPr>
-    </w:p>
-    <w:p>
-      <w:pPr>
-        <w:spacing w:after="200" w:line="300" w:lineRule="auto"/>
-        <w:ind w:left="420" w:hanging="420"/>
-        <w:rPr>
-          <w:sz w:val="21"/>
-          <w:szCs w:val="21"/>
-        </w:rPr>
-      </w:pPr>
-      <w:r>
-        <w:rPr>
-          <w:sz w:val="21"/>
-          <w:szCs w:val="21"/>
-        </w:rPr>
-        <w:t>Tampoco</w:t>
-      </w:r>
-      <w:r>
-        <w:rPr>
-          <w:sz w:val="21"/>
-          <w:szCs w:val="21"/>
-        </w:rPr>
-        <w:t xml:space="preserve"> estoy de acuerdo con el manejo que se hace de las comprobaciones del SmartOracle. El diseño tiene una iteración anidada que puede alcanzar una eficiencia de </w:t>
-      </w:r>
-      <w:proofErr w:type="gramStart"/>
-      <w:r>
-        <w:rPr>
-          <w:sz w:val="21"/>
-          <w:szCs w:val="21"/>
-        </w:rPr>
-        <w:t>O(</w:t>
-      </w:r>
-      <w:proofErr w:type="gramEnd"/>
-      <w:r>
-        <w:rPr>
-          <w:sz w:val="21"/>
-          <w:szCs w:val="21"/>
-        </w:rPr>
-        <w:t>N^2 + 2N) en un caso que puede no ser muy raro, sobre todo teniendo en cuenta jugadas que pongan en situaciones incómodas al oráculo</w:t>
-      </w:r>
-      <w:r>
-        <w:rPr>
-          <w:sz w:val="21"/>
-          <w:szCs w:val="21"/>
-        </w:rPr>
-        <w:t xml:space="preserve">. </w:t>
-      </w:r>
-      <w:r>
-        <w:rPr>
-          <w:sz w:val="21"/>
-          <w:szCs w:val="21"/>
-        </w:rPr>
-        <w:t>Esto</w:t>
-      </w:r>
-      <w:r>
-        <w:rPr>
-          <w:sz w:val="21"/>
-          <w:szCs w:val="21"/>
-        </w:rPr>
-        <w:t xml:space="preserve"> afecta sobre todo a la dificultad media que no memoriza y</w:t>
-      </w:r>
-      <w:r>
-        <w:rPr>
-          <w:sz w:val="21"/>
-          <w:szCs w:val="21"/>
-        </w:rPr>
-        <w:t xml:space="preserve"> hace que tableros más grandes puedan ser altamente ineficientes, por lo que dependiendo del consumo de recursos que suponga deepcopy, el código puede no ser escalable.</w:t>
-      </w:r>
-    </w:p>
-    <w:p>
-      <w:pPr>
-        <w:spacing w:after="200" w:line="300" w:lineRule="auto"/>
-        <w:ind w:left="420" w:hanging="420"/>
-        <w:rPr>
-          <w:sz w:val="21"/>
-          <w:szCs w:val="21"/>
-        </w:rPr>
-      </w:pPr>
-      <w:r>
-        <w:rPr>
-          <w:sz w:val="21"/>
-          <w:szCs w:val="21"/>
-        </w:rPr>
-        <w:t xml:space="preserve">Una solución que propondría sería usar una sola deepcopy y comprobar victoria en cada tablero lineal, pero </w:t>
-      </w:r>
-      <w:r>
-        <w:rPr>
-          <w:sz w:val="21"/>
-          <w:szCs w:val="21"/>
-        </w:rPr>
-        <w:t xml:space="preserve">hacer </w:t>
-      </w:r>
-      <w:proofErr w:type="gramStart"/>
-      <w:r>
-        <w:rPr>
-          <w:sz w:val="21"/>
-          <w:szCs w:val="21"/>
-        </w:rPr>
-        <w:t>self._</w:t>
-      </w:r>
-      <w:proofErr w:type="gramEnd"/>
-      <w:r>
-        <w:rPr>
-          <w:sz w:val="21"/>
-          <w:szCs w:val="21"/>
-        </w:rPr>
-        <w:t xml:space="preserve">is_winning_bet(temporal_bet) me parece </w:t>
-      </w:r>
-      <w:r>
-        <w:rPr>
-          <w:sz w:val="21"/>
-          <w:szCs w:val="21"/>
-        </w:rPr>
-        <w:t xml:space="preserve">muy redundante y me da la impresión de </w:t>
-      </w:r>
-      <w:r>
-        <w:rPr>
-          <w:sz w:val="21"/>
-          <w:szCs w:val="21"/>
-        </w:rPr>
-        <w:t>que funciona porque el tablero es muy pequeñito</w:t>
-      </w:r>
-      <w:r>
-        <w:rPr>
-          <w:sz w:val="21"/>
-          <w:szCs w:val="21"/>
-        </w:rPr>
-        <w:t>.</w:t>
-      </w:r>
-    </w:p>
-    <w:p>
-      <w:pPr>
-        <w:spacing w:after="200" w:line="300" w:lineRule="auto"/>
-        <w:ind w:left="420" w:hanging="420"/>
-        <w:rPr>
-          <w:sz w:val="21"/>
-          <w:szCs w:val="21"/>
         </w:rPr>
       </w:pPr>
       <w:r>
@@ -4784,39 +3881,7 @@
           <w:sz w:val="21"/>
           <w:szCs w:val="21"/>
         </w:rPr>
-        <w:t xml:space="preserve">, como en </w:t>
-      </w:r>
-      <w:proofErr w:type="gramStart"/>
-      <w:r>
-        <w:rPr>
-          <w:sz w:val="21"/>
-          <w:szCs w:val="21"/>
-        </w:rPr>
-        <w:t>BaseOracle._</w:t>
-      </w:r>
-      <w:proofErr w:type="gramEnd"/>
-      <w:r>
-        <w:rPr>
-          <w:sz w:val="21"/>
-          <w:szCs w:val="21"/>
-        </w:rPr>
-        <w:t xml:space="preserve">get_columns_recommendations, que se llama a </w:t>
-      </w:r>
-      <w:proofErr w:type="gramStart"/>
-      <w:r>
-        <w:rPr>
-          <w:sz w:val="21"/>
-          <w:szCs w:val="21"/>
-        </w:rPr>
-        <w:t>board._</w:t>
-      </w:r>
-      <w:proofErr w:type="gramEnd"/>
-      <w:r>
-        <w:rPr>
-          <w:sz w:val="21"/>
-          <w:szCs w:val="21"/>
-        </w:rPr>
-        <w:t>columns, lo que parece un error</w:t>
+        <w:t>, como en BaseOracle._get_columns_recommendations, que se llama a board._columns, lo que parece un error</w:t>
       </w:r>
       <w:r>
         <w:rPr>

</xml_diff>